<commit_message>
Document the production compose file in the architecture doc
Co-Authored-By: Claude Sonnet 5.5 <noreply@anthropic.com>
</commit_message>
<xml_diff>
--- a/doc/mlw-storage_Architecture.docx
+++ b/doc/mlw-storage_Architecture.docx
@@ -782,68 +782,47 @@
         <w:tabs>
           <w:tab w:pos="9360" w:val="right" w:leader="dot"/>
         </w:tabs>
+        <w:spacing w:after="60" w:before="0"/>
+        <w:ind w:left="320"/>
+      </w:pPr>
+      <w:hyperlink w:anchor="_Toc100017" w:history="1">
+        <w:r>
+          <w:t xml:space="preserve">6.4 Production deployment (docker-compose.prod.yml)</w:t>
+        </w:r>
+        <w:r>
+          <w:tab/>
+        </w:r>
+        <w:r>
+          <w:fldChar w:fldCharType="begin"/>
+        </w:r>
+        <w:r>
+          <w:instrText xml:space="preserve"> PAGEREF _Toc100017 \h </w:instrText>
+        </w:r>
+        <w:r>
+          <w:fldChar w:fldCharType="separate"/>
+        </w:r>
+        <w:r>
+          <w:t xml:space="preserve">9</w:t>
+        </w:r>
+        <w:r>
+          <w:fldChar w:fldCharType="end"/>
+        </w:r>
+      </w:hyperlink>
+    </w:p>
+    <w:p>
+      <w:pPr>
+        <w:tabs>
+          <w:tab w:pos="9360" w:val="right" w:leader="dot"/>
+        </w:tabs>
         <w:spacing w:after="80" w:before="120"/>
         <w:ind w:left="0"/>
       </w:pPr>
-      <w:hyperlink w:anchor="_Toc100017" w:history="1">
+      <w:hyperlink w:anchor="_Toc100018" w:history="1">
         <w:r>
           <w:rPr>
             <w:b/>
           </w:rPr>
           <w:t xml:space="preserve">7. Data and persistence</w:t>
-        </w:r>
-        <w:r>
-          <w:rPr>
-            <w:b/>
-          </w:rPr>
-          <w:tab/>
-        </w:r>
-        <w:r>
-          <w:rPr>
-            <w:b/>
-          </w:rPr>
-          <w:fldChar w:fldCharType="begin"/>
-        </w:r>
-        <w:r>
-          <w:rPr>
-            <w:b/>
-          </w:rPr>
-          <w:instrText xml:space="preserve"> PAGEREF _Toc100017 \h </w:instrText>
-        </w:r>
-        <w:r>
-          <w:rPr>
-            <w:b/>
-          </w:rPr>
-          <w:fldChar w:fldCharType="separate"/>
-        </w:r>
-        <w:r>
-          <w:rPr>
-            <w:b/>
-          </w:rPr>
-          <w:t xml:space="preserve">9</w:t>
-        </w:r>
-        <w:r>
-          <w:rPr>
-            <w:b/>
-          </w:rPr>
-          <w:fldChar w:fldCharType="end"/>
-        </w:r>
-      </w:hyperlink>
-    </w:p>
-    <w:p>
-      <w:pPr>
-        <w:tabs>
-          <w:tab w:pos="9360" w:val="right" w:leader="dot"/>
-        </w:tabs>
-        <w:spacing w:after="80" w:before="120"/>
-        <w:ind w:left="0"/>
-      </w:pPr>
-      <w:hyperlink w:anchor="_Toc100018" w:history="1">
-        <w:r>
-          <w:rPr>
-            <w:b/>
-          </w:rPr>
-          <w:t xml:space="preserve">8. Security considerations</w:t>
         </w:r>
         <w:r>
           <w:rPr>
@@ -896,7 +875,7 @@
           <w:rPr>
             <w:b/>
           </w:rPr>
-          <w:t xml:space="preserve">9. Operations</w:t>
+          <w:t xml:space="preserve">8. Security considerations</w:t>
         </w:r>
         <w:r>
           <w:rPr>
@@ -949,7 +928,7 @@
           <w:rPr>
             <w:b/>
           </w:rPr>
-          <w:t xml:space="preserve">10. Limitations and possible next steps</w:t>
+          <w:t xml:space="preserve">9. Operations</w:t>
         </w:r>
         <w:r>
           <w:rPr>
@@ -980,6 +959,59 @@
             <w:b/>
           </w:rPr>
           <w:t xml:space="preserve">10</w:t>
+        </w:r>
+        <w:r>
+          <w:rPr>
+            <w:b/>
+          </w:rPr>
+          <w:fldChar w:fldCharType="end"/>
+        </w:r>
+      </w:hyperlink>
+    </w:p>
+    <w:p>
+      <w:pPr>
+        <w:tabs>
+          <w:tab w:pos="9360" w:val="right" w:leader="dot"/>
+        </w:tabs>
+        <w:spacing w:after="80" w:before="120"/>
+        <w:ind w:left="0"/>
+      </w:pPr>
+      <w:hyperlink w:anchor="_Toc100021" w:history="1">
+        <w:r>
+          <w:rPr>
+            <w:b/>
+          </w:rPr>
+          <w:t xml:space="preserve">10. Limitations and possible next steps</w:t>
+        </w:r>
+        <w:r>
+          <w:rPr>
+            <w:b/>
+          </w:rPr>
+          <w:tab/>
+        </w:r>
+        <w:r>
+          <w:rPr>
+            <w:b/>
+          </w:rPr>
+          <w:fldChar w:fldCharType="begin"/>
+        </w:r>
+        <w:r>
+          <w:rPr>
+            <w:b/>
+          </w:rPr>
+          <w:instrText xml:space="preserve"> PAGEREF _Toc100021 \h </w:instrText>
+        </w:r>
+        <w:r>
+          <w:rPr>
+            <w:b/>
+          </w:rPr>
+          <w:fldChar w:fldCharType="separate"/>
+        </w:r>
+        <w:r>
+          <w:rPr>
+            <w:b/>
+          </w:rPr>
+          <w:t xml:space="preserve">11</w:t>
         </w:r>
         <w:r>
           <w:rPr>
@@ -5410,15 +5442,735 @@
     </w:p>
     <w:p>
       <w:pPr>
+        <w:pStyle w:val="Heading2"/>
+        <w:rPr/>
+      </w:pPr>
+      <w:bookmarkStart w:id="917" w:name="_Toc100017"/>
+      <w:r>
+        <w:rPr/>
+        <w:t>6.4 Production deployment (docker-compose.prod.yml)</w:t>
+      </w:r>
+      <w:bookmarkEnd w:id="917"/>
+    </w:p>
+    <w:p>
+      <w:pPr>
+        <w:pStyle w:val="Normal"/>
+        <w:rPr/>
+      </w:pPr>
+      <w:r>
+        <w:rPr/>
+        <w:t xml:space="preserve">docker-compose.prod.yml is a standalone Compose file for production releases. It defines the same two services (sftpgo and proxy), network layout, ports and volumes as docker-compose.yml, so the architecture above is unchanged. It is used instead of docker-compose.yml, never together with it. The Keycloak override file can still be combined with it. The differences are in version pinning, hardening and operations:</w:t>
+      </w:r>
+    </w:p>
+    <w:tbl>
+      <w:tblPr>
+        <w:tblStyle w:val="TableGrid"/>
+        <w:tblW w:w="9360" w:type="dxa"/>
+        <w:jc w:val="left"/>
+        <w:tblInd w:w="0" w:type="dxa"/>
+        <w:tblLayout w:type="fixed"/>
+        <w:tblCellMar>
+          <w:top w:w="0" w:type="dxa"/>
+          <w:left w:w="108" w:type="dxa"/>
+          <w:bottom w:w="0" w:type="dxa"/>
+          <w:right w:w="108" w:type="dxa"/>
+        </w:tblCellMar>
+        <w:tblLook w:val="04a0" w:noHBand="0" w:noVBand="1" w:firstColumn="1" w:lastRow="0" w:lastColumn="0" w:firstRow="1"/>
+      </w:tblPr>
+      <w:tblGrid>
+        <w:gridCol w:w="3120"/>
+        <w:gridCol w:w="3120"/>
+        <w:gridCol w:w="3120"/>
+      </w:tblGrid>
+      <w:tr>
+        <w:trPr/>
+        <w:tc>
+          <w:tcPr>
+            <w:tcW w:w="3120" w:type="dxa"/>
+            <w:tcBorders/>
+            <w:shd w:color="auto" w:fill="DCE6F1" w:val="clear"/>
+          </w:tcPr>
+          <w:p>
+            <w:pPr>
+              <w:pStyle w:val="Normal"/>
+              <w:widowControl/>
+              <w:spacing w:lineRule="auto" w:line="240" w:before="0" w:after="40"/>
+              <w:jc w:val="left"/>
+              <w:rPr>
+                <w:rFonts w:eastAsia="ＭＳ 明朝" w:cs=""/>
+                <w:kern w:val="0"/>
+                <w:szCs w:val="22"/>
+                <w:lang w:val="en-US" w:eastAsia="en-US" w:bidi="ar-SA"/>
+              </w:rPr>
+            </w:pPr>
+            <w:r>
+              <w:rPr>
+                <w:rFonts w:eastAsia="ＭＳ 明朝" w:cs=""/>
+                <w:b/>
+                <w:kern w:val="0"/>
+                <w:sz w:val="20"/>
+                <w:szCs w:val="22"/>
+                <w:lang w:val="en-US" w:eastAsia="en-US" w:bidi="ar-SA"/>
+              </w:rPr>
+              <w:t xml:space="preserve">Setting</w:t>
+            </w:r>
+          </w:p>
+        </w:tc>
+        <w:tc>
+          <w:tcPr>
+            <w:tcW w:w="3120" w:type="dxa"/>
+            <w:tcBorders/>
+            <w:shd w:color="auto" w:fill="DCE6F1" w:val="clear"/>
+          </w:tcPr>
+          <w:p>
+            <w:pPr>
+              <w:pStyle w:val="Normal"/>
+              <w:widowControl/>
+              <w:spacing w:lineRule="auto" w:line="240" w:before="0" w:after="40"/>
+              <w:jc w:val="left"/>
+              <w:rPr>
+                <w:rFonts w:eastAsia="ＭＳ 明朝" w:cs=""/>
+                <w:kern w:val="0"/>
+                <w:szCs w:val="22"/>
+                <w:lang w:val="en-US" w:eastAsia="en-US" w:bidi="ar-SA"/>
+              </w:rPr>
+            </w:pPr>
+            <w:r>
+              <w:rPr>
+                <w:rFonts w:eastAsia="ＭＳ 明朝" w:cs=""/>
+                <w:b/>
+                <w:kern w:val="0"/>
+                <w:sz w:val="20"/>
+                <w:szCs w:val="22"/>
+                <w:lang w:val="en-US" w:eastAsia="en-US" w:bidi="ar-SA"/>
+              </w:rPr>
+              <w:t xml:space="preserve">Development</w:t>
+            </w:r>
+          </w:p>
+        </w:tc>
+        <w:tc>
+          <w:tcPr>
+            <w:tcW w:w="3120" w:type="dxa"/>
+            <w:tcBorders/>
+            <w:shd w:color="auto" w:fill="DCE6F1" w:val="clear"/>
+          </w:tcPr>
+          <w:p>
+            <w:pPr>
+              <w:pStyle w:val="Normal"/>
+              <w:widowControl/>
+              <w:spacing w:lineRule="auto" w:line="240" w:before="0" w:after="40"/>
+              <w:jc w:val="left"/>
+              <w:rPr>
+                <w:rFonts w:eastAsia="ＭＳ 明朝" w:cs=""/>
+                <w:kern w:val="0"/>
+                <w:szCs w:val="22"/>
+                <w:lang w:val="en-US" w:eastAsia="en-US" w:bidi="ar-SA"/>
+              </w:rPr>
+            </w:pPr>
+            <w:r>
+              <w:rPr>
+                <w:rFonts w:eastAsia="ＭＳ 明朝" w:cs=""/>
+                <w:b/>
+                <w:kern w:val="0"/>
+                <w:sz w:val="20"/>
+                <w:szCs w:val="22"/>
+                <w:lang w:val="en-US" w:eastAsia="en-US" w:bidi="ar-SA"/>
+              </w:rPr>
+              <w:t xml:space="preserve">Production</w:t>
+            </w:r>
+          </w:p>
+        </w:tc>
+      </w:tr>
+      <w:tr>
+        <w:trPr/>
+        <w:tc>
+          <w:tcPr>
+            <w:tcW w:w="3120" w:type="dxa"/>
+            <w:tcBorders/>
+          </w:tcPr>
+          <w:p>
+            <w:pPr>
+              <w:pStyle w:val="Normal"/>
+              <w:widowControl/>
+              <w:spacing w:lineRule="auto" w:line="240" w:before="0" w:after="40"/>
+              <w:jc w:val="left"/>
+              <w:rPr>
+                <w:rFonts w:eastAsia="ＭＳ 明朝" w:cs=""/>
+                <w:kern w:val="0"/>
+                <w:szCs w:val="22"/>
+                <w:lang w:val="en-US" w:eastAsia="en-US" w:bidi="ar-SA"/>
+              </w:rPr>
+            </w:pPr>
+            <w:r>
+              <w:rPr>
+                <w:rFonts w:eastAsia="ＭＳ 明朝" w:cs=""/>
+                <w:kern w:val="0"/>
+                <w:sz w:val="20"/>
+                <w:szCs w:val="22"/>
+                <w:lang w:val="en-US" w:eastAsia="en-US" w:bidi="ar-SA"/>
+              </w:rPr>
+              <w:t xml:space="preserve">SFTPGo image</w:t>
+            </w:r>
+          </w:p>
+        </w:tc>
+        <w:tc>
+          <w:tcPr>
+            <w:tcW w:w="3120" w:type="dxa"/>
+            <w:tcBorders/>
+          </w:tcPr>
+          <w:p>
+            <w:pPr>
+              <w:pStyle w:val="Normal"/>
+              <w:widowControl/>
+              <w:spacing w:lineRule="auto" w:line="240" w:before="0" w:after="40"/>
+              <w:jc w:val="left"/>
+              <w:rPr>
+                <w:rFonts w:eastAsia="ＭＳ 明朝" w:cs=""/>
+                <w:kern w:val="0"/>
+                <w:szCs w:val="22"/>
+                <w:lang w:val="en-US" w:eastAsia="en-US" w:bidi="ar-SA"/>
+              </w:rPr>
+            </w:pPr>
+            <w:r>
+              <w:rPr>
+                <w:rFonts w:eastAsia="ＭＳ 明朝" w:cs=""/>
+                <w:kern w:val="0"/>
+                <w:sz w:val="20"/>
+                <w:szCs w:val="22"/>
+                <w:lang w:val="en-US" w:eastAsia="en-US" w:bidi="ar-SA"/>
+              </w:rPr>
+              <w:t xml:space="preserve">drakkan/sftpgo:v2</w:t>
+            </w:r>
+          </w:p>
+        </w:tc>
+        <w:tc>
+          <w:tcPr>
+            <w:tcW w:w="3120" w:type="dxa"/>
+            <w:tcBorders/>
+          </w:tcPr>
+          <w:p>
+            <w:pPr>
+              <w:pStyle w:val="Normal"/>
+              <w:widowControl/>
+              <w:spacing w:lineRule="auto" w:line="240" w:before="0" w:after="40"/>
+              <w:jc w:val="left"/>
+              <w:rPr>
+                <w:rFonts w:eastAsia="ＭＳ 明朝" w:cs=""/>
+                <w:kern w:val="0"/>
+                <w:szCs w:val="22"/>
+                <w:lang w:val="en-US" w:eastAsia="en-US" w:bidi="ar-SA"/>
+              </w:rPr>
+            </w:pPr>
+            <w:r>
+              <w:rPr>
+                <w:rFonts w:eastAsia="ＭＳ 明朝" w:cs=""/>
+                <w:kern w:val="0"/>
+                <w:sz w:val="20"/>
+                <w:szCs w:val="22"/>
+                <w:lang w:val="en-US" w:eastAsia="en-US" w:bidi="ar-SA"/>
+              </w:rPr>
+              <w:t xml:space="preserve">drakkan/sftpgo:${SFTPGO_VERSION} (required, pinned tag)</w:t>
+            </w:r>
+          </w:p>
+        </w:tc>
+      </w:tr>
+      <w:tr>
+        <w:trPr/>
+        <w:tc>
+          <w:tcPr>
+            <w:tcW w:w="3120" w:type="dxa"/>
+            <w:tcBorders/>
+          </w:tcPr>
+          <w:p>
+            <w:pPr>
+              <w:pStyle w:val="Normal"/>
+              <w:widowControl/>
+              <w:spacing w:lineRule="auto" w:line="240" w:before="0" w:after="40"/>
+              <w:jc w:val="left"/>
+              <w:rPr>
+                <w:rFonts w:eastAsia="ＭＳ 明朝" w:cs=""/>
+                <w:kern w:val="0"/>
+                <w:szCs w:val="22"/>
+                <w:lang w:val="en-US" w:eastAsia="en-US" w:bidi="ar-SA"/>
+              </w:rPr>
+            </w:pPr>
+            <w:r>
+              <w:rPr>
+                <w:rFonts w:eastAsia="ＭＳ 明朝" w:cs=""/>
+                <w:kern w:val="0"/>
+                <w:sz w:val="20"/>
+                <w:szCs w:val="22"/>
+                <w:lang w:val="en-US" w:eastAsia="en-US" w:bidi="ar-SA"/>
+              </w:rPr>
+              <w:t xml:space="preserve">Gateway image</w:t>
+            </w:r>
+          </w:p>
+        </w:tc>
+        <w:tc>
+          <w:tcPr>
+            <w:tcW w:w="3120" w:type="dxa"/>
+            <w:tcBorders/>
+          </w:tcPr>
+          <w:p>
+            <w:pPr>
+              <w:pStyle w:val="Normal"/>
+              <w:widowControl/>
+              <w:spacing w:lineRule="auto" w:line="240" w:before="0" w:after="40"/>
+              <w:jc w:val="left"/>
+              <w:rPr>
+                <w:rFonts w:eastAsia="ＭＳ 明朝" w:cs=""/>
+                <w:kern w:val="0"/>
+                <w:szCs w:val="22"/>
+                <w:lang w:val="en-US" w:eastAsia="en-US" w:bidi="ar-SA"/>
+              </w:rPr>
+            </w:pPr>
+            <w:r>
+              <w:rPr>
+                <w:rFonts w:eastAsia="ＭＳ 明朝" w:cs=""/>
+                <w:kern w:val="0"/>
+                <w:sz w:val="20"/>
+                <w:szCs w:val="22"/>
+                <w:lang w:val="en-US" w:eastAsia="en-US" w:bidi="ar-SA"/>
+              </w:rPr>
+              <w:t xml:space="preserve">Built from ./src</w:t>
+            </w:r>
+          </w:p>
+        </w:tc>
+        <w:tc>
+          <w:tcPr>
+            <w:tcW w:w="3120" w:type="dxa"/>
+            <w:tcBorders/>
+          </w:tcPr>
+          <w:p>
+            <w:pPr>
+              <w:pStyle w:val="Normal"/>
+              <w:widowControl/>
+              <w:spacing w:lineRule="auto" w:line="240" w:before="0" w:after="40"/>
+              <w:jc w:val="left"/>
+              <w:rPr>
+                <w:rFonts w:eastAsia="ＭＳ 明朝" w:cs=""/>
+                <w:kern w:val="0"/>
+                <w:szCs w:val="22"/>
+                <w:lang w:val="en-US" w:eastAsia="en-US" w:bidi="ar-SA"/>
+              </w:rPr>
+            </w:pPr>
+            <w:r>
+              <w:rPr>
+                <w:rFonts w:eastAsia="ＭＳ 明朝" w:cs=""/>
+                <w:kern w:val="0"/>
+                <w:sz w:val="20"/>
+                <w:szCs w:val="22"/>
+                <w:lang w:val="en-US" w:eastAsia="en-US" w:bidi="ar-SA"/>
+              </w:rPr>
+              <w:t xml:space="preserve">Built from ./src, tagged mlw-storage-proxy:${MLW_VERSION:-1.0.0}</w:t>
+            </w:r>
+          </w:p>
+        </w:tc>
+      </w:tr>
+      <w:tr>
+        <w:trPr/>
+        <w:tc>
+          <w:tcPr>
+            <w:tcW w:w="3120" w:type="dxa"/>
+            <w:tcBorders/>
+          </w:tcPr>
+          <w:p>
+            <w:pPr>
+              <w:pStyle w:val="Normal"/>
+              <w:widowControl/>
+              <w:spacing w:lineRule="auto" w:line="240" w:before="0" w:after="40"/>
+              <w:jc w:val="left"/>
+              <w:rPr>
+                <w:rFonts w:eastAsia="ＭＳ 明朝" w:cs=""/>
+                <w:kern w:val="0"/>
+                <w:szCs w:val="22"/>
+                <w:lang w:val="en-US" w:eastAsia="en-US" w:bidi="ar-SA"/>
+              </w:rPr>
+            </w:pPr>
+            <w:r>
+              <w:rPr>
+                <w:rFonts w:eastAsia="ＭＳ 明朝" w:cs=""/>
+                <w:kern w:val="0"/>
+                <w:sz w:val="20"/>
+                <w:szCs w:val="22"/>
+                <w:lang w:val="en-US" w:eastAsia="en-US" w:bidi="ar-SA"/>
+              </w:rPr>
+              <w:t xml:space="preserve">Container hardening</w:t>
+            </w:r>
+          </w:p>
+        </w:tc>
+        <w:tc>
+          <w:tcPr>
+            <w:tcW w:w="3120" w:type="dxa"/>
+            <w:tcBorders/>
+          </w:tcPr>
+          <w:p>
+            <w:pPr>
+              <w:pStyle w:val="Normal"/>
+              <w:widowControl/>
+              <w:spacing w:lineRule="auto" w:line="240" w:before="0" w:after="40"/>
+              <w:jc w:val="left"/>
+              <w:rPr>
+                <w:rFonts w:eastAsia="ＭＳ 明朝" w:cs=""/>
+                <w:kern w:val="0"/>
+                <w:szCs w:val="22"/>
+                <w:lang w:val="en-US" w:eastAsia="en-US" w:bidi="ar-SA"/>
+              </w:rPr>
+            </w:pPr>
+            <w:r>
+              <w:rPr>
+                <w:rFonts w:eastAsia="ＭＳ 明朝" w:cs=""/>
+                <w:kern w:val="0"/>
+                <w:sz w:val="20"/>
+                <w:szCs w:val="22"/>
+                <w:lang w:val="en-US" w:eastAsia="en-US" w:bidi="ar-SA"/>
+              </w:rPr>
+              <w:t xml:space="preserve">None</w:t>
+            </w:r>
+          </w:p>
+        </w:tc>
+        <w:tc>
+          <w:tcPr>
+            <w:tcW w:w="3120" w:type="dxa"/>
+            <w:tcBorders/>
+          </w:tcPr>
+          <w:p>
+            <w:pPr>
+              <w:pStyle w:val="Normal"/>
+              <w:widowControl/>
+              <w:spacing w:lineRule="auto" w:line="240" w:before="0" w:after="40"/>
+              <w:jc w:val="left"/>
+              <w:rPr>
+                <w:rFonts w:eastAsia="ＭＳ 明朝" w:cs=""/>
+                <w:kern w:val="0"/>
+                <w:szCs w:val="22"/>
+                <w:lang w:val="en-US" w:eastAsia="en-US" w:bidi="ar-SA"/>
+              </w:rPr>
+            </w:pPr>
+            <w:r>
+              <w:rPr>
+                <w:rFonts w:eastAsia="ＭＳ 明朝" w:cs=""/>
+                <w:kern w:val="0"/>
+                <w:sz w:val="20"/>
+                <w:szCs w:val="22"/>
+                <w:lang w:val="en-US" w:eastAsia="en-US" w:bidi="ar-SA"/>
+              </w:rPr>
+              <w:t xml:space="preserve">no-new-privileges, all capabilities dropped; gateway file system read-only</w:t>
+            </w:r>
+          </w:p>
+        </w:tc>
+      </w:tr>
+      <w:tr>
+        <w:trPr/>
+        <w:tc>
+          <w:tcPr>
+            <w:tcW w:w="3120" w:type="dxa"/>
+            <w:tcBorders/>
+          </w:tcPr>
+          <w:p>
+            <w:pPr>
+              <w:pStyle w:val="Normal"/>
+              <w:widowControl/>
+              <w:spacing w:lineRule="auto" w:line="240" w:before="0" w:after="40"/>
+              <w:jc w:val="left"/>
+              <w:rPr>
+                <w:rFonts w:eastAsia="ＭＳ 明朝" w:cs=""/>
+                <w:kern w:val="0"/>
+                <w:szCs w:val="22"/>
+                <w:lang w:val="en-US" w:eastAsia="en-US" w:bidi="ar-SA"/>
+              </w:rPr>
+            </w:pPr>
+            <w:r>
+              <w:rPr>
+                <w:rFonts w:eastAsia="ＭＳ 明朝" w:cs=""/>
+                <w:kern w:val="0"/>
+                <w:sz w:val="20"/>
+                <w:szCs w:val="22"/>
+                <w:lang w:val="en-US" w:eastAsia="en-US" w:bidi="ar-SA"/>
+              </w:rPr>
+              <w:t xml:space="preserve">Logging</w:t>
+            </w:r>
+          </w:p>
+        </w:tc>
+        <w:tc>
+          <w:tcPr>
+            <w:tcW w:w="3120" w:type="dxa"/>
+            <w:tcBorders/>
+          </w:tcPr>
+          <w:p>
+            <w:pPr>
+              <w:pStyle w:val="Normal"/>
+              <w:widowControl/>
+              <w:spacing w:lineRule="auto" w:line="240" w:before="0" w:after="40"/>
+              <w:jc w:val="left"/>
+              <w:rPr>
+                <w:rFonts w:eastAsia="ＭＳ 明朝" w:cs=""/>
+                <w:kern w:val="0"/>
+                <w:szCs w:val="22"/>
+                <w:lang w:val="en-US" w:eastAsia="en-US" w:bidi="ar-SA"/>
+              </w:rPr>
+            </w:pPr>
+            <w:r>
+              <w:rPr>
+                <w:rFonts w:eastAsia="ＭＳ 明朝" w:cs=""/>
+                <w:kern w:val="0"/>
+                <w:sz w:val="20"/>
+                <w:szCs w:val="22"/>
+                <w:lang w:val="en-US" w:eastAsia="en-US" w:bidi="ar-SA"/>
+              </w:rPr>
+              <w:t xml:space="preserve">Docker defaults</w:t>
+            </w:r>
+          </w:p>
+        </w:tc>
+        <w:tc>
+          <w:tcPr>
+            <w:tcW w:w="3120" w:type="dxa"/>
+            <w:tcBorders/>
+          </w:tcPr>
+          <w:p>
+            <w:pPr>
+              <w:pStyle w:val="Normal"/>
+              <w:widowControl/>
+              <w:spacing w:lineRule="auto" w:line="240" w:before="0" w:after="40"/>
+              <w:jc w:val="left"/>
+              <w:rPr>
+                <w:rFonts w:eastAsia="ＭＳ 明朝" w:cs=""/>
+                <w:kern w:val="0"/>
+                <w:szCs w:val="22"/>
+                <w:lang w:val="en-US" w:eastAsia="en-US" w:bidi="ar-SA"/>
+              </w:rPr>
+            </w:pPr>
+            <w:r>
+              <w:rPr>
+                <w:rFonts w:eastAsia="ＭＳ 明朝" w:cs=""/>
+                <w:kern w:val="0"/>
+                <w:sz w:val="20"/>
+                <w:szCs w:val="22"/>
+                <w:lang w:val="en-US" w:eastAsia="en-US" w:bidi="ar-SA"/>
+              </w:rPr>
+              <w:t xml:space="preserve">json-file, rotated at 10 MB x 5 files</w:t>
+            </w:r>
+          </w:p>
+        </w:tc>
+      </w:tr>
+      <w:tr>
+        <w:trPr/>
+        <w:tc>
+          <w:tcPr>
+            <w:tcW w:w="3120" w:type="dxa"/>
+            <w:tcBorders/>
+          </w:tcPr>
+          <w:p>
+            <w:pPr>
+              <w:pStyle w:val="Normal"/>
+              <w:widowControl/>
+              <w:spacing w:lineRule="auto" w:line="240" w:before="0" w:after="40"/>
+              <w:jc w:val="left"/>
+              <w:rPr>
+                <w:rFonts w:eastAsia="ＭＳ 明朝" w:cs=""/>
+                <w:kern w:val="0"/>
+                <w:szCs w:val="22"/>
+                <w:lang w:val="en-US" w:eastAsia="en-US" w:bidi="ar-SA"/>
+              </w:rPr>
+            </w:pPr>
+            <w:r>
+              <w:rPr>
+                <w:rFonts w:eastAsia="ＭＳ 明朝" w:cs=""/>
+                <w:kern w:val="0"/>
+                <w:sz w:val="20"/>
+                <w:szCs w:val="22"/>
+                <w:lang w:val="en-US" w:eastAsia="en-US" w:bidi="ar-SA"/>
+              </w:rPr>
+              <w:t xml:space="preserve">Restart policy</w:t>
+            </w:r>
+          </w:p>
+        </w:tc>
+        <w:tc>
+          <w:tcPr>
+            <w:tcW w:w="3120" w:type="dxa"/>
+            <w:tcBorders/>
+          </w:tcPr>
+          <w:p>
+            <w:pPr>
+              <w:pStyle w:val="Normal"/>
+              <w:widowControl/>
+              <w:spacing w:lineRule="auto" w:line="240" w:before="0" w:after="40"/>
+              <w:jc w:val="left"/>
+              <w:rPr>
+                <w:rFonts w:eastAsia="ＭＳ 明朝" w:cs=""/>
+                <w:kern w:val="0"/>
+                <w:szCs w:val="22"/>
+                <w:lang w:val="en-US" w:eastAsia="en-US" w:bidi="ar-SA"/>
+              </w:rPr>
+            </w:pPr>
+            <w:r>
+              <w:rPr>
+                <w:rFonts w:eastAsia="ＭＳ 明朝" w:cs=""/>
+                <w:kern w:val="0"/>
+                <w:sz w:val="20"/>
+                <w:szCs w:val="22"/>
+                <w:lang w:val="en-US" w:eastAsia="en-US" w:bidi="ar-SA"/>
+              </w:rPr>
+              <w:t xml:space="preserve">unless-stopped</w:t>
+            </w:r>
+          </w:p>
+        </w:tc>
+        <w:tc>
+          <w:tcPr>
+            <w:tcW w:w="3120" w:type="dxa"/>
+            <w:tcBorders/>
+          </w:tcPr>
+          <w:p>
+            <w:pPr>
+              <w:pStyle w:val="Normal"/>
+              <w:widowControl/>
+              <w:spacing w:lineRule="auto" w:line="240" w:before="0" w:after="40"/>
+              <w:jc w:val="left"/>
+              <w:rPr>
+                <w:rFonts w:eastAsia="ＭＳ 明朝" w:cs=""/>
+                <w:kern w:val="0"/>
+                <w:szCs w:val="22"/>
+                <w:lang w:val="en-US" w:eastAsia="en-US" w:bidi="ar-SA"/>
+              </w:rPr>
+            </w:pPr>
+            <w:r>
+              <w:rPr>
+                <w:rFonts w:eastAsia="ＭＳ 明朝" w:cs=""/>
+                <w:kern w:val="0"/>
+                <w:sz w:val="20"/>
+                <w:szCs w:val="22"/>
+                <w:lang w:val="en-US" w:eastAsia="en-US" w:bidi="ar-SA"/>
+              </w:rPr>
+              <w:t xml:space="preserve">always</w:t>
+            </w:r>
+          </w:p>
+        </w:tc>
+      </w:tr>
+      <w:tr>
+        <w:trPr/>
+        <w:tc>
+          <w:tcPr>
+            <w:tcW w:w="3120" w:type="dxa"/>
+            <w:tcBorders/>
+          </w:tcPr>
+          <w:p>
+            <w:pPr>
+              <w:pStyle w:val="Normal"/>
+              <w:widowControl/>
+              <w:spacing w:lineRule="auto" w:line="240" w:before="0" w:after="40"/>
+              <w:jc w:val="left"/>
+              <w:rPr>
+                <w:rFonts w:eastAsia="ＭＳ 明朝" w:cs=""/>
+                <w:kern w:val="0"/>
+                <w:szCs w:val="22"/>
+                <w:lang w:val="en-US" w:eastAsia="en-US" w:bidi="ar-SA"/>
+              </w:rPr>
+            </w:pPr>
+            <w:r>
+              <w:rPr>
+                <w:rFonts w:eastAsia="ＭＳ 明朝" w:cs=""/>
+                <w:kern w:val="0"/>
+                <w:sz w:val="20"/>
+                <w:szCs w:val="22"/>
+                <w:lang w:val="en-US" w:eastAsia="en-US" w:bidi="ar-SA"/>
+              </w:rPr>
+              <w:t xml:space="preserve">Host port binding</w:t>
+            </w:r>
+          </w:p>
+        </w:tc>
+        <w:tc>
+          <w:tcPr>
+            <w:tcW w:w="3120" w:type="dxa"/>
+            <w:tcBorders/>
+          </w:tcPr>
+          <w:p>
+            <w:pPr>
+              <w:pStyle w:val="Normal"/>
+              <w:widowControl/>
+              <w:spacing w:lineRule="auto" w:line="240" w:before="0" w:after="40"/>
+              <w:jc w:val="left"/>
+              <w:rPr>
+                <w:rFonts w:eastAsia="ＭＳ 明朝" w:cs=""/>
+                <w:kern w:val="0"/>
+                <w:szCs w:val="22"/>
+                <w:lang w:val="en-US" w:eastAsia="en-US" w:bidi="ar-SA"/>
+              </w:rPr>
+            </w:pPr>
+            <w:r>
+              <w:rPr>
+                <w:rFonts w:eastAsia="ＭＳ 明朝" w:cs=""/>
+                <w:kern w:val="0"/>
+                <w:sz w:val="20"/>
+                <w:szCs w:val="22"/>
+                <w:lang w:val="en-US" w:eastAsia="en-US" w:bidi="ar-SA"/>
+              </w:rPr>
+              <w:t xml:space="preserve">All interfaces</w:t>
+            </w:r>
+          </w:p>
+        </w:tc>
+        <w:tc>
+          <w:tcPr>
+            <w:tcW w:w="3120" w:type="dxa"/>
+            <w:tcBorders/>
+          </w:tcPr>
+          <w:p>
+            <w:pPr>
+              <w:pStyle w:val="Normal"/>
+              <w:widowControl/>
+              <w:spacing w:lineRule="auto" w:line="240" w:before="0" w:after="40"/>
+              <w:jc w:val="left"/>
+              <w:rPr>
+                <w:rFonts w:eastAsia="ＭＳ 明朝" w:cs=""/>
+                <w:kern w:val="0"/>
+                <w:szCs w:val="22"/>
+                <w:lang w:val="en-US" w:eastAsia="en-US" w:bidi="ar-SA"/>
+              </w:rPr>
+            </w:pPr>
+            <w:r>
+              <w:rPr>
+                <w:rFonts w:eastAsia="ＭＳ 明朝" w:cs=""/>
+                <w:kern w:val="0"/>
+                <w:sz w:val="20"/>
+                <w:szCs w:val="22"/>
+                <w:lang w:val="en-US" w:eastAsia="en-US" w:bidi="ar-SA"/>
+              </w:rPr>
+              <w:t xml:space="preserve">${MLW_BIND_ADDR:-0.0.0.0}, so all gateway ports can be bound to one address</w:t>
+            </w:r>
+          </w:p>
+        </w:tc>
+      </w:tr>
+    </w:tbl>
+    <w:p>
+      <w:pPr>
+        <w:pStyle w:val="Normal"/>
+        <w:rPr/>
+      </w:pPr>
+      <w:r>
+        <w:rPr/>
+        <w:t xml:space="preserve"/>
+      </w:r>
+    </w:p>
+    <w:p>
+      <w:pPr>
+        <w:pStyle w:val="Normal"/>
+        <w:rPr/>
+      </w:pPr>
+      <w:r>
+        <w:rPr/>
+        <w:t xml:space="preserve">The production-only variables (SFTPGO_VERSION, MLW_VERSION, MLW_BIND_ADDR) are set in .env; SFTPGO_VERSION has no default, and Compose refuses to start without it. The data and persistence layout is the same as in the development stack. See the release notes for build and run instructions.</w:t>
+      </w:r>
+    </w:p>
+    <w:p>
+      <w:pPr>
         <w:pStyle w:val="Heading1"/>
         <w:rPr/>
       </w:pPr>
-      <w:bookmarkStart w:id="917" w:name="_Toc100017"/>
+      <w:bookmarkStart w:id="918" w:name="_Toc100018"/>
       <w:r>
         <w:rPr/>
         <w:t>7. Data and persistence</w:t>
       </w:r>
-      <w:bookmarkEnd w:id="917"/>
+      <w:bookmarkEnd w:id="918"/>
     </w:p>
     <w:p>
       <w:pPr>
@@ -5485,12 +6237,12 @@
         <w:pStyle w:val="Heading1"/>
         <w:rPr/>
       </w:pPr>
-      <w:bookmarkStart w:id="918" w:name="_Toc100018"/>
+      <w:bookmarkStart w:id="919" w:name="_Toc100019"/>
       <w:r>
         <w:rPr/>
         <w:t>8. Security considerations</w:t>
       </w:r>
-      <w:bookmarkEnd w:id="918"/>
+      <w:bookmarkEnd w:id="919"/>
     </w:p>
     <w:p>
       <w:pPr>
@@ -5620,15 +6372,29 @@
     </w:p>
     <w:p>
       <w:pPr>
+        <w:pStyle w:val="ListBullet"/>
+        <w:numPr>
+          <w:ilvl w:val="0"/>
+          <w:numId w:val="1"/>
+        </w:numPr>
+        <w:rPr/>
+      </w:pPr>
+      <w:r>
+        <w:rPr/>
+        <w:t xml:space="preserve">Production: docker-compose.prod.yml drops all Linux capabilities and sets no-new-privileges on both containers and makes the gateway file system read-only. Set MLW_BIND_ADDR to an internal interface address and terminate TLS in a reverse proxy in front of port 8380.</w:t>
+      </w:r>
+    </w:p>
+    <w:p>
+      <w:pPr>
         <w:pStyle w:val="Heading1"/>
         <w:rPr/>
       </w:pPr>
-      <w:bookmarkStart w:id="919" w:name="_Toc100019"/>
+      <w:bookmarkStart w:id="920" w:name="_Toc100020"/>
       <w:r>
         <w:rPr/>
         <w:t>9. Operations</w:t>
       </w:r>
-      <w:bookmarkEnd w:id="919"/>
+      <w:bookmarkEnd w:id="920"/>
     </w:p>
     <w:p>
       <w:pPr>
@@ -5662,15 +6428,43 @@
     </w:p>
     <w:p>
       <w:pPr>
+        <w:pStyle w:val="Normal"/>
+        <w:rPr/>
+      </w:pPr>
+      <w:r>
+        <w:rPr/>
+        <w:t xml:space="preserve">For production, set SFTPGO_VERSION in .env and use the production file:</w:t>
+      </w:r>
+    </w:p>
+    <w:p>
+      <w:pPr>
+        <w:pStyle w:val="Normal"/>
+        <w:ind w:left="288"/>
+        <w:rPr/>
+      </w:pPr>
+      <w:r>
+        <w:rPr>
+          <w:rFonts w:eastAsia="Consolas" w:ascii="Consolas" w:hAnsi="Consolas"/>
+          <w:sz w:val="18"/>
+        </w:rPr>
+        <w:t xml:space="preserve">docker compose -f docker-compose.prod.yml up -d --build</w:t>
+        <w:br/>
+        <w:t xml:space="preserve">docker compose -f docker-compose.prod.yml logs -f proxy</w:t>
+        <w:br/>
+        <w:t xml:space="preserve">docker compose -f docker-compose.prod.yml down</w:t>
+      </w:r>
+    </w:p>
+    <w:p>
+      <w:pPr>
         <w:pStyle w:val="Heading1"/>
         <w:rPr/>
       </w:pPr>
-      <w:bookmarkStart w:id="920" w:name="_Toc100020"/>
+      <w:bookmarkStart w:id="921" w:name="_Toc100021"/>
       <w:r>
         <w:rPr/>
         <w:t>10. Limitations and possible next steps</w:t>
       </w:r>
-      <w:bookmarkEnd w:id="920"/>
+      <w:bookmarkEnd w:id="921"/>
     </w:p>
     <w:p>
       <w:pPr>

</xml_diff>

<commit_message>
Page the Dashboard user table (20 per table) and document the web UI
Co-Authored-By: Claude Sonnet 5.5 <noreply@anthropic.com>
</commit_message>
<xml_diff>
--- a/doc/mlw-storage_Architecture.docx
+++ b/doc/mlw-storage_Architecture.docx
@@ -335,10 +335,42 @@
         <w:tabs>
           <w:tab w:pos="9360" w:val="right" w:leader="dot"/>
         </w:tabs>
+        <w:spacing w:after="60" w:before="0"/>
+        <w:ind w:left="320"/>
+      </w:pPr>
+      <w:hyperlink w:anchor="_Toc100005" w:history="1">
+        <w:r>
+          <w:t xml:space="preserve">3.3 Web UI (/mlw/)</w:t>
+        </w:r>
+        <w:r>
+          <w:tab/>
+        </w:r>
+        <w:r>
+          <w:fldChar w:fldCharType="begin"/>
+        </w:r>
+        <w:r>
+          <w:instrText xml:space="preserve"> PAGEREF _Toc100005 \h </w:instrText>
+        </w:r>
+        <w:r>
+          <w:fldChar w:fldCharType="separate"/>
+        </w:r>
+        <w:r>
+          <w:t xml:space="preserve">4</w:t>
+        </w:r>
+        <w:r>
+          <w:fldChar w:fldCharType="end"/>
+        </w:r>
+      </w:hyperlink>
+    </w:p>
+    <w:p>
+      <w:pPr>
+        <w:tabs>
+          <w:tab w:pos="9360" w:val="right" w:leader="dot"/>
+        </w:tabs>
         <w:spacing w:after="80" w:before="120"/>
         <w:ind w:left="0"/>
       </w:pPr>
-      <w:hyperlink w:anchor="_Toc100005" w:history="1">
+      <w:hyperlink w:anchor="_Toc100006" w:history="1">
         <w:r>
           <w:rPr>
             <w:b/>
@@ -361,7 +393,7 @@
           <w:rPr>
             <w:b/>
           </w:rPr>
-          <w:instrText xml:space="preserve"> PAGEREF _Toc100005 \h </w:instrText>
+          <w:instrText xml:space="preserve"> PAGEREF _Toc100006 \h </w:instrText>
         </w:r>
         <w:r>
           <w:rPr>
@@ -373,7 +405,7 @@
           <w:rPr>
             <w:b/>
           </w:rPr>
-          <w:t xml:space="preserve">4</w:t>
+          <w:t xml:space="preserve">5</w:t>
         </w:r>
         <w:r>
           <w:rPr>
@@ -391,41 +423,9 @@
         <w:spacing w:after="60" w:before="0"/>
         <w:ind w:left="320"/>
       </w:pPr>
-      <w:hyperlink w:anchor="_Toc100006" w:history="1">
+      <w:hyperlink w:anchor="_Toc100007" w:history="1">
         <w:r>
           <w:t xml:space="preserve">4.1 Web and REST API</w:t>
-        </w:r>
-        <w:r>
-          <w:tab/>
-        </w:r>
-        <w:r>
-          <w:fldChar w:fldCharType="begin"/>
-        </w:r>
-        <w:r>
-          <w:instrText xml:space="preserve"> PAGEREF _Toc100006 \h </w:instrText>
-        </w:r>
-        <w:r>
-          <w:fldChar w:fldCharType="separate"/>
-        </w:r>
-        <w:r>
-          <w:t xml:space="preserve">4</w:t>
-        </w:r>
-        <w:r>
-          <w:fldChar w:fldCharType="end"/>
-        </w:r>
-      </w:hyperlink>
-    </w:p>
-    <w:p>
-      <w:pPr>
-        <w:tabs>
-          <w:tab w:pos="9360" w:val="right" w:leader="dot"/>
-        </w:tabs>
-        <w:spacing w:after="60" w:before="0"/>
-        <w:ind w:left="320"/>
-      </w:pPr>
-      <w:hyperlink w:anchor="_Toc100007" w:history="1">
-        <w:r>
-          <w:t xml:space="preserve">4.2 SFTP</w:t>
         </w:r>
         <w:r>
           <w:tab/>
@@ -440,7 +440,7 @@
           <w:fldChar w:fldCharType="separate"/>
         </w:r>
         <w:r>
-          <w:t xml:space="preserve">4</w:t>
+          <w:t xml:space="preserve">5</w:t>
         </w:r>
         <w:r>
           <w:fldChar w:fldCharType="end"/>
@@ -457,7 +457,7 @@
       </w:pPr>
       <w:hyperlink w:anchor="_Toc100008" w:history="1">
         <w:r>
-          <w:t xml:space="preserve">4.3 FTP (optional)</w:t>
+          <w:t xml:space="preserve">4.2 SFTP</w:t>
         </w:r>
         <w:r>
           <w:tab/>
@@ -489,7 +489,7 @@
       </w:pPr>
       <w:hyperlink w:anchor="_Toc100009" w:history="1">
         <w:r>
-          <w:t xml:space="preserve">4.4 WebDAV (optional)</w:t>
+          <w:t xml:space="preserve">4.3 FTP (optional)</w:t>
         </w:r>
         <w:r>
           <w:tab/>
@@ -521,7 +521,7 @@
       </w:pPr>
       <w:hyperlink w:anchor="_Toc100010" w:history="1">
         <w:r>
-          <w:t xml:space="preserve">4.5 Keycloak token login (optional)</w:t>
+          <w:t xml:space="preserve">4.4 WebDAV (optional)</w:t>
         </w:r>
         <w:r>
           <w:tab/>
@@ -536,7 +536,7 @@
           <w:fldChar w:fldCharType="separate"/>
         </w:r>
         <w:r>
-          <w:t xml:space="preserve">5</w:t>
+          <w:t xml:space="preserve">6</w:t>
         </w:r>
         <w:r>
           <w:fldChar w:fldCharType="end"/>
@@ -553,7 +553,7 @@
       </w:pPr>
       <w:hyperlink w:anchor="_Toc100011" w:history="1">
         <w:r>
-          <w:t xml:space="preserve">4.6 Choosing the directory a user can open</w:t>
+          <w:t xml:space="preserve">4.5 Keycloak token login (optional)</w:t>
         </w:r>
         <w:r>
           <w:tab/>
@@ -580,10 +580,74 @@
         <w:tabs>
           <w:tab w:pos="9360" w:val="right" w:leader="dot"/>
         </w:tabs>
+        <w:spacing w:after="60" w:before="0"/>
+        <w:ind w:left="320"/>
+      </w:pPr>
+      <w:hyperlink w:anchor="_Toc100012" w:history="1">
+        <w:r>
+          <w:t xml:space="preserve">4.6 Choosing the directory a user can open</w:t>
+        </w:r>
+        <w:r>
+          <w:tab/>
+        </w:r>
+        <w:r>
+          <w:fldChar w:fldCharType="begin"/>
+        </w:r>
+        <w:r>
+          <w:instrText xml:space="preserve"> PAGEREF _Toc100012 \h </w:instrText>
+        </w:r>
+        <w:r>
+          <w:fldChar w:fldCharType="separate"/>
+        </w:r>
+        <w:r>
+          <w:t xml:space="preserve">7</w:t>
+        </w:r>
+        <w:r>
+          <w:fldChar w:fldCharType="end"/>
+        </w:r>
+      </w:hyperlink>
+    </w:p>
+    <w:p>
+      <w:pPr>
+        <w:tabs>
+          <w:tab w:pos="9360" w:val="right" w:leader="dot"/>
+        </w:tabs>
+        <w:spacing w:after="60" w:before="0"/>
+        <w:ind w:left="320"/>
+      </w:pPr>
+      <w:hyperlink w:anchor="_Toc100013" w:history="1">
+        <w:r>
+          <w:t xml:space="preserve">4.7 mlw-storage web UI sign-in</w:t>
+        </w:r>
+        <w:r>
+          <w:tab/>
+        </w:r>
+        <w:r>
+          <w:fldChar w:fldCharType="begin"/>
+        </w:r>
+        <w:r>
+          <w:instrText xml:space="preserve"> PAGEREF _Toc100013 \h </w:instrText>
+        </w:r>
+        <w:r>
+          <w:fldChar w:fldCharType="separate"/>
+        </w:r>
+        <w:r>
+          <w:t xml:space="preserve">8</w:t>
+        </w:r>
+        <w:r>
+          <w:fldChar w:fldCharType="end"/>
+        </w:r>
+      </w:hyperlink>
+    </w:p>
+    <w:p>
+      <w:pPr>
+        <w:tabs>
+          <w:tab w:pos="9360" w:val="right" w:leader="dot"/>
+        </w:tabs>
         <w:spacing w:after="80" w:before="120"/>
         <w:ind w:left="0"/>
       </w:pPr>
-      <w:hyperlink w:anchor="_Toc100012" w:history="1">
+      <w:hyperlink w:anchor="_Toc100014" w:history="1">
         <w:r>
           <w:rPr>
             <w:b/>
@@ -606,7 +670,7 @@
           <w:rPr>
             <w:b/>
           </w:rPr>
-          <w:instrText xml:space="preserve"> PAGEREF _Toc100012 \h </w:instrText>
+          <w:instrText xml:space="preserve"> PAGEREF _Toc100014 \h </w:instrText>
         </w:r>
         <w:r>
           <w:rPr>
@@ -618,7 +682,7 @@
           <w:rPr>
             <w:b/>
           </w:rPr>
-          <w:t xml:space="preserve">7</w:t>
+          <w:t xml:space="preserve">8</w:t>
         </w:r>
         <w:r>
           <w:rPr>
@@ -636,7 +700,7 @@
         <w:spacing w:after="80" w:before="120"/>
         <w:ind w:left="0"/>
       </w:pPr>
-      <w:hyperlink w:anchor="_Toc100013" w:history="1">
+      <w:hyperlink w:anchor="_Toc100015" w:history="1">
         <w:r>
           <w:rPr>
             <w:b/>
@@ -659,7 +723,7 @@
           <w:rPr>
             <w:b/>
           </w:rPr>
-          <w:instrText xml:space="preserve"> PAGEREF _Toc100013 \h </w:instrText>
+          <w:instrText xml:space="preserve"> PAGEREF _Toc100015 \h </w:instrText>
         </w:r>
         <w:r>
           <w:rPr>
@@ -671,7 +735,7 @@
           <w:rPr>
             <w:b/>
           </w:rPr>
-          <w:t xml:space="preserve">7</w:t>
+          <w:t xml:space="preserve">8</w:t>
         </w:r>
         <w:r>
           <w:rPr>
@@ -689,73 +753,9 @@
         <w:spacing w:after="60" w:before="0"/>
         <w:ind w:left="320"/>
       </w:pPr>
-      <w:hyperlink w:anchor="_Toc100014" w:history="1">
+      <w:hyperlink w:anchor="_Toc100016" w:history="1">
         <w:r>
           <w:t xml:space="preserve">6.1 Operator settings (.env)</w:t>
-        </w:r>
-        <w:r>
-          <w:tab/>
-        </w:r>
-        <w:r>
-          <w:fldChar w:fldCharType="begin"/>
-        </w:r>
-        <w:r>
-          <w:instrText xml:space="preserve"> PAGEREF _Toc100014 \h </w:instrText>
-        </w:r>
-        <w:r>
-          <w:fldChar w:fldCharType="separate"/>
-        </w:r>
-        <w:r>
-          <w:t xml:space="preserve">7</w:t>
-        </w:r>
-        <w:r>
-          <w:fldChar w:fldCharType="end"/>
-        </w:r>
-      </w:hyperlink>
-    </w:p>
-    <w:p>
-      <w:pPr>
-        <w:tabs>
-          <w:tab w:pos="9360" w:val="right" w:leader="dot"/>
-        </w:tabs>
-        <w:spacing w:after="60" w:before="0"/>
-        <w:ind w:left="320"/>
-      </w:pPr>
-      <w:hyperlink w:anchor="_Toc100015" w:history="1">
-        <w:r>
-          <w:t xml:space="preserve">6.2 Gateway settings</w:t>
-        </w:r>
-        <w:r>
-          <w:tab/>
-        </w:r>
-        <w:r>
-          <w:fldChar w:fldCharType="begin"/>
-        </w:r>
-        <w:r>
-          <w:instrText xml:space="preserve"> PAGEREF _Toc100015 \h </w:instrText>
-        </w:r>
-        <w:r>
-          <w:fldChar w:fldCharType="separate"/>
-        </w:r>
-        <w:r>
-          <w:t xml:space="preserve">8</w:t>
-        </w:r>
-        <w:r>
-          <w:fldChar w:fldCharType="end"/>
-        </w:r>
-      </w:hyperlink>
-    </w:p>
-    <w:p>
-      <w:pPr>
-        <w:tabs>
-          <w:tab w:pos="9360" w:val="right" w:leader="dot"/>
-        </w:tabs>
-        <w:spacing w:after="60" w:before="0"/>
-        <w:ind w:left="320"/>
-      </w:pPr>
-      <w:hyperlink w:anchor="_Toc100016" w:history="1">
-        <w:r>
-          <w:t xml:space="preserve">6.3 Keycloak settings (optional)</w:t>
         </w:r>
         <w:r>
           <w:tab/>
@@ -787,7 +787,7 @@
       </w:pPr>
       <w:hyperlink w:anchor="_Toc100017" w:history="1">
         <w:r>
-          <w:t xml:space="preserve">6.4 Production deployment (docker-compose.prod.yml)</w:t>
+          <w:t xml:space="preserve">6.2 Gateway settings</w:t>
         </w:r>
         <w:r>
           <w:tab/>
@@ -814,121 +814,79 @@
         <w:tabs>
           <w:tab w:pos="9360" w:val="right" w:leader="dot"/>
         </w:tabs>
+        <w:spacing w:after="60" w:before="0"/>
+        <w:ind w:left="320"/>
+      </w:pPr>
+      <w:hyperlink w:anchor="_Toc100018" w:history="1">
+        <w:r>
+          <w:t xml:space="preserve">6.3 Keycloak settings (optional)</w:t>
+        </w:r>
+        <w:r>
+          <w:tab/>
+        </w:r>
+        <w:r>
+          <w:fldChar w:fldCharType="begin"/>
+        </w:r>
+        <w:r>
+          <w:instrText xml:space="preserve"> PAGEREF _Toc100018 \h </w:instrText>
+        </w:r>
+        <w:r>
+          <w:fldChar w:fldCharType="separate"/>
+        </w:r>
+        <w:r>
+          <w:t xml:space="preserve">9</w:t>
+        </w:r>
+        <w:r>
+          <w:fldChar w:fldCharType="end"/>
+        </w:r>
+      </w:hyperlink>
+    </w:p>
+    <w:p>
+      <w:pPr>
+        <w:tabs>
+          <w:tab w:pos="9360" w:val="right" w:leader="dot"/>
+        </w:tabs>
+        <w:spacing w:after="60" w:before="0"/>
+        <w:ind w:left="320"/>
+      </w:pPr>
+      <w:hyperlink w:anchor="_Toc100019" w:history="1">
+        <w:r>
+          <w:t xml:space="preserve">6.4 Production deployment (docker-compose.prod.yml)</w:t>
+        </w:r>
+        <w:r>
+          <w:tab/>
+        </w:r>
+        <w:r>
+          <w:fldChar w:fldCharType="begin"/>
+        </w:r>
+        <w:r>
+          <w:instrText xml:space="preserve"> PAGEREF _Toc100019 \h </w:instrText>
+        </w:r>
+        <w:r>
+          <w:fldChar w:fldCharType="separate"/>
+        </w:r>
+        <w:r>
+          <w:t xml:space="preserve">10</w:t>
+        </w:r>
+        <w:r>
+          <w:fldChar w:fldCharType="end"/>
+        </w:r>
+      </w:hyperlink>
+    </w:p>
+    <w:p>
+      <w:pPr>
+        <w:tabs>
+          <w:tab w:pos="9360" w:val="right" w:leader="dot"/>
+        </w:tabs>
         <w:spacing w:after="80" w:before="120"/>
         <w:ind w:left="0"/>
       </w:pPr>
-      <w:hyperlink w:anchor="_Toc100018" w:history="1">
+      <w:hyperlink w:anchor="_Toc100020" w:history="1">
         <w:r>
           <w:rPr>
             <w:b/>
           </w:rPr>
           <w:t xml:space="preserve">7. Data and persistence</w:t>
-        </w:r>
-        <w:r>
-          <w:rPr>
-            <w:b/>
-          </w:rPr>
-          <w:tab/>
-        </w:r>
-        <w:r>
-          <w:rPr>
-            <w:b/>
-          </w:rPr>
-          <w:fldChar w:fldCharType="begin"/>
-        </w:r>
-        <w:r>
-          <w:rPr>
-            <w:b/>
-          </w:rPr>
-          <w:instrText xml:space="preserve"> PAGEREF _Toc100018 \h </w:instrText>
-        </w:r>
-        <w:r>
-          <w:rPr>
-            <w:b/>
-          </w:rPr>
-          <w:fldChar w:fldCharType="separate"/>
-        </w:r>
-        <w:r>
-          <w:rPr>
-            <w:b/>
-          </w:rPr>
-          <w:t xml:space="preserve">9</w:t>
-        </w:r>
-        <w:r>
-          <w:rPr>
-            <w:b/>
-          </w:rPr>
-          <w:fldChar w:fldCharType="end"/>
-        </w:r>
-      </w:hyperlink>
-    </w:p>
-    <w:p>
-      <w:pPr>
-        <w:tabs>
-          <w:tab w:pos="9360" w:val="right" w:leader="dot"/>
-        </w:tabs>
-        <w:spacing w:after="80" w:before="120"/>
-        <w:ind w:left="0"/>
-      </w:pPr>
-      <w:hyperlink w:anchor="_Toc100019" w:history="1">
-        <w:r>
-          <w:rPr>
-            <w:b/>
-          </w:rPr>
-          <w:t xml:space="preserve">8. Security considerations</w:t>
-        </w:r>
-        <w:r>
-          <w:rPr>
-            <w:b/>
-          </w:rPr>
-          <w:tab/>
-        </w:r>
-        <w:r>
-          <w:rPr>
-            <w:b/>
-          </w:rPr>
-          <w:fldChar w:fldCharType="begin"/>
-        </w:r>
-        <w:r>
-          <w:rPr>
-            <w:b/>
-          </w:rPr>
-          <w:instrText xml:space="preserve"> PAGEREF _Toc100019 \h </w:instrText>
-        </w:r>
-        <w:r>
-          <w:rPr>
-            <w:b/>
-          </w:rPr>
-          <w:fldChar w:fldCharType="separate"/>
-        </w:r>
-        <w:r>
-          <w:rPr>
-            <w:b/>
-          </w:rPr>
-          <w:t xml:space="preserve">10</w:t>
-        </w:r>
-        <w:r>
-          <w:rPr>
-            <w:b/>
-          </w:rPr>
-          <w:fldChar w:fldCharType="end"/>
-        </w:r>
-      </w:hyperlink>
-    </w:p>
-    <w:p>
-      <w:pPr>
-        <w:tabs>
-          <w:tab w:pos="9360" w:val="right" w:leader="dot"/>
-        </w:tabs>
-        <w:spacing w:after="80" w:before="120"/>
-        <w:ind w:left="0"/>
-      </w:pPr>
-      <w:hyperlink w:anchor="_Toc100020" w:history="1">
-        <w:r>
-          <w:rPr>
-            <w:b/>
-          </w:rPr>
-          <w:t xml:space="preserve">9. Operations</w:t>
         </w:r>
         <w:r>
           <w:rPr>
@@ -958,7 +916,7 @@
           <w:rPr>
             <w:b/>
           </w:rPr>
-          <w:t xml:space="preserve">10</w:t>
+          <w:t xml:space="preserve">11</w:t>
         </w:r>
         <w:r>
           <w:rPr>
@@ -981,7 +939,7 @@
           <w:rPr>
             <w:b/>
           </w:rPr>
-          <w:t xml:space="preserve">10. Limitations and possible next steps</w:t>
+          <w:t xml:space="preserve">8. Security considerations</w:t>
         </w:r>
         <w:r>
           <w:rPr>
@@ -1020,6 +978,112 @@
           <w:fldChar w:fldCharType="end"/>
         </w:r>
       </w:hyperlink>
+    </w:p>
+    <w:p>
+      <w:pPr>
+        <w:tabs>
+          <w:tab w:pos="9360" w:val="right" w:leader="dot"/>
+        </w:tabs>
+        <w:spacing w:after="80" w:before="120"/>
+        <w:ind w:left="0"/>
+      </w:pPr>
+      <w:hyperlink w:anchor="_Toc100022" w:history="1">
+        <w:r>
+          <w:rPr>
+            <w:b/>
+          </w:rPr>
+          <w:t xml:space="preserve">9. Operations</w:t>
+        </w:r>
+        <w:r>
+          <w:rPr>
+            <w:b/>
+          </w:rPr>
+          <w:tab/>
+        </w:r>
+        <w:r>
+          <w:rPr>
+            <w:b/>
+          </w:rPr>
+          <w:fldChar w:fldCharType="begin"/>
+        </w:r>
+        <w:r>
+          <w:rPr>
+            <w:b/>
+          </w:rPr>
+          <w:instrText xml:space="preserve"> PAGEREF _Toc100022 \h </w:instrText>
+        </w:r>
+        <w:r>
+          <w:rPr>
+            <w:b/>
+          </w:rPr>
+          <w:fldChar w:fldCharType="separate"/>
+        </w:r>
+        <w:r>
+          <w:rPr>
+            <w:b/>
+          </w:rPr>
+          <w:t xml:space="preserve">12</w:t>
+        </w:r>
+        <w:r>
+          <w:rPr>
+            <w:b/>
+          </w:rPr>
+          <w:fldChar w:fldCharType="end"/>
+        </w:r>
+      </w:hyperlink>
+    </w:p>
+    <w:p>
+      <w:pPr>
+        <w:tabs>
+          <w:tab w:pos="9360" w:val="right" w:leader="dot"/>
+        </w:tabs>
+        <w:spacing w:after="80" w:before="120"/>
+        <w:ind w:left="0"/>
+      </w:pPr>
+      <w:hyperlink w:anchor="_Toc100023" w:history="1">
+        <w:r>
+          <w:rPr>
+            <w:b/>
+          </w:rPr>
+          <w:t xml:space="preserve">10. Limitations and possible next steps</w:t>
+        </w:r>
+        <w:r>
+          <w:rPr>
+            <w:b/>
+          </w:rPr>
+          <w:tab/>
+        </w:r>
+        <w:r>
+          <w:rPr>
+            <w:b/>
+          </w:rPr>
+          <w:fldChar w:fldCharType="begin"/>
+        </w:r>
+        <w:r>
+          <w:rPr>
+            <w:b/>
+          </w:rPr>
+          <w:instrText xml:space="preserve"> PAGEREF _Toc100023 \h </w:instrText>
+        </w:r>
+        <w:r>
+          <w:rPr>
+            <w:b/>
+          </w:rPr>
+          <w:fldChar w:fldCharType="separate"/>
+        </w:r>
+        <w:r>
+          <w:rPr>
+            <w:b/>
+          </w:rPr>
+          <w:t xml:space="preserve">12</w:t>
+        </w:r>
+        <w:r>
+          <w:rPr>
+            <w:b/>
+          </w:rPr>
+          <w:fldChar w:fldCharType="end"/>
+        </w:r>
+      </w:hyperlink>
       <w:r>
         <w:fldChar w:fldCharType="end"/>
       </w:r>
@@ -1132,7 +1196,7 @@
           <w:rFonts w:eastAsia="Consolas" w:ascii="Consolas" w:hAnsi="Consolas"/>
           <w:sz w:val="18"/>
         </w:rPr>
-        <w:t>Remote servers / users</w:t>
+        <w:t xml:space="preserve">Remote servers / users</w:t>
         <w:br/>
         <w:t xml:space="preserve">          |</w:t>
         <w:br/>
@@ -1147,6 +1211,8 @@
         <w:t xml:space="preserve">  |  - HTTP reverse proxy      - TCP relay (SFTP)     |</w:t>
         <w:br/>
         <w:t xml:space="preserve">  |  - TCP relay (FTP, passive) - HTTP proxy (WebDAV) |</w:t>
+        <w:br/>
+        <w:t xml:space="preserve">  |  - web UI (/mlw/)                                 |</w:t>
         <w:br/>
         <w:t xml:space="preserve">  +--------------------------------------------------+</w:t>
         <w:br/>
@@ -1168,6 +1234,7 @@
         <w:br/>
         <w:t xml:space="preserve">                           (database, host keys, state)</w:t>
         <w:br/>
+        <w:t xml:space="preserve"/>
         <w:br/>
         <w:t xml:space="preserve">  [ ] = optional, disabled by default</w:t>
       </w:r>
@@ -1346,80 +1413,24 @@
     </w:p>
     <w:p>
       <w:pPr>
-        <w:pStyle w:val="Heading1"/>
+        <w:pStyle w:val="Heading2"/>
         <w:rPr/>
       </w:pPr>
       <w:bookmarkStart w:id="905" w:name="_Toc100005"/>
       <w:r>
         <w:rPr/>
-        <w:t>4. How traffic flows</w:t>
+        <w:t>3.3 Web UI (/mlw/)</w:t>
       </w:r>
       <w:bookmarkEnd w:id="905"/>
     </w:p>
     <w:p>
       <w:pPr>
-        <w:pStyle w:val="Heading2"/>
-        <w:rPr/>
-      </w:pPr>
-      <w:bookmarkStart w:id="906" w:name="_Toc100006"/>
+        <w:pStyle w:val="Normal"/>
+        <w:rPr/>
+      </w:pPr>
       <w:r>
         <w:rPr/>
-        <w:t>4.1 Web and REST API</w:t>
-      </w:r>
-      <w:bookmarkEnd w:id="906"/>
-    </w:p>
-    <w:p>
-      <w:pPr>
-        <w:pStyle w:val="Normal"/>
-        <w:rPr/>
-      </w:pPr>
-      <w:r>
-        <w:rPr/>
-        <w:t>A browser or API client connects to port 8380. The gateway forwards the request to sftpgo:8080 and returns the response. Admin login, user management and the WebClient all work through this path.</w:t>
-      </w:r>
-    </w:p>
-    <w:p>
-      <w:pPr>
-        <w:pStyle w:val="Heading2"/>
-        <w:rPr/>
-      </w:pPr>
-      <w:bookmarkStart w:id="907" w:name="_Toc100007"/>
-      <w:r>
-        <w:rPr/>
-        <w:t>4.2 SFTP</w:t>
-      </w:r>
-      <w:bookmarkEnd w:id="907"/>
-    </w:p>
-    <w:p>
-      <w:pPr>
-        <w:pStyle w:val="Normal"/>
-        <w:rPr/>
-      </w:pPr>
-      <w:r>
-        <w:rPr/>
-        <w:t>A remote server runs an SFTP client against port 2222 (for example sftp -P 2222 user@gateway). The gateway relays the TCP stream to sftpgo:2022. SFTPGo performs the SSH handshake, authenticates the user and serves files from that user's home directory.</w:t>
-      </w:r>
-    </w:p>
-    <w:p>
-      <w:pPr>
-        <w:pStyle w:val="Heading2"/>
-        <w:rPr/>
-      </w:pPr>
-      <w:bookmarkStart w:id="908" w:name="_Toc100008"/>
-      <w:r>
-        <w:rPr/>
-        <w:t>4.3 FTP (optional)</w:t>
-      </w:r>
-      <w:bookmarkEnd w:id="908"/>
-    </w:p>
-    <w:p>
-      <w:pPr>
-        <w:pStyle w:val="Normal"/>
-        <w:rPr/>
-      </w:pPr>
-      <w:r>
-        <w:rPr/>
-        <w:t>FTP uses a control connection plus separate data connections. In passive mode, SFTPGo tells the client which address and port to use for each transfer. For this to work through the gateway:</w:t>
+        <w:t>The gateway serves a small mlw-storage web UI on the HTTP port, and requests for / are redirected to it. It has two pages. The sign-in page (/mlw/login) takes the SFTPGo administrator credentials. The Dashboard (/mlw/dashboard) is the page shown after signing in: a table of the SFTPGo users (Username, Status, Last login, Description), shown 20 users per table with left and right arrows and a range label such as 1..20 to move between tables, and a button that opens the SFTPGo administration console. An account icon at the top right shows the signed-in name and opens a menu with Logout.</w:t>
       </w:r>
     </w:p>
     <w:p>
@@ -1432,8 +1443,14 @@
         <w:rPr/>
       </w:pPr>
       <w:r>
-        <w:rPr/>
-        <w:t>The control connection on port 2121 is relayed to sftpgo:2121.</w:t>
+        <w:rPr>
+          <w:b/>
+        </w:rPr>
+        <w:t xml:space="preserve">Sign-in.</w:t>
+      </w:r>
+      <w:r>
+        <w:rPr/>
+        <w:t xml:space="preserve"> The gateway checks the credentials with SFTPGo (GET /api/v2/token) and keeps the returned API token on the server. The browser only receives a session cookie (mlw_session: random value, HttpOnly, SameSite=Strict, Secure behind HTTPS). The session ends when the SFTPGo token expires (20 minutes by default), at Logout, or when the gateway restarts, because sessions are held in memory.</w:t>
       </w:r>
     </w:p>
     <w:p>
@@ -1446,8 +1463,14 @@
         <w:rPr/>
       </w:pPr>
       <w:r>
-        <w:rPr/>
-        <w:t>SFTPGo is configured with the passive port range 50000-50009 and advertises FTP_PASSIVE_IP, the address clients use to reach the gateway, so data connections come to the gateway rather than to the container.</w:t>
+        <w:rPr>
+          <w:b/>
+        </w:rPr>
+        <w:t xml:space="preserve">Dashboard data.</w:t>
+      </w:r>
+      <w:r>
+        <w:rPr/>
+        <w:t xml:space="preserve"> The user list is read from SFTPGo (GET /api/v2/users, paged) with the session's token and rendered on the server, with all values HTML-escaped. For users created by Keycloak login the Description holds the name and e-mail, so an administrator can tell whose directory a user id is.</w:t>
       </w:r>
     </w:p>
     <w:p>
@@ -1460,6 +1483,172 @@
         <w:rPr/>
       </w:pPr>
       <w:r>
+        <w:rPr>
+          <w:b/>
+        </w:rPr>
+        <w:t xml:space="preserve">Protections.</w:t>
+      </w:r>
+      <w:r>
+        <w:rPr/>
+        <w:t xml:space="preserve"> State-changing requests (sign-in, logout) must come from the same site (Sec-Fetch-Site, or an Origin or Referer naming this host). After 10 failed sign-ins from one address within 5 minutes, further attempts are refused. Pages are sent with Cache-Control: no-store and a Content-Security-Policy that allows no scripts except the one that closes the account menu and switches between tables, matched by hash.</w:t>
+      </w:r>
+    </w:p>
+    <w:p>
+      <w:pPr>
+        <w:pStyle w:val="ListBullet"/>
+        <w:numPr>
+          <w:ilvl w:val="0"/>
+          <w:numId w:val="1"/>
+        </w:numPr>
+        <w:rPr/>
+      </w:pPr>
+      <w:r>
+        <w:rPr>
+          <w:b/>
+        </w:rPr>
+        <w:t xml:space="preserve">SFTPGo console.</w:t>
+      </w:r>
+      <w:r>
+        <w:rPr/>
+        <w:t xml:space="preserve"> The Dashboard button opens SFTPGo's own admin console at /web/admin/, which keeps its separate sign-in. So an administrator can get back, the gateway adds a "mlw-storage Dashboard" button to SFTPGo's admin HTML pages (including its sign-in page) as they pass through. Other responses are not modified.</w:t>
+      </w:r>
+    </w:p>
+    <w:p>
+      <w:pPr>
+        <w:pStyle w:val="ListBullet"/>
+        <w:numPr>
+          <w:ilvl w:val="0"/>
+          <w:numId w:val="1"/>
+        </w:numPr>
+        <w:rPr/>
+      </w:pPr>
+      <w:r>
+        <w:rPr>
+          <w:b/>
+        </w:rPr>
+        <w:t xml:space="preserve">Switching off.</w:t>
+      </w:r>
+      <w:r>
+        <w:rPr/>
+        <w:t xml:space="preserve"> PROXY_UI=false removes the UI: / then goes to SFTPGo as before and nothing is injected.</w:t>
+      </w:r>
+    </w:p>
+    <w:p>
+      <w:pPr>
+        <w:pStyle w:val="Heading1"/>
+        <w:rPr/>
+      </w:pPr>
+      <w:bookmarkStart w:id="906" w:name="_Toc100006"/>
+      <w:r>
+        <w:rPr/>
+        <w:t>4. How traffic flows</w:t>
+      </w:r>
+      <w:bookmarkEnd w:id="906"/>
+    </w:p>
+    <w:p>
+      <w:pPr>
+        <w:pStyle w:val="Heading2"/>
+        <w:rPr/>
+      </w:pPr>
+      <w:bookmarkStart w:id="907" w:name="_Toc100007"/>
+      <w:r>
+        <w:rPr/>
+        <w:t>4.1 Web and REST API</w:t>
+      </w:r>
+      <w:bookmarkEnd w:id="907"/>
+    </w:p>
+    <w:p>
+      <w:pPr>
+        <w:pStyle w:val="Normal"/>
+        <w:rPr/>
+      </w:pPr>
+      <w:r>
+        <w:rPr/>
+        <w:t>A browser or API client connects to port 8380. The gateway forwards the request to sftpgo:8080 and returns the response. Admin login, user management and the WebClient all work through this path.</w:t>
+      </w:r>
+    </w:p>
+    <w:p>
+      <w:pPr>
+        <w:pStyle w:val="Heading2"/>
+        <w:rPr/>
+      </w:pPr>
+      <w:bookmarkStart w:id="908" w:name="_Toc100008"/>
+      <w:r>
+        <w:rPr/>
+        <w:t>4.2 SFTP</w:t>
+      </w:r>
+      <w:bookmarkEnd w:id="908"/>
+    </w:p>
+    <w:p>
+      <w:pPr>
+        <w:pStyle w:val="Normal"/>
+        <w:rPr/>
+      </w:pPr>
+      <w:r>
+        <w:rPr/>
+        <w:t>A remote server runs an SFTP client against port 2222 (for example sftp -P 2222 user@gateway). The gateway relays the TCP stream to sftpgo:2022. SFTPGo performs the SSH handshake, authenticates the user and serves files from that user's home directory.</w:t>
+      </w:r>
+    </w:p>
+    <w:p>
+      <w:pPr>
+        <w:pStyle w:val="Heading2"/>
+        <w:rPr/>
+      </w:pPr>
+      <w:bookmarkStart w:id="909" w:name="_Toc100009"/>
+      <w:r>
+        <w:rPr/>
+        <w:t>4.3 FTP (optional)</w:t>
+      </w:r>
+      <w:bookmarkEnd w:id="909"/>
+    </w:p>
+    <w:p>
+      <w:pPr>
+        <w:pStyle w:val="Normal"/>
+        <w:rPr/>
+      </w:pPr>
+      <w:r>
+        <w:rPr/>
+        <w:t>FTP uses a control connection plus separate data connections. In passive mode, SFTPGo tells the client which address and port to use for each transfer. For this to work through the gateway:</w:t>
+      </w:r>
+    </w:p>
+    <w:p>
+      <w:pPr>
+        <w:pStyle w:val="ListBullet"/>
+        <w:numPr>
+          <w:ilvl w:val="0"/>
+          <w:numId w:val="1"/>
+        </w:numPr>
+        <w:rPr/>
+      </w:pPr>
+      <w:r>
+        <w:rPr/>
+        <w:t>The control connection on port 2121 is relayed to sftpgo:2121.</w:t>
+      </w:r>
+    </w:p>
+    <w:p>
+      <w:pPr>
+        <w:pStyle w:val="ListBullet"/>
+        <w:numPr>
+          <w:ilvl w:val="0"/>
+          <w:numId w:val="1"/>
+        </w:numPr>
+        <w:rPr/>
+      </w:pPr>
+      <w:r>
+        <w:rPr/>
+        <w:t>SFTPGo is configured with the passive port range 50000-50009 and advertises FTP_PASSIVE_IP, the address clients use to reach the gateway, so data connections come to the gateway rather than to the container.</w:t>
+      </w:r>
+    </w:p>
+    <w:p>
+      <w:pPr>
+        <w:pStyle w:val="ListBullet"/>
+        <w:numPr>
+          <w:ilvl w:val="0"/>
+          <w:numId w:val="1"/>
+        </w:numPr>
+        <w:rPr/>
+      </w:pPr>
+      <w:r>
         <w:rPr/>
         <w:t>The gateway listens on each port in 50000-50009 and relays it to the same port on SFTPGo.</w:t>
       </w:r>
@@ -1479,12 +1668,12 @@
         <w:pStyle w:val="Heading2"/>
         <w:rPr/>
       </w:pPr>
-      <w:bookmarkStart w:id="909" w:name="_Toc100009"/>
+      <w:bookmarkStart w:id="910" w:name="_Toc100010"/>
       <w:r>
         <w:rPr/>
         <w:t>4.4 WebDAV (optional)</w:t>
       </w:r>
-      <w:bookmarkEnd w:id="909"/>
+      <w:bookmarkEnd w:id="910"/>
     </w:p>
     <w:p>
       <w:pPr>
@@ -1501,12 +1690,12 @@
         <w:pStyle w:val="Heading2"/>
         <w:rPr/>
       </w:pPr>
-      <w:bookmarkStart w:id="910" w:name="_Toc100010"/>
+      <w:bookmarkStart w:id="911" w:name="_Toc100011"/>
       <w:r>
         <w:rPr/>
         <w:t>4.5 Keycloak token login (optional)</w:t>
       </w:r>
-      <w:bookmarkEnd w:id="910"/>
+      <w:bookmarkEnd w:id="911"/>
     </w:p>
     <w:p>
       <w:pPr>
@@ -1636,12 +1825,12 @@
         <w:pStyle w:val="Heading2"/>
         <w:rPr/>
       </w:pPr>
-      <w:bookmarkStart w:id="911" w:name="_Toc100011"/>
+      <w:bookmarkStart w:id="912" w:name="_Toc100012"/>
       <w:r>
         <w:rPr/>
         <w:t>4.6 Choosing the directory a user can open</w:t>
       </w:r>
-      <w:bookmarkEnd w:id="911"/>
+      <w:bookmarkEnd w:id="912"/>
     </w:p>
     <w:p>
       <w:pPr>
@@ -2059,15 +2248,37 @@
     </w:p>
     <w:p>
       <w:pPr>
+        <w:pStyle w:val="Heading2"/>
+        <w:rPr/>
+      </w:pPr>
+      <w:bookmarkStart w:id="913" w:name="_Toc100013"/>
+      <w:r>
+        <w:rPr/>
+        <w:t>4.7 mlw-storage web UI sign-in</w:t>
+      </w:r>
+      <w:bookmarkEnd w:id="913"/>
+    </w:p>
+    <w:p>
+      <w:pPr>
+        <w:pStyle w:val="Normal"/>
+        <w:rPr/>
+      </w:pPr>
+      <w:r>
+        <w:rPr/>
+        <w:t xml:space="preserve">A browser opens http://host:8380/ and is redirected to /mlw/login. The form is posted to the gateway, which calls SFTPGo's token endpoint with the credentials. On success the gateway creates a session, sets the cookie and redirects to /mlw/dashboard. Each Dashboard request then reads the user list from SFTPGo with the stored token. If SFTPGo reports the token invalid, the session is dropped and the browser is sent back to the sign-in page. The Keycloak token login and the storage API (4.5, 4.6) are separate and do not use these sessions.</w:t>
+      </w:r>
+    </w:p>
+    <w:p>
+      <w:pPr>
         <w:pStyle w:val="Heading1"/>
         <w:rPr/>
       </w:pPr>
-      <w:bookmarkStart w:id="912" w:name="_Toc100012"/>
+      <w:bookmarkStart w:id="914" w:name="_Toc100014"/>
       <w:r>
         <w:rPr/>
         <w:t>5. Ports</w:t>
       </w:r>
-      <w:bookmarkEnd w:id="912"/>
+      <w:bookmarkEnd w:id="914"/>
     </w:p>
     <w:tbl>
       <w:tblPr>
@@ -2279,7 +2490,7 @@
                 <w:szCs w:val="22"/>
                 <w:lang w:val="en-US" w:eastAsia="en-US" w:bidi="ar-SA"/>
               </w:rPr>
-              <w:t>HTTP (web admin, WebClient, REST API)</w:t>
+              <w:t>HTTP (mlw-storage web UI, SFTPGo web admin, WebClient, REST API)</w:t>
             </w:r>
           </w:p>
         </w:tc>
@@ -2861,1607 +3072,13 @@
         <w:pStyle w:val="Heading1"/>
         <w:rPr/>
       </w:pPr>
-      <w:bookmarkStart w:id="913" w:name="_Toc100013"/>
-      <w:r>
-        <w:rPr/>
-        <w:t>6. Configuration</w:t>
-      </w:r>
-      <w:bookmarkEnd w:id="913"/>
-    </w:p>
-    <w:p>
-      <w:pPr>
-        <w:pStyle w:val="Heading2"/>
-        <w:rPr/>
-      </w:pPr>
-      <w:bookmarkStart w:id="914" w:name="_Toc100014"/>
-      <w:r>
-        <w:rPr/>
-        <w:t>6.1 Operator settings (.env)</w:t>
-      </w:r>
-      <w:bookmarkEnd w:id="914"/>
-    </w:p>
-    <w:tbl>
-      <w:tblPr>
-        <w:tblStyle w:val="TableGrid"/>
-        <w:tblW w:w="9360" w:type="dxa"/>
-        <w:jc w:val="left"/>
-        <w:tblInd w:w="0" w:type="dxa"/>
-        <w:tblLayout w:type="fixed"/>
-        <w:tblCellMar>
-          <w:top w:w="0" w:type="dxa"/>
-          <w:left w:w="108" w:type="dxa"/>
-          <w:bottom w:w="0" w:type="dxa"/>
-          <w:right w:w="108" w:type="dxa"/>
-        </w:tblCellMar>
-        <w:tblLook w:val="04a0" w:noHBand="0" w:noVBand="1" w:firstColumn="1" w:lastRow="0" w:lastColumn="0" w:firstRow="1"/>
-      </w:tblPr>
-      <w:tblGrid>
-        <w:gridCol w:w="3120"/>
-        <w:gridCol w:w="3120"/>
-        <w:gridCol w:w="3120"/>
-      </w:tblGrid>
-      <w:tr>
-        <w:trPr/>
-        <w:tc>
-          <w:tcPr>
-            <w:tcW w:w="3120" w:type="dxa"/>
-            <w:tcBorders/>
-            <w:shd w:color="auto" w:fill="DCE6F1" w:val="clear"/>
-          </w:tcPr>
-          <w:p>
-            <w:pPr>
-              <w:pStyle w:val="Normal"/>
-              <w:widowControl/>
-              <w:spacing w:lineRule="auto" w:line="240" w:before="0" w:after="40"/>
-              <w:jc w:val="left"/>
-              <w:rPr>
-                <w:rFonts w:eastAsia="ＭＳ 明朝" w:cs=""/>
-                <w:kern w:val="0"/>
-                <w:szCs w:val="22"/>
-                <w:lang w:val="en-US" w:eastAsia="en-US" w:bidi="ar-SA"/>
-              </w:rPr>
-            </w:pPr>
-            <w:r>
-              <w:rPr>
-                <w:rFonts w:eastAsia="ＭＳ 明朝" w:cs=""/>
-                <w:b/>
-                <w:kern w:val="0"/>
-                <w:sz w:val="20"/>
-                <w:szCs w:val="22"/>
-                <w:lang w:val="en-US" w:eastAsia="en-US" w:bidi="ar-SA"/>
-              </w:rPr>
-              <w:t>Variable</w:t>
-            </w:r>
-          </w:p>
-        </w:tc>
-        <w:tc>
-          <w:tcPr>
-            <w:tcW w:w="3120" w:type="dxa"/>
-            <w:tcBorders/>
-            <w:shd w:color="auto" w:fill="DCE6F1" w:val="clear"/>
-          </w:tcPr>
-          <w:p>
-            <w:pPr>
-              <w:pStyle w:val="Normal"/>
-              <w:widowControl/>
-              <w:spacing w:lineRule="auto" w:line="240" w:before="0" w:after="40"/>
-              <w:jc w:val="left"/>
-              <w:rPr>
-                <w:rFonts w:eastAsia="ＭＳ 明朝" w:cs=""/>
-                <w:kern w:val="0"/>
-                <w:szCs w:val="22"/>
-                <w:lang w:val="en-US" w:eastAsia="en-US" w:bidi="ar-SA"/>
-              </w:rPr>
-            </w:pPr>
-            <w:r>
-              <w:rPr>
-                <w:rFonts w:eastAsia="ＭＳ 明朝" w:cs=""/>
-                <w:b/>
-                <w:kern w:val="0"/>
-                <w:sz w:val="20"/>
-                <w:szCs w:val="22"/>
-                <w:lang w:val="en-US" w:eastAsia="en-US" w:bidi="ar-SA"/>
-              </w:rPr>
-              <w:t>Default</w:t>
-            </w:r>
-          </w:p>
-        </w:tc>
-        <w:tc>
-          <w:tcPr>
-            <w:tcW w:w="3120" w:type="dxa"/>
-            <w:tcBorders/>
-            <w:shd w:color="auto" w:fill="DCE6F1" w:val="clear"/>
-          </w:tcPr>
-          <w:p>
-            <w:pPr>
-              <w:pStyle w:val="Normal"/>
-              <w:widowControl/>
-              <w:spacing w:lineRule="auto" w:line="240" w:before="0" w:after="40"/>
-              <w:jc w:val="left"/>
-              <w:rPr>
-                <w:rFonts w:eastAsia="ＭＳ 明朝" w:cs=""/>
-                <w:kern w:val="0"/>
-                <w:szCs w:val="22"/>
-                <w:lang w:val="en-US" w:eastAsia="en-US" w:bidi="ar-SA"/>
-              </w:rPr>
-            </w:pPr>
-            <w:r>
-              <w:rPr>
-                <w:rFonts w:eastAsia="ＭＳ 明朝" w:cs=""/>
-                <w:b/>
-                <w:kern w:val="0"/>
-                <w:sz w:val="20"/>
-                <w:szCs w:val="22"/>
-                <w:lang w:val="en-US" w:eastAsia="en-US" w:bidi="ar-SA"/>
-              </w:rPr>
-              <w:t>Purpose</w:t>
-            </w:r>
-          </w:p>
-        </w:tc>
-      </w:tr>
-      <w:tr>
-        <w:trPr/>
-        <w:tc>
-          <w:tcPr>
-            <w:tcW w:w="3120" w:type="dxa"/>
-            <w:tcBorders/>
-          </w:tcPr>
-          <w:p>
-            <w:pPr>
-              <w:pStyle w:val="Normal"/>
-              <w:widowControl/>
-              <w:spacing w:lineRule="auto" w:line="240" w:before="0" w:after="40"/>
-              <w:jc w:val="left"/>
-              <w:rPr>
-                <w:rFonts w:eastAsia="ＭＳ 明朝" w:cs=""/>
-                <w:kern w:val="0"/>
-                <w:szCs w:val="22"/>
-                <w:lang w:val="en-US" w:eastAsia="en-US" w:bidi="ar-SA"/>
-              </w:rPr>
-            </w:pPr>
-            <w:r>
-              <w:rPr>
-                <w:rFonts w:eastAsia="ＭＳ 明朝" w:cs=""/>
-                <w:kern w:val="0"/>
-                <w:sz w:val="20"/>
-                <w:szCs w:val="22"/>
-                <w:lang w:val="en-US" w:eastAsia="en-US" w:bidi="ar-SA"/>
-              </w:rPr>
-              <w:t>SFTPGO_ADMIN_PASSWORD</w:t>
-            </w:r>
-          </w:p>
-        </w:tc>
-        <w:tc>
-          <w:tcPr>
-            <w:tcW w:w="3120" w:type="dxa"/>
-            <w:tcBorders/>
-          </w:tcPr>
-          <w:p>
-            <w:pPr>
-              <w:pStyle w:val="Normal"/>
-              <w:widowControl/>
-              <w:spacing w:lineRule="auto" w:line="240" w:before="0" w:after="40"/>
-              <w:jc w:val="left"/>
-              <w:rPr>
-                <w:rFonts w:eastAsia="ＭＳ 明朝" w:cs=""/>
-                <w:kern w:val="0"/>
-                <w:szCs w:val="22"/>
-                <w:lang w:val="en-US" w:eastAsia="en-US" w:bidi="ar-SA"/>
-              </w:rPr>
-            </w:pPr>
-            <w:r>
-              <w:rPr>
-                <w:rFonts w:eastAsia="ＭＳ 明朝" w:cs=""/>
-                <w:kern w:val="0"/>
-                <w:sz w:val="20"/>
-                <w:szCs w:val="22"/>
-                <w:lang w:val="en-US" w:eastAsia="en-US" w:bidi="ar-SA"/>
-              </w:rPr>
-              <w:t>(required)</w:t>
-            </w:r>
-          </w:p>
-        </w:tc>
-        <w:tc>
-          <w:tcPr>
-            <w:tcW w:w="3120" w:type="dxa"/>
-            <w:tcBorders/>
-          </w:tcPr>
-          <w:p>
-            <w:pPr>
-              <w:pStyle w:val="Normal"/>
-              <w:widowControl/>
-              <w:spacing w:lineRule="auto" w:line="240" w:before="0" w:after="40"/>
-              <w:jc w:val="left"/>
-              <w:rPr>
-                <w:rFonts w:eastAsia="ＭＳ 明朝" w:cs=""/>
-                <w:kern w:val="0"/>
-                <w:szCs w:val="22"/>
-                <w:lang w:val="en-US" w:eastAsia="en-US" w:bidi="ar-SA"/>
-              </w:rPr>
-            </w:pPr>
-            <w:r>
-              <w:rPr>
-                <w:rFonts w:eastAsia="ＭＳ 明朝" w:cs=""/>
-                <w:kern w:val="0"/>
-                <w:sz w:val="20"/>
-                <w:szCs w:val="22"/>
-                <w:lang w:val="en-US" w:eastAsia="en-US" w:bidi="ar-SA"/>
-              </w:rPr>
-              <w:t>Password of the initial admin account</w:t>
-            </w:r>
-          </w:p>
-        </w:tc>
-      </w:tr>
-      <w:tr>
-        <w:trPr/>
-        <w:tc>
-          <w:tcPr>
-            <w:tcW w:w="3120" w:type="dxa"/>
-            <w:tcBorders/>
-          </w:tcPr>
-          <w:p>
-            <w:pPr>
-              <w:pStyle w:val="Normal"/>
-              <w:widowControl/>
-              <w:spacing w:lineRule="auto" w:line="240" w:before="0" w:after="40"/>
-              <w:jc w:val="left"/>
-              <w:rPr>
-                <w:rFonts w:eastAsia="ＭＳ 明朝" w:cs=""/>
-                <w:kern w:val="0"/>
-                <w:szCs w:val="22"/>
-                <w:lang w:val="en-US" w:eastAsia="en-US" w:bidi="ar-SA"/>
-              </w:rPr>
-            </w:pPr>
-            <w:r>
-              <w:rPr>
-                <w:rFonts w:eastAsia="ＭＳ 明朝" w:cs=""/>
-                <w:kern w:val="0"/>
-                <w:sz w:val="20"/>
-                <w:szCs w:val="22"/>
-                <w:lang w:val="en-US" w:eastAsia="en-US" w:bidi="ar-SA"/>
-              </w:rPr>
-              <w:t>SFTPGO_ADMIN_USER</w:t>
-            </w:r>
-          </w:p>
-        </w:tc>
-        <w:tc>
-          <w:tcPr>
-            <w:tcW w:w="3120" w:type="dxa"/>
-            <w:tcBorders/>
-          </w:tcPr>
-          <w:p>
-            <w:pPr>
-              <w:pStyle w:val="Normal"/>
-              <w:widowControl/>
-              <w:spacing w:lineRule="auto" w:line="240" w:before="0" w:after="40"/>
-              <w:jc w:val="left"/>
-              <w:rPr>
-                <w:rFonts w:eastAsia="ＭＳ 明朝" w:cs=""/>
-                <w:kern w:val="0"/>
-                <w:szCs w:val="22"/>
-                <w:lang w:val="en-US" w:eastAsia="en-US" w:bidi="ar-SA"/>
-              </w:rPr>
-            </w:pPr>
-            <w:r>
-              <w:rPr>
-                <w:rFonts w:eastAsia="ＭＳ 明朝" w:cs=""/>
-                <w:kern w:val="0"/>
-                <w:sz w:val="20"/>
-                <w:szCs w:val="22"/>
-                <w:lang w:val="en-US" w:eastAsia="en-US" w:bidi="ar-SA"/>
-              </w:rPr>
-              <w:t>admin</w:t>
-            </w:r>
-          </w:p>
-        </w:tc>
-        <w:tc>
-          <w:tcPr>
-            <w:tcW w:w="3120" w:type="dxa"/>
-            <w:tcBorders/>
-          </w:tcPr>
-          <w:p>
-            <w:pPr>
-              <w:pStyle w:val="Normal"/>
-              <w:widowControl/>
-              <w:spacing w:lineRule="auto" w:line="240" w:before="0" w:after="40"/>
-              <w:jc w:val="left"/>
-              <w:rPr>
-                <w:rFonts w:eastAsia="ＭＳ 明朝" w:cs=""/>
-                <w:kern w:val="0"/>
-                <w:szCs w:val="22"/>
-                <w:lang w:val="en-US" w:eastAsia="en-US" w:bidi="ar-SA"/>
-              </w:rPr>
-            </w:pPr>
-            <w:r>
-              <w:rPr>
-                <w:rFonts w:eastAsia="ＭＳ 明朝" w:cs=""/>
-                <w:kern w:val="0"/>
-                <w:sz w:val="20"/>
-                <w:szCs w:val="22"/>
-                <w:lang w:val="en-US" w:eastAsia="en-US" w:bidi="ar-SA"/>
-              </w:rPr>
-              <w:t>Username of the initial admin account</w:t>
-            </w:r>
-          </w:p>
-        </w:tc>
-      </w:tr>
-      <w:tr>
-        <w:trPr/>
-        <w:tc>
-          <w:tcPr>
-            <w:tcW w:w="3120" w:type="dxa"/>
-            <w:tcBorders/>
-          </w:tcPr>
-          <w:p>
-            <w:pPr>
-              <w:pStyle w:val="Normal"/>
-              <w:widowControl/>
-              <w:spacing w:lineRule="auto" w:line="240" w:before="0" w:after="40"/>
-              <w:jc w:val="left"/>
-              <w:rPr>
-                <w:rFonts w:eastAsia="ＭＳ 明朝" w:cs=""/>
-                <w:kern w:val="0"/>
-                <w:szCs w:val="22"/>
-                <w:lang w:val="en-US" w:eastAsia="en-US" w:bidi="ar-SA"/>
-              </w:rPr>
-            </w:pPr>
-            <w:r>
-              <w:rPr>
-                <w:rFonts w:eastAsia="ＭＳ 明朝" w:cs=""/>
-                <w:kern w:val="0"/>
-                <w:sz w:val="20"/>
-                <w:szCs w:val="22"/>
-                <w:lang w:val="en-US" w:eastAsia="en-US" w:bidi="ar-SA"/>
-              </w:rPr>
-              <w:t>FTP_PORT</w:t>
-            </w:r>
-          </w:p>
-        </w:tc>
-        <w:tc>
-          <w:tcPr>
-            <w:tcW w:w="3120" w:type="dxa"/>
-            <w:tcBorders/>
-          </w:tcPr>
-          <w:p>
-            <w:pPr>
-              <w:pStyle w:val="Normal"/>
-              <w:widowControl/>
-              <w:spacing w:lineRule="auto" w:line="240" w:before="0" w:after="40"/>
-              <w:jc w:val="left"/>
-              <w:rPr>
-                <w:rFonts w:eastAsia="ＭＳ 明朝" w:cs=""/>
-                <w:kern w:val="0"/>
-                <w:szCs w:val="22"/>
-                <w:lang w:val="en-US" w:eastAsia="en-US" w:bidi="ar-SA"/>
-              </w:rPr>
-            </w:pPr>
-            <w:r>
-              <w:rPr>
-                <w:rFonts w:eastAsia="ＭＳ 明朝" w:cs=""/>
-                <w:kern w:val="0"/>
-                <w:sz w:val="20"/>
-                <w:szCs w:val="22"/>
-                <w:lang w:val="en-US" w:eastAsia="en-US" w:bidi="ar-SA"/>
-              </w:rPr>
-              <w:t>0 (disabled)</w:t>
-            </w:r>
-          </w:p>
-        </w:tc>
-        <w:tc>
-          <w:tcPr>
-            <w:tcW w:w="3120" w:type="dxa"/>
-            <w:tcBorders/>
-          </w:tcPr>
-          <w:p>
-            <w:pPr>
-              <w:pStyle w:val="Normal"/>
-              <w:widowControl/>
-              <w:spacing w:lineRule="auto" w:line="240" w:before="0" w:after="40"/>
-              <w:jc w:val="left"/>
-              <w:rPr>
-                <w:rFonts w:eastAsia="ＭＳ 明朝" w:cs=""/>
-                <w:kern w:val="0"/>
-                <w:szCs w:val="22"/>
-                <w:lang w:val="en-US" w:eastAsia="en-US" w:bidi="ar-SA"/>
-              </w:rPr>
-            </w:pPr>
-            <w:r>
-              <w:rPr>
-                <w:rFonts w:eastAsia="ＭＳ 明朝" w:cs=""/>
-                <w:kern w:val="0"/>
-                <w:sz w:val="20"/>
-                <w:szCs w:val="22"/>
-                <w:lang w:val="en-US" w:eastAsia="en-US" w:bidi="ar-SA"/>
-              </w:rPr>
-              <w:t>Set to 2121 to enable FTP</w:t>
-            </w:r>
-          </w:p>
-        </w:tc>
-      </w:tr>
-      <w:tr>
-        <w:trPr/>
-        <w:tc>
-          <w:tcPr>
-            <w:tcW w:w="3120" w:type="dxa"/>
-            <w:tcBorders/>
-          </w:tcPr>
-          <w:p>
-            <w:pPr>
-              <w:pStyle w:val="Normal"/>
-              <w:widowControl/>
-              <w:spacing w:lineRule="auto" w:line="240" w:before="0" w:after="40"/>
-              <w:jc w:val="left"/>
-              <w:rPr>
-                <w:rFonts w:eastAsia="ＭＳ 明朝" w:cs=""/>
-                <w:kern w:val="0"/>
-                <w:szCs w:val="22"/>
-                <w:lang w:val="en-US" w:eastAsia="en-US" w:bidi="ar-SA"/>
-              </w:rPr>
-            </w:pPr>
-            <w:r>
-              <w:rPr>
-                <w:rFonts w:eastAsia="ＭＳ 明朝" w:cs=""/>
-                <w:kern w:val="0"/>
-                <w:sz w:val="20"/>
-                <w:szCs w:val="22"/>
-                <w:lang w:val="en-US" w:eastAsia="en-US" w:bidi="ar-SA"/>
-              </w:rPr>
-              <w:t>FTP_PASSIVE_IP</w:t>
-            </w:r>
-          </w:p>
-        </w:tc>
-        <w:tc>
-          <w:tcPr>
-            <w:tcW w:w="3120" w:type="dxa"/>
-            <w:tcBorders/>
-          </w:tcPr>
-          <w:p>
-            <w:pPr>
-              <w:pStyle w:val="Normal"/>
-              <w:widowControl/>
-              <w:spacing w:lineRule="auto" w:line="240" w:before="0" w:after="40"/>
-              <w:jc w:val="left"/>
-              <w:rPr>
-                <w:rFonts w:eastAsia="ＭＳ 明朝" w:cs=""/>
-                <w:kern w:val="0"/>
-                <w:szCs w:val="22"/>
-                <w:lang w:val="en-US" w:eastAsia="en-US" w:bidi="ar-SA"/>
-              </w:rPr>
-            </w:pPr>
-            <w:r>
-              <w:rPr>
-                <w:rFonts w:eastAsia="ＭＳ 明朝" w:cs=""/>
-                <w:kern w:val="0"/>
-                <w:sz w:val="20"/>
-                <w:szCs w:val="22"/>
-                <w:lang w:val="en-US" w:eastAsia="en-US" w:bidi="ar-SA"/>
-              </w:rPr>
-              <w:t>empty</w:t>
-            </w:r>
-          </w:p>
-        </w:tc>
-        <w:tc>
-          <w:tcPr>
-            <w:tcW w:w="3120" w:type="dxa"/>
-            <w:tcBorders/>
-          </w:tcPr>
-          <w:p>
-            <w:pPr>
-              <w:pStyle w:val="Normal"/>
-              <w:widowControl/>
-              <w:spacing w:lineRule="auto" w:line="240" w:before="0" w:after="40"/>
-              <w:jc w:val="left"/>
-              <w:rPr>
-                <w:rFonts w:eastAsia="ＭＳ 明朝" w:cs=""/>
-                <w:kern w:val="0"/>
-                <w:szCs w:val="22"/>
-                <w:lang w:val="en-US" w:eastAsia="en-US" w:bidi="ar-SA"/>
-              </w:rPr>
-            </w:pPr>
-            <w:r>
-              <w:rPr>
-                <w:rFonts w:eastAsia="ＭＳ 明朝" w:cs=""/>
-                <w:kern w:val="0"/>
-                <w:sz w:val="20"/>
-                <w:szCs w:val="22"/>
-                <w:lang w:val="en-US" w:eastAsia="en-US" w:bidi="ar-SA"/>
-              </w:rPr>
-              <w:t>Public address advertised for FTP data connections (required for FTP)</w:t>
-            </w:r>
-          </w:p>
-        </w:tc>
-      </w:tr>
-      <w:tr>
-        <w:trPr/>
-        <w:tc>
-          <w:tcPr>
-            <w:tcW w:w="3120" w:type="dxa"/>
-            <w:tcBorders/>
-          </w:tcPr>
-          <w:p>
-            <w:pPr>
-              <w:pStyle w:val="Normal"/>
-              <w:widowControl/>
-              <w:spacing w:lineRule="auto" w:line="240" w:before="0" w:after="40"/>
-              <w:jc w:val="left"/>
-              <w:rPr>
-                <w:rFonts w:eastAsia="ＭＳ 明朝" w:cs=""/>
-                <w:kern w:val="0"/>
-                <w:szCs w:val="22"/>
-                <w:lang w:val="en-US" w:eastAsia="en-US" w:bidi="ar-SA"/>
-              </w:rPr>
-            </w:pPr>
-            <w:r>
-              <w:rPr>
-                <w:rFonts w:eastAsia="ＭＳ 明朝" w:cs=""/>
-                <w:kern w:val="0"/>
-                <w:sz w:val="20"/>
-                <w:szCs w:val="22"/>
-                <w:lang w:val="en-US" w:eastAsia="en-US" w:bidi="ar-SA"/>
-              </w:rPr>
-              <w:t>WEBDAV_PORT</w:t>
-            </w:r>
-          </w:p>
-        </w:tc>
-        <w:tc>
-          <w:tcPr>
-            <w:tcW w:w="3120" w:type="dxa"/>
-            <w:tcBorders/>
-          </w:tcPr>
-          <w:p>
-            <w:pPr>
-              <w:pStyle w:val="Normal"/>
-              <w:widowControl/>
-              <w:spacing w:lineRule="auto" w:line="240" w:before="0" w:after="40"/>
-              <w:jc w:val="left"/>
-              <w:rPr>
-                <w:rFonts w:eastAsia="ＭＳ 明朝" w:cs=""/>
-                <w:kern w:val="0"/>
-                <w:szCs w:val="22"/>
-                <w:lang w:val="en-US" w:eastAsia="en-US" w:bidi="ar-SA"/>
-              </w:rPr>
-            </w:pPr>
-            <w:r>
-              <w:rPr>
-                <w:rFonts w:eastAsia="ＭＳ 明朝" w:cs=""/>
-                <w:kern w:val="0"/>
-                <w:sz w:val="20"/>
-                <w:szCs w:val="22"/>
-                <w:lang w:val="en-US" w:eastAsia="en-US" w:bidi="ar-SA"/>
-              </w:rPr>
-              <w:t>0 (disabled)</w:t>
-            </w:r>
-          </w:p>
-        </w:tc>
-        <w:tc>
-          <w:tcPr>
-            <w:tcW w:w="3120" w:type="dxa"/>
-            <w:tcBorders/>
-          </w:tcPr>
-          <w:p>
-            <w:pPr>
-              <w:pStyle w:val="Normal"/>
-              <w:widowControl/>
-              <w:spacing w:lineRule="auto" w:line="240" w:before="0" w:after="40"/>
-              <w:jc w:val="left"/>
-              <w:rPr>
-                <w:rFonts w:eastAsia="ＭＳ 明朝" w:cs=""/>
-                <w:kern w:val="0"/>
-                <w:szCs w:val="22"/>
-                <w:lang w:val="en-US" w:eastAsia="en-US" w:bidi="ar-SA"/>
-              </w:rPr>
-            </w:pPr>
-            <w:r>
-              <w:rPr>
-                <w:rFonts w:eastAsia="ＭＳ 明朝" w:cs=""/>
-                <w:kern w:val="0"/>
-                <w:sz w:val="20"/>
-                <w:szCs w:val="22"/>
-                <w:lang w:val="en-US" w:eastAsia="en-US" w:bidi="ar-SA"/>
-              </w:rPr>
-              <w:t>Set to 10080 to enable WebDAV</w:t>
-            </w:r>
-          </w:p>
-        </w:tc>
-      </w:tr>
-    </w:tbl>
-    <w:p>
-      <w:pPr>
-        <w:pStyle w:val="Normal"/>
-        <w:rPr/>
-      </w:pPr>
-      <w:r>
-        <w:rPr/>
-      </w:r>
-    </w:p>
-    <w:p>
-      <w:pPr>
-        <w:pStyle w:val="Normal"/>
-        <w:rPr/>
-      </w:pPr>
-      <w:r>
-        <w:rPr/>
-        <w:t>The .env file is excluded from git. .env.example is the committed template. The initial admin account is only created on first start; afterwards change the password in the web admin.</w:t>
-      </w:r>
-    </w:p>
-    <w:p>
-      <w:pPr>
-        <w:pStyle w:val="Heading2"/>
-        <w:rPr/>
-      </w:pPr>
       <w:bookmarkStart w:id="915" w:name="_Toc100015"/>
       <w:r>
         <w:rPr/>
-        <w:t>6.2 Gateway settings</w:t>
+        <w:t>6. Configuration</w:t>
       </w:r>
       <w:bookmarkEnd w:id="915"/>
     </w:p>
-    <w:tbl>
-      <w:tblPr>
-        <w:tblStyle w:val="TableGrid"/>
-        <w:tblW w:w="9360" w:type="dxa"/>
-        <w:jc w:val="left"/>
-        <w:tblInd w:w="0" w:type="dxa"/>
-        <w:tblLayout w:type="fixed"/>
-        <w:tblCellMar>
-          <w:top w:w="0" w:type="dxa"/>
-          <w:left w:w="108" w:type="dxa"/>
-          <w:bottom w:w="0" w:type="dxa"/>
-          <w:right w:w="108" w:type="dxa"/>
-        </w:tblCellMar>
-        <w:tblLook w:val="04a0" w:noHBand="0" w:noVBand="1" w:firstColumn="1" w:lastRow="0" w:lastColumn="0" w:firstRow="1"/>
-      </w:tblPr>
-      <w:tblGrid>
-        <w:gridCol w:w="3120"/>
-        <w:gridCol w:w="3120"/>
-        <w:gridCol w:w="3120"/>
-      </w:tblGrid>
-      <w:tr>
-        <w:trPr/>
-        <w:tc>
-          <w:tcPr>
-            <w:tcW w:w="3120" w:type="dxa"/>
-            <w:tcBorders/>
-            <w:shd w:color="auto" w:fill="DCE6F1" w:val="clear"/>
-          </w:tcPr>
-          <w:p>
-            <w:pPr>
-              <w:pStyle w:val="Normal"/>
-              <w:widowControl/>
-              <w:spacing w:lineRule="auto" w:line="240" w:before="0" w:after="40"/>
-              <w:jc w:val="left"/>
-              <w:rPr>
-                <w:rFonts w:eastAsia="ＭＳ 明朝" w:cs=""/>
-                <w:kern w:val="0"/>
-                <w:szCs w:val="22"/>
-                <w:lang w:val="en-US" w:eastAsia="en-US" w:bidi="ar-SA"/>
-              </w:rPr>
-            </w:pPr>
-            <w:r>
-              <w:rPr>
-                <w:rFonts w:eastAsia="ＭＳ 明朝" w:cs=""/>
-                <w:b/>
-                <w:kern w:val="0"/>
-                <w:sz w:val="20"/>
-                <w:szCs w:val="22"/>
-                <w:lang w:val="en-US" w:eastAsia="en-US" w:bidi="ar-SA"/>
-              </w:rPr>
-              <w:t>Variable</w:t>
-            </w:r>
-          </w:p>
-        </w:tc>
-        <w:tc>
-          <w:tcPr>
-            <w:tcW w:w="3120" w:type="dxa"/>
-            <w:tcBorders/>
-            <w:shd w:color="auto" w:fill="DCE6F1" w:val="clear"/>
-          </w:tcPr>
-          <w:p>
-            <w:pPr>
-              <w:pStyle w:val="Normal"/>
-              <w:widowControl/>
-              <w:spacing w:lineRule="auto" w:line="240" w:before="0" w:after="40"/>
-              <w:jc w:val="left"/>
-              <w:rPr>
-                <w:rFonts w:eastAsia="ＭＳ 明朝" w:cs=""/>
-                <w:kern w:val="0"/>
-                <w:szCs w:val="22"/>
-                <w:lang w:val="en-US" w:eastAsia="en-US" w:bidi="ar-SA"/>
-              </w:rPr>
-            </w:pPr>
-            <w:r>
-              <w:rPr>
-                <w:rFonts w:eastAsia="ＭＳ 明朝" w:cs=""/>
-                <w:b/>
-                <w:kern w:val="0"/>
-                <w:sz w:val="20"/>
-                <w:szCs w:val="22"/>
-                <w:lang w:val="en-US" w:eastAsia="en-US" w:bidi="ar-SA"/>
-              </w:rPr>
-              <w:t>Default</w:t>
-            </w:r>
-          </w:p>
-        </w:tc>
-        <w:tc>
-          <w:tcPr>
-            <w:tcW w:w="3120" w:type="dxa"/>
-            <w:tcBorders/>
-            <w:shd w:color="auto" w:fill="DCE6F1" w:val="clear"/>
-          </w:tcPr>
-          <w:p>
-            <w:pPr>
-              <w:pStyle w:val="Normal"/>
-              <w:widowControl/>
-              <w:spacing w:lineRule="auto" w:line="240" w:before="0" w:after="40"/>
-              <w:jc w:val="left"/>
-              <w:rPr>
-                <w:rFonts w:eastAsia="ＭＳ 明朝" w:cs=""/>
-                <w:kern w:val="0"/>
-                <w:szCs w:val="22"/>
-                <w:lang w:val="en-US" w:eastAsia="en-US" w:bidi="ar-SA"/>
-              </w:rPr>
-            </w:pPr>
-            <w:r>
-              <w:rPr>
-                <w:rFonts w:eastAsia="ＭＳ 明朝" w:cs=""/>
-                <w:b/>
-                <w:kern w:val="0"/>
-                <w:sz w:val="20"/>
-                <w:szCs w:val="22"/>
-                <w:lang w:val="en-US" w:eastAsia="en-US" w:bidi="ar-SA"/>
-              </w:rPr>
-              <w:t>Meaning</w:t>
-            </w:r>
-          </w:p>
-        </w:tc>
-      </w:tr>
-      <w:tr>
-        <w:trPr/>
-        <w:tc>
-          <w:tcPr>
-            <w:tcW w:w="3120" w:type="dxa"/>
-            <w:tcBorders/>
-          </w:tcPr>
-          <w:p>
-            <w:pPr>
-              <w:pStyle w:val="Normal"/>
-              <w:widowControl/>
-              <w:spacing w:lineRule="auto" w:line="240" w:before="0" w:after="40"/>
-              <w:jc w:val="left"/>
-              <w:rPr>
-                <w:rFonts w:eastAsia="ＭＳ 明朝" w:cs=""/>
-                <w:kern w:val="0"/>
-                <w:szCs w:val="22"/>
-                <w:lang w:val="en-US" w:eastAsia="en-US" w:bidi="ar-SA"/>
-              </w:rPr>
-            </w:pPr>
-            <w:r>
-              <w:rPr>
-                <w:rFonts w:eastAsia="ＭＳ 明朝" w:cs=""/>
-                <w:kern w:val="0"/>
-                <w:sz w:val="20"/>
-                <w:szCs w:val="22"/>
-                <w:lang w:val="en-US" w:eastAsia="en-US" w:bidi="ar-SA"/>
-              </w:rPr>
-              <w:t>PROXY_HTTP_LISTEN</w:t>
-            </w:r>
-          </w:p>
-        </w:tc>
-        <w:tc>
-          <w:tcPr>
-            <w:tcW w:w="3120" w:type="dxa"/>
-            <w:tcBorders/>
-          </w:tcPr>
-          <w:p>
-            <w:pPr>
-              <w:pStyle w:val="Normal"/>
-              <w:widowControl/>
-              <w:spacing w:lineRule="auto" w:line="240" w:before="0" w:after="40"/>
-              <w:jc w:val="left"/>
-              <w:rPr>
-                <w:rFonts w:eastAsia="ＭＳ 明朝" w:cs=""/>
-                <w:kern w:val="0"/>
-                <w:szCs w:val="22"/>
-                <w:lang w:val="en-US" w:eastAsia="en-US" w:bidi="ar-SA"/>
-              </w:rPr>
-            </w:pPr>
-            <w:r>
-              <w:rPr>
-                <w:rFonts w:eastAsia="ＭＳ 明朝" w:cs=""/>
-                <w:kern w:val="0"/>
-                <w:sz w:val="20"/>
-                <w:szCs w:val="22"/>
-                <w:lang w:val="en-US" w:eastAsia="en-US" w:bidi="ar-SA"/>
-              </w:rPr>
-              <w:t>:8000</w:t>
-            </w:r>
-          </w:p>
-        </w:tc>
-        <w:tc>
-          <w:tcPr>
-            <w:tcW w:w="3120" w:type="dxa"/>
-            <w:tcBorders/>
-          </w:tcPr>
-          <w:p>
-            <w:pPr>
-              <w:pStyle w:val="Normal"/>
-              <w:widowControl/>
-              <w:spacing w:lineRule="auto" w:line="240" w:before="0" w:after="40"/>
-              <w:jc w:val="left"/>
-              <w:rPr>
-                <w:rFonts w:eastAsia="ＭＳ 明朝" w:cs=""/>
-                <w:kern w:val="0"/>
-                <w:szCs w:val="22"/>
-                <w:lang w:val="en-US" w:eastAsia="en-US" w:bidi="ar-SA"/>
-              </w:rPr>
-            </w:pPr>
-            <w:r>
-              <w:rPr>
-                <w:rFonts w:eastAsia="ＭＳ 明朝" w:cs=""/>
-                <w:kern w:val="0"/>
-                <w:sz w:val="20"/>
-                <w:szCs w:val="22"/>
-                <w:lang w:val="en-US" w:eastAsia="en-US" w:bidi="ar-SA"/>
-              </w:rPr>
-              <w:t>HTTP listen address</w:t>
-            </w:r>
-          </w:p>
-        </w:tc>
-      </w:tr>
-      <w:tr>
-        <w:trPr/>
-        <w:tc>
-          <w:tcPr>
-            <w:tcW w:w="3120" w:type="dxa"/>
-            <w:tcBorders/>
-          </w:tcPr>
-          <w:p>
-            <w:pPr>
-              <w:pStyle w:val="Normal"/>
-              <w:widowControl/>
-              <w:spacing w:lineRule="auto" w:line="240" w:before="0" w:after="40"/>
-              <w:jc w:val="left"/>
-              <w:rPr>
-                <w:rFonts w:eastAsia="ＭＳ 明朝" w:cs=""/>
-                <w:kern w:val="0"/>
-                <w:szCs w:val="22"/>
-                <w:lang w:val="en-US" w:eastAsia="en-US" w:bidi="ar-SA"/>
-              </w:rPr>
-            </w:pPr>
-            <w:r>
-              <w:rPr>
-                <w:rFonts w:eastAsia="ＭＳ 明朝" w:cs=""/>
-                <w:kern w:val="0"/>
-                <w:sz w:val="20"/>
-                <w:szCs w:val="22"/>
-                <w:lang w:val="en-US" w:eastAsia="en-US" w:bidi="ar-SA"/>
-              </w:rPr>
-              <w:t>PROXY_SFTP_LISTEN</w:t>
-            </w:r>
-          </w:p>
-        </w:tc>
-        <w:tc>
-          <w:tcPr>
-            <w:tcW w:w="3120" w:type="dxa"/>
-            <w:tcBorders/>
-          </w:tcPr>
-          <w:p>
-            <w:pPr>
-              <w:pStyle w:val="Normal"/>
-              <w:widowControl/>
-              <w:spacing w:lineRule="auto" w:line="240" w:before="0" w:after="40"/>
-              <w:jc w:val="left"/>
-              <w:rPr>
-                <w:rFonts w:eastAsia="ＭＳ 明朝" w:cs=""/>
-                <w:kern w:val="0"/>
-                <w:szCs w:val="22"/>
-                <w:lang w:val="en-US" w:eastAsia="en-US" w:bidi="ar-SA"/>
-              </w:rPr>
-            </w:pPr>
-            <w:r>
-              <w:rPr>
-                <w:rFonts w:eastAsia="ＭＳ 明朝" w:cs=""/>
-                <w:kern w:val="0"/>
-                <w:sz w:val="20"/>
-                <w:szCs w:val="22"/>
-                <w:lang w:val="en-US" w:eastAsia="en-US" w:bidi="ar-SA"/>
-              </w:rPr>
-              <w:t>:2222</w:t>
-            </w:r>
-          </w:p>
-        </w:tc>
-        <w:tc>
-          <w:tcPr>
-            <w:tcW w:w="3120" w:type="dxa"/>
-            <w:tcBorders/>
-          </w:tcPr>
-          <w:p>
-            <w:pPr>
-              <w:pStyle w:val="Normal"/>
-              <w:widowControl/>
-              <w:spacing w:lineRule="auto" w:line="240" w:before="0" w:after="40"/>
-              <w:jc w:val="left"/>
-              <w:rPr>
-                <w:rFonts w:eastAsia="ＭＳ 明朝" w:cs=""/>
-                <w:kern w:val="0"/>
-                <w:szCs w:val="22"/>
-                <w:lang w:val="en-US" w:eastAsia="en-US" w:bidi="ar-SA"/>
-              </w:rPr>
-            </w:pPr>
-            <w:r>
-              <w:rPr>
-                <w:rFonts w:eastAsia="ＭＳ 明朝" w:cs=""/>
-                <w:kern w:val="0"/>
-                <w:sz w:val="20"/>
-                <w:szCs w:val="22"/>
-                <w:lang w:val="en-US" w:eastAsia="en-US" w:bidi="ar-SA"/>
-              </w:rPr>
-              <w:t>SFTP listen address</w:t>
-            </w:r>
-          </w:p>
-        </w:tc>
-      </w:tr>
-      <w:tr>
-        <w:trPr/>
-        <w:tc>
-          <w:tcPr>
-            <w:tcW w:w="3120" w:type="dxa"/>
-            <w:tcBorders/>
-          </w:tcPr>
-          <w:p>
-            <w:pPr>
-              <w:pStyle w:val="Normal"/>
-              <w:widowControl/>
-              <w:spacing w:lineRule="auto" w:line="240" w:before="0" w:after="40"/>
-              <w:jc w:val="left"/>
-              <w:rPr>
-                <w:rFonts w:eastAsia="ＭＳ 明朝" w:cs=""/>
-                <w:kern w:val="0"/>
-                <w:szCs w:val="22"/>
-                <w:lang w:val="en-US" w:eastAsia="en-US" w:bidi="ar-SA"/>
-              </w:rPr>
-            </w:pPr>
-            <w:r>
-              <w:rPr>
-                <w:rFonts w:eastAsia="ＭＳ 明朝" w:cs=""/>
-                <w:kern w:val="0"/>
-                <w:sz w:val="20"/>
-                <w:szCs w:val="22"/>
-                <w:lang w:val="en-US" w:eastAsia="en-US" w:bidi="ar-SA"/>
-              </w:rPr>
-              <w:t>UPSTREAM_HTTP</w:t>
-            </w:r>
-          </w:p>
-        </w:tc>
-        <w:tc>
-          <w:tcPr>
-            <w:tcW w:w="3120" w:type="dxa"/>
-            <w:tcBorders/>
-          </w:tcPr>
-          <w:p>
-            <w:pPr>
-              <w:pStyle w:val="Normal"/>
-              <w:widowControl/>
-              <w:spacing w:lineRule="auto" w:line="240" w:before="0" w:after="40"/>
-              <w:jc w:val="left"/>
-              <w:rPr>
-                <w:rFonts w:eastAsia="ＭＳ 明朝" w:cs=""/>
-                <w:kern w:val="0"/>
-                <w:szCs w:val="22"/>
-                <w:lang w:val="en-US" w:eastAsia="en-US" w:bidi="ar-SA"/>
-              </w:rPr>
-            </w:pPr>
-            <w:r>
-              <w:rPr>
-                <w:rFonts w:eastAsia="ＭＳ 明朝" w:cs=""/>
-                <w:kern w:val="0"/>
-                <w:sz w:val="20"/>
-                <w:szCs w:val="22"/>
-                <w:lang w:val="en-US" w:eastAsia="en-US" w:bidi="ar-SA"/>
-              </w:rPr>
-              <w:t>http://sftpgo:8080</w:t>
-            </w:r>
-          </w:p>
-        </w:tc>
-        <w:tc>
-          <w:tcPr>
-            <w:tcW w:w="3120" w:type="dxa"/>
-            <w:tcBorders/>
-          </w:tcPr>
-          <w:p>
-            <w:pPr>
-              <w:pStyle w:val="Normal"/>
-              <w:widowControl/>
-              <w:spacing w:lineRule="auto" w:line="240" w:before="0" w:after="40"/>
-              <w:jc w:val="left"/>
-              <w:rPr>
-                <w:rFonts w:eastAsia="ＭＳ 明朝" w:cs=""/>
-                <w:kern w:val="0"/>
-                <w:szCs w:val="22"/>
-                <w:lang w:val="en-US" w:eastAsia="en-US" w:bidi="ar-SA"/>
-              </w:rPr>
-            </w:pPr>
-            <w:r>
-              <w:rPr>
-                <w:rFonts w:eastAsia="ＭＳ 明朝" w:cs=""/>
-                <w:kern w:val="0"/>
-                <w:sz w:val="20"/>
-                <w:szCs w:val="22"/>
-                <w:lang w:val="en-US" w:eastAsia="en-US" w:bidi="ar-SA"/>
-              </w:rPr>
-              <w:t>SFTPGo web/API endpoint</w:t>
-            </w:r>
-          </w:p>
-        </w:tc>
-      </w:tr>
-      <w:tr>
-        <w:trPr/>
-        <w:tc>
-          <w:tcPr>
-            <w:tcW w:w="3120" w:type="dxa"/>
-            <w:tcBorders/>
-          </w:tcPr>
-          <w:p>
-            <w:pPr>
-              <w:pStyle w:val="Normal"/>
-              <w:widowControl/>
-              <w:spacing w:lineRule="auto" w:line="240" w:before="0" w:after="40"/>
-              <w:jc w:val="left"/>
-              <w:rPr>
-                <w:rFonts w:eastAsia="ＭＳ 明朝" w:cs=""/>
-                <w:kern w:val="0"/>
-                <w:szCs w:val="22"/>
-                <w:lang w:val="en-US" w:eastAsia="en-US" w:bidi="ar-SA"/>
-              </w:rPr>
-            </w:pPr>
-            <w:r>
-              <w:rPr>
-                <w:rFonts w:eastAsia="ＭＳ 明朝" w:cs=""/>
-                <w:kern w:val="0"/>
-                <w:sz w:val="20"/>
-                <w:szCs w:val="22"/>
-                <w:lang w:val="en-US" w:eastAsia="en-US" w:bidi="ar-SA"/>
-              </w:rPr>
-              <w:t>UPSTREAM_SFTP</w:t>
-            </w:r>
-          </w:p>
-        </w:tc>
-        <w:tc>
-          <w:tcPr>
-            <w:tcW w:w="3120" w:type="dxa"/>
-            <w:tcBorders/>
-          </w:tcPr>
-          <w:p>
-            <w:pPr>
-              <w:pStyle w:val="Normal"/>
-              <w:widowControl/>
-              <w:spacing w:lineRule="auto" w:line="240" w:before="0" w:after="40"/>
-              <w:jc w:val="left"/>
-              <w:rPr>
-                <w:rFonts w:eastAsia="ＭＳ 明朝" w:cs=""/>
-                <w:kern w:val="0"/>
-                <w:szCs w:val="22"/>
-                <w:lang w:val="en-US" w:eastAsia="en-US" w:bidi="ar-SA"/>
-              </w:rPr>
-            </w:pPr>
-            <w:r>
-              <w:rPr>
-                <w:rFonts w:eastAsia="ＭＳ 明朝" w:cs=""/>
-                <w:kern w:val="0"/>
-                <w:sz w:val="20"/>
-                <w:szCs w:val="22"/>
-                <w:lang w:val="en-US" w:eastAsia="en-US" w:bidi="ar-SA"/>
-              </w:rPr>
-              <w:t>sftpgo:2022</w:t>
-            </w:r>
-          </w:p>
-        </w:tc>
-        <w:tc>
-          <w:tcPr>
-            <w:tcW w:w="3120" w:type="dxa"/>
-            <w:tcBorders/>
-          </w:tcPr>
-          <w:p>
-            <w:pPr>
-              <w:pStyle w:val="Normal"/>
-              <w:widowControl/>
-              <w:spacing w:lineRule="auto" w:line="240" w:before="0" w:after="40"/>
-              <w:jc w:val="left"/>
-              <w:rPr>
-                <w:rFonts w:eastAsia="ＭＳ 明朝" w:cs=""/>
-                <w:kern w:val="0"/>
-                <w:szCs w:val="22"/>
-                <w:lang w:val="en-US" w:eastAsia="en-US" w:bidi="ar-SA"/>
-              </w:rPr>
-            </w:pPr>
-            <w:r>
-              <w:rPr>
-                <w:rFonts w:eastAsia="ＭＳ 明朝" w:cs=""/>
-                <w:kern w:val="0"/>
-                <w:sz w:val="20"/>
-                <w:szCs w:val="22"/>
-                <w:lang w:val="en-US" w:eastAsia="en-US" w:bidi="ar-SA"/>
-              </w:rPr>
-              <w:t>SFTPGo SFTP endpoint</w:t>
-            </w:r>
-          </w:p>
-        </w:tc>
-      </w:tr>
-      <w:tr>
-        <w:trPr/>
-        <w:tc>
-          <w:tcPr>
-            <w:tcW w:w="3120" w:type="dxa"/>
-            <w:tcBorders/>
-          </w:tcPr>
-          <w:p>
-            <w:pPr>
-              <w:pStyle w:val="Normal"/>
-              <w:widowControl/>
-              <w:spacing w:lineRule="auto" w:line="240" w:before="0" w:after="40"/>
-              <w:jc w:val="left"/>
-              <w:rPr>
-                <w:rFonts w:eastAsia="ＭＳ 明朝" w:cs=""/>
-                <w:kern w:val="0"/>
-                <w:szCs w:val="22"/>
-                <w:lang w:val="en-US" w:eastAsia="en-US" w:bidi="ar-SA"/>
-              </w:rPr>
-            </w:pPr>
-            <w:r>
-              <w:rPr>
-                <w:rFonts w:eastAsia="ＭＳ 明朝" w:cs=""/>
-                <w:kern w:val="0"/>
-                <w:sz w:val="20"/>
-                <w:szCs w:val="22"/>
-                <w:lang w:val="en-US" w:eastAsia="en-US" w:bidi="ar-SA"/>
-              </w:rPr>
-              <w:t>PROXY_FTP_LISTEN</w:t>
-            </w:r>
-          </w:p>
-        </w:tc>
-        <w:tc>
-          <w:tcPr>
-            <w:tcW w:w="3120" w:type="dxa"/>
-            <w:tcBorders/>
-          </w:tcPr>
-          <w:p>
-            <w:pPr>
-              <w:pStyle w:val="Normal"/>
-              <w:widowControl/>
-              <w:spacing w:lineRule="auto" w:line="240" w:before="0" w:after="40"/>
-              <w:jc w:val="left"/>
-              <w:rPr>
-                <w:rFonts w:eastAsia="ＭＳ 明朝" w:cs=""/>
-                <w:kern w:val="0"/>
-                <w:szCs w:val="22"/>
-                <w:lang w:val="en-US" w:eastAsia="en-US" w:bidi="ar-SA"/>
-              </w:rPr>
-            </w:pPr>
-            <w:r>
-              <w:rPr>
-                <w:rFonts w:eastAsia="ＭＳ 明朝" w:cs=""/>
-                <w:kern w:val="0"/>
-                <w:sz w:val="20"/>
-                <w:szCs w:val="22"/>
-                <w:lang w:val="en-US" w:eastAsia="en-US" w:bidi="ar-SA"/>
-              </w:rPr>
-              <w:t>0 (disabled)</w:t>
-            </w:r>
-          </w:p>
-        </w:tc>
-        <w:tc>
-          <w:tcPr>
-            <w:tcW w:w="3120" w:type="dxa"/>
-            <w:tcBorders/>
-          </w:tcPr>
-          <w:p>
-            <w:pPr>
-              <w:pStyle w:val="Normal"/>
-              <w:widowControl/>
-              <w:spacing w:lineRule="auto" w:line="240" w:before="0" w:after="40"/>
-              <w:jc w:val="left"/>
-              <w:rPr>
-                <w:rFonts w:eastAsia="ＭＳ 明朝" w:cs=""/>
-                <w:kern w:val="0"/>
-                <w:szCs w:val="22"/>
-                <w:lang w:val="en-US" w:eastAsia="en-US" w:bidi="ar-SA"/>
-              </w:rPr>
-            </w:pPr>
-            <w:r>
-              <w:rPr>
-                <w:rFonts w:eastAsia="ＭＳ 明朝" w:cs=""/>
-                <w:kern w:val="0"/>
-                <w:sz w:val="20"/>
-                <w:szCs w:val="22"/>
-                <w:lang w:val="en-US" w:eastAsia="en-US" w:bidi="ar-SA"/>
-              </w:rPr>
-              <w:t>FTP listen port; 0 or empty disables</w:t>
-            </w:r>
-          </w:p>
-        </w:tc>
-      </w:tr>
-      <w:tr>
-        <w:trPr/>
-        <w:tc>
-          <w:tcPr>
-            <w:tcW w:w="3120" w:type="dxa"/>
-            <w:tcBorders/>
-          </w:tcPr>
-          <w:p>
-            <w:pPr>
-              <w:pStyle w:val="Normal"/>
-              <w:widowControl/>
-              <w:spacing w:lineRule="auto" w:line="240" w:before="0" w:after="40"/>
-              <w:jc w:val="left"/>
-              <w:rPr>
-                <w:rFonts w:eastAsia="ＭＳ 明朝" w:cs=""/>
-                <w:kern w:val="0"/>
-                <w:szCs w:val="22"/>
-                <w:lang w:val="en-US" w:eastAsia="en-US" w:bidi="ar-SA"/>
-              </w:rPr>
-            </w:pPr>
-            <w:r>
-              <w:rPr>
-                <w:rFonts w:eastAsia="ＭＳ 明朝" w:cs=""/>
-                <w:kern w:val="0"/>
-                <w:sz w:val="20"/>
-                <w:szCs w:val="22"/>
-                <w:lang w:val="en-US" w:eastAsia="en-US" w:bidi="ar-SA"/>
-              </w:rPr>
-              <w:t>UPSTREAM_FTP</w:t>
-            </w:r>
-          </w:p>
-        </w:tc>
-        <w:tc>
-          <w:tcPr>
-            <w:tcW w:w="3120" w:type="dxa"/>
-            <w:tcBorders/>
-          </w:tcPr>
-          <w:p>
-            <w:pPr>
-              <w:pStyle w:val="Normal"/>
-              <w:widowControl/>
-              <w:spacing w:lineRule="auto" w:line="240" w:before="0" w:after="40"/>
-              <w:jc w:val="left"/>
-              <w:rPr>
-                <w:rFonts w:eastAsia="ＭＳ 明朝" w:cs=""/>
-                <w:kern w:val="0"/>
-                <w:szCs w:val="22"/>
-                <w:lang w:val="en-US" w:eastAsia="en-US" w:bidi="ar-SA"/>
-              </w:rPr>
-            </w:pPr>
-            <w:r>
-              <w:rPr>
-                <w:rFonts w:eastAsia="ＭＳ 明朝" w:cs=""/>
-                <w:kern w:val="0"/>
-                <w:sz w:val="20"/>
-                <w:szCs w:val="22"/>
-                <w:lang w:val="en-US" w:eastAsia="en-US" w:bidi="ar-SA"/>
-              </w:rPr>
-              <w:t>sftpgo:2121</w:t>
-            </w:r>
-          </w:p>
-        </w:tc>
-        <w:tc>
-          <w:tcPr>
-            <w:tcW w:w="3120" w:type="dxa"/>
-            <w:tcBorders/>
-          </w:tcPr>
-          <w:p>
-            <w:pPr>
-              <w:pStyle w:val="Normal"/>
-              <w:widowControl/>
-              <w:spacing w:lineRule="auto" w:line="240" w:before="0" w:after="40"/>
-              <w:jc w:val="left"/>
-              <w:rPr>
-                <w:rFonts w:eastAsia="ＭＳ 明朝" w:cs=""/>
-                <w:kern w:val="0"/>
-                <w:szCs w:val="22"/>
-                <w:lang w:val="en-US" w:eastAsia="en-US" w:bidi="ar-SA"/>
-              </w:rPr>
-            </w:pPr>
-            <w:r>
-              <w:rPr>
-                <w:rFonts w:eastAsia="ＭＳ 明朝" w:cs=""/>
-                <w:kern w:val="0"/>
-                <w:sz w:val="20"/>
-                <w:szCs w:val="22"/>
-                <w:lang w:val="en-US" w:eastAsia="en-US" w:bidi="ar-SA"/>
-              </w:rPr>
-              <w:t>SFTPGo FTP endpoint</w:t>
-            </w:r>
-          </w:p>
-        </w:tc>
-      </w:tr>
-      <w:tr>
-        <w:trPr/>
-        <w:tc>
-          <w:tcPr>
-            <w:tcW w:w="3120" w:type="dxa"/>
-            <w:tcBorders/>
-          </w:tcPr>
-          <w:p>
-            <w:pPr>
-              <w:pStyle w:val="Normal"/>
-              <w:widowControl/>
-              <w:spacing w:lineRule="auto" w:line="240" w:before="0" w:after="40"/>
-              <w:jc w:val="left"/>
-              <w:rPr>
-                <w:rFonts w:eastAsia="ＭＳ 明朝" w:cs=""/>
-                <w:kern w:val="0"/>
-                <w:szCs w:val="22"/>
-                <w:lang w:val="en-US" w:eastAsia="en-US" w:bidi="ar-SA"/>
-              </w:rPr>
-            </w:pPr>
-            <w:r>
-              <w:rPr>
-                <w:rFonts w:eastAsia="ＭＳ 明朝" w:cs=""/>
-                <w:kern w:val="0"/>
-                <w:sz w:val="20"/>
-                <w:szCs w:val="22"/>
-                <w:lang w:val="en-US" w:eastAsia="en-US" w:bidi="ar-SA"/>
-              </w:rPr>
-              <w:t>PROXY_FTP_PASV_RANGE</w:t>
-            </w:r>
-          </w:p>
-        </w:tc>
-        <w:tc>
-          <w:tcPr>
-            <w:tcW w:w="3120" w:type="dxa"/>
-            <w:tcBorders/>
-          </w:tcPr>
-          <w:p>
-            <w:pPr>
-              <w:pStyle w:val="Normal"/>
-              <w:widowControl/>
-              <w:spacing w:lineRule="auto" w:line="240" w:before="0" w:after="40"/>
-              <w:jc w:val="left"/>
-              <w:rPr>
-                <w:rFonts w:eastAsia="ＭＳ 明朝" w:cs=""/>
-                <w:kern w:val="0"/>
-                <w:szCs w:val="22"/>
-                <w:lang w:val="en-US" w:eastAsia="en-US" w:bidi="ar-SA"/>
-              </w:rPr>
-            </w:pPr>
-            <w:r>
-              <w:rPr>
-                <w:rFonts w:eastAsia="ＭＳ 明朝" w:cs=""/>
-                <w:kern w:val="0"/>
-                <w:sz w:val="20"/>
-                <w:szCs w:val="22"/>
-                <w:lang w:val="en-US" w:eastAsia="en-US" w:bidi="ar-SA"/>
-              </w:rPr>
-              <w:t>50000-50009</w:t>
-            </w:r>
-          </w:p>
-        </w:tc>
-        <w:tc>
-          <w:tcPr>
-            <w:tcW w:w="3120" w:type="dxa"/>
-            <w:tcBorders/>
-          </w:tcPr>
-          <w:p>
-            <w:pPr>
-              <w:pStyle w:val="Normal"/>
-              <w:widowControl/>
-              <w:spacing w:lineRule="auto" w:line="240" w:before="0" w:after="40"/>
-              <w:jc w:val="left"/>
-              <w:rPr>
-                <w:rFonts w:eastAsia="ＭＳ 明朝" w:cs=""/>
-                <w:kern w:val="0"/>
-                <w:szCs w:val="22"/>
-                <w:lang w:val="en-US" w:eastAsia="en-US" w:bidi="ar-SA"/>
-              </w:rPr>
-            </w:pPr>
-            <w:r>
-              <w:rPr>
-                <w:rFonts w:eastAsia="ＭＳ 明朝" w:cs=""/>
-                <w:kern w:val="0"/>
-                <w:sz w:val="20"/>
-                <w:szCs w:val="22"/>
-                <w:lang w:val="en-US" w:eastAsia="en-US" w:bidi="ar-SA"/>
-              </w:rPr>
-              <w:t>Passive data ports relayed 1:1</w:t>
-            </w:r>
-          </w:p>
-        </w:tc>
-      </w:tr>
-      <w:tr>
-        <w:trPr/>
-        <w:tc>
-          <w:tcPr>
-            <w:tcW w:w="3120" w:type="dxa"/>
-            <w:tcBorders/>
-          </w:tcPr>
-          <w:p>
-            <w:pPr>
-              <w:pStyle w:val="Normal"/>
-              <w:widowControl/>
-              <w:spacing w:lineRule="auto" w:line="240" w:before="0" w:after="40"/>
-              <w:jc w:val="left"/>
-              <w:rPr>
-                <w:rFonts w:eastAsia="ＭＳ 明朝" w:cs=""/>
-                <w:kern w:val="0"/>
-                <w:szCs w:val="22"/>
-                <w:lang w:val="en-US" w:eastAsia="en-US" w:bidi="ar-SA"/>
-              </w:rPr>
-            </w:pPr>
-            <w:r>
-              <w:rPr>
-                <w:rFonts w:eastAsia="ＭＳ 明朝" w:cs=""/>
-                <w:kern w:val="0"/>
-                <w:sz w:val="20"/>
-                <w:szCs w:val="22"/>
-                <w:lang w:val="en-US" w:eastAsia="en-US" w:bidi="ar-SA"/>
-              </w:rPr>
-              <w:t>PROXY_WEBDAV_LISTEN</w:t>
-            </w:r>
-          </w:p>
-        </w:tc>
-        <w:tc>
-          <w:tcPr>
-            <w:tcW w:w="3120" w:type="dxa"/>
-            <w:tcBorders/>
-          </w:tcPr>
-          <w:p>
-            <w:pPr>
-              <w:pStyle w:val="Normal"/>
-              <w:widowControl/>
-              <w:spacing w:lineRule="auto" w:line="240" w:before="0" w:after="40"/>
-              <w:jc w:val="left"/>
-              <w:rPr>
-                <w:rFonts w:eastAsia="ＭＳ 明朝" w:cs=""/>
-                <w:kern w:val="0"/>
-                <w:szCs w:val="22"/>
-                <w:lang w:val="en-US" w:eastAsia="en-US" w:bidi="ar-SA"/>
-              </w:rPr>
-            </w:pPr>
-            <w:r>
-              <w:rPr>
-                <w:rFonts w:eastAsia="ＭＳ 明朝" w:cs=""/>
-                <w:kern w:val="0"/>
-                <w:sz w:val="20"/>
-                <w:szCs w:val="22"/>
-                <w:lang w:val="en-US" w:eastAsia="en-US" w:bidi="ar-SA"/>
-              </w:rPr>
-              <w:t>0 (disabled)</w:t>
-            </w:r>
-          </w:p>
-        </w:tc>
-        <w:tc>
-          <w:tcPr>
-            <w:tcW w:w="3120" w:type="dxa"/>
-            <w:tcBorders/>
-          </w:tcPr>
-          <w:p>
-            <w:pPr>
-              <w:pStyle w:val="Normal"/>
-              <w:widowControl/>
-              <w:spacing w:lineRule="auto" w:line="240" w:before="0" w:after="40"/>
-              <w:jc w:val="left"/>
-              <w:rPr>
-                <w:rFonts w:eastAsia="ＭＳ 明朝" w:cs=""/>
-                <w:kern w:val="0"/>
-                <w:szCs w:val="22"/>
-                <w:lang w:val="en-US" w:eastAsia="en-US" w:bidi="ar-SA"/>
-              </w:rPr>
-            </w:pPr>
-            <w:r>
-              <w:rPr>
-                <w:rFonts w:eastAsia="ＭＳ 明朝" w:cs=""/>
-                <w:kern w:val="0"/>
-                <w:sz w:val="20"/>
-                <w:szCs w:val="22"/>
-                <w:lang w:val="en-US" w:eastAsia="en-US" w:bidi="ar-SA"/>
-              </w:rPr>
-              <w:t>WebDAV listen port; 0 or empty disables</w:t>
-            </w:r>
-          </w:p>
-        </w:tc>
-      </w:tr>
-      <w:tr>
-        <w:trPr/>
-        <w:tc>
-          <w:tcPr>
-            <w:tcW w:w="3120" w:type="dxa"/>
-            <w:tcBorders/>
-          </w:tcPr>
-          <w:p>
-            <w:pPr>
-              <w:pStyle w:val="Normal"/>
-              <w:widowControl/>
-              <w:spacing w:lineRule="auto" w:line="240" w:before="0" w:after="40"/>
-              <w:jc w:val="left"/>
-              <w:rPr>
-                <w:rFonts w:eastAsia="ＭＳ 明朝" w:cs=""/>
-                <w:kern w:val="0"/>
-                <w:szCs w:val="22"/>
-                <w:lang w:val="en-US" w:eastAsia="en-US" w:bidi="ar-SA"/>
-              </w:rPr>
-            </w:pPr>
-            <w:r>
-              <w:rPr>
-                <w:rFonts w:eastAsia="ＭＳ 明朝" w:cs=""/>
-                <w:kern w:val="0"/>
-                <w:sz w:val="20"/>
-                <w:szCs w:val="22"/>
-                <w:lang w:val="en-US" w:eastAsia="en-US" w:bidi="ar-SA"/>
-              </w:rPr>
-              <w:t>UPSTREAM_WEBDAV</w:t>
-            </w:r>
-          </w:p>
-        </w:tc>
-        <w:tc>
-          <w:tcPr>
-            <w:tcW w:w="3120" w:type="dxa"/>
-            <w:tcBorders/>
-          </w:tcPr>
-          <w:p>
-            <w:pPr>
-              <w:pStyle w:val="Normal"/>
-              <w:widowControl/>
-              <w:spacing w:lineRule="auto" w:line="240" w:before="0" w:after="40"/>
-              <w:jc w:val="left"/>
-              <w:rPr>
-                <w:rFonts w:eastAsia="ＭＳ 明朝" w:cs=""/>
-                <w:kern w:val="0"/>
-                <w:szCs w:val="22"/>
-                <w:lang w:val="en-US" w:eastAsia="en-US" w:bidi="ar-SA"/>
-              </w:rPr>
-            </w:pPr>
-            <w:r>
-              <w:rPr>
-                <w:rFonts w:eastAsia="ＭＳ 明朝" w:cs=""/>
-                <w:kern w:val="0"/>
-                <w:sz w:val="20"/>
-                <w:szCs w:val="22"/>
-                <w:lang w:val="en-US" w:eastAsia="en-US" w:bidi="ar-SA"/>
-              </w:rPr>
-              <w:t>http://sftpgo:10080</w:t>
-            </w:r>
-          </w:p>
-        </w:tc>
-        <w:tc>
-          <w:tcPr>
-            <w:tcW w:w="3120" w:type="dxa"/>
-            <w:tcBorders/>
-          </w:tcPr>
-          <w:p>
-            <w:pPr>
-              <w:pStyle w:val="Normal"/>
-              <w:widowControl/>
-              <w:spacing w:lineRule="auto" w:line="240" w:before="0" w:after="40"/>
-              <w:jc w:val="left"/>
-              <w:rPr>
-                <w:rFonts w:eastAsia="ＭＳ 明朝" w:cs=""/>
-                <w:kern w:val="0"/>
-                <w:szCs w:val="22"/>
-                <w:lang w:val="en-US" w:eastAsia="en-US" w:bidi="ar-SA"/>
-              </w:rPr>
-            </w:pPr>
-            <w:r>
-              <w:rPr>
-                <w:rFonts w:eastAsia="ＭＳ 明朝" w:cs=""/>
-                <w:kern w:val="0"/>
-                <w:sz w:val="20"/>
-                <w:szCs w:val="22"/>
-                <w:lang w:val="en-US" w:eastAsia="en-US" w:bidi="ar-SA"/>
-              </w:rPr>
-              <w:t>SFTPGo WebDAV endpoint</w:t>
-            </w:r>
-          </w:p>
-        </w:tc>
-      </w:tr>
-    </w:tbl>
-    <w:p>
-      <w:pPr>
-        <w:pStyle w:val="Normal"/>
-        <w:rPr/>
-      </w:pPr>
-      <w:r>
-        <w:rPr/>
-      </w:r>
-    </w:p>
     <w:p>
       <w:pPr>
         <w:pStyle w:val="Heading2"/>
@@ -4470,7 +3087,7 @@
       <w:bookmarkStart w:id="916" w:name="_Toc100016"/>
       <w:r>
         <w:rPr/>
-        <w:t>6.3 Keycloak settings (optional)</w:t>
+        <w:t>6.1 Operator settings (.env)</w:t>
       </w:r>
       <w:bookmarkEnd w:id="916"/>
     </w:p>
@@ -4588,6 +3205,622 @@
                 <w:szCs w:val="22"/>
                 <w:lang w:val="en-US" w:eastAsia="en-US" w:bidi="ar-SA"/>
               </w:rPr>
+              <w:t>Purpose</w:t>
+            </w:r>
+          </w:p>
+        </w:tc>
+      </w:tr>
+      <w:tr>
+        <w:trPr/>
+        <w:tc>
+          <w:tcPr>
+            <w:tcW w:w="3120" w:type="dxa"/>
+            <w:tcBorders/>
+          </w:tcPr>
+          <w:p>
+            <w:pPr>
+              <w:pStyle w:val="Normal"/>
+              <w:widowControl/>
+              <w:spacing w:lineRule="auto" w:line="240" w:before="0" w:after="40"/>
+              <w:jc w:val="left"/>
+              <w:rPr>
+                <w:rFonts w:eastAsia="ＭＳ 明朝" w:cs=""/>
+                <w:kern w:val="0"/>
+                <w:szCs w:val="22"/>
+                <w:lang w:val="en-US" w:eastAsia="en-US" w:bidi="ar-SA"/>
+              </w:rPr>
+            </w:pPr>
+            <w:r>
+              <w:rPr>
+                <w:rFonts w:eastAsia="ＭＳ 明朝" w:cs=""/>
+                <w:kern w:val="0"/>
+                <w:sz w:val="20"/>
+                <w:szCs w:val="22"/>
+                <w:lang w:val="en-US" w:eastAsia="en-US" w:bidi="ar-SA"/>
+              </w:rPr>
+              <w:t>SFTPGO_ADMIN_PASSWORD</w:t>
+            </w:r>
+          </w:p>
+        </w:tc>
+        <w:tc>
+          <w:tcPr>
+            <w:tcW w:w="3120" w:type="dxa"/>
+            <w:tcBorders/>
+          </w:tcPr>
+          <w:p>
+            <w:pPr>
+              <w:pStyle w:val="Normal"/>
+              <w:widowControl/>
+              <w:spacing w:lineRule="auto" w:line="240" w:before="0" w:after="40"/>
+              <w:jc w:val="left"/>
+              <w:rPr>
+                <w:rFonts w:eastAsia="ＭＳ 明朝" w:cs=""/>
+                <w:kern w:val="0"/>
+                <w:szCs w:val="22"/>
+                <w:lang w:val="en-US" w:eastAsia="en-US" w:bidi="ar-SA"/>
+              </w:rPr>
+            </w:pPr>
+            <w:r>
+              <w:rPr>
+                <w:rFonts w:eastAsia="ＭＳ 明朝" w:cs=""/>
+                <w:kern w:val="0"/>
+                <w:sz w:val="20"/>
+                <w:szCs w:val="22"/>
+                <w:lang w:val="en-US" w:eastAsia="en-US" w:bidi="ar-SA"/>
+              </w:rPr>
+              <w:t>(required)</w:t>
+            </w:r>
+          </w:p>
+        </w:tc>
+        <w:tc>
+          <w:tcPr>
+            <w:tcW w:w="3120" w:type="dxa"/>
+            <w:tcBorders/>
+          </w:tcPr>
+          <w:p>
+            <w:pPr>
+              <w:pStyle w:val="Normal"/>
+              <w:widowControl/>
+              <w:spacing w:lineRule="auto" w:line="240" w:before="0" w:after="40"/>
+              <w:jc w:val="left"/>
+              <w:rPr>
+                <w:rFonts w:eastAsia="ＭＳ 明朝" w:cs=""/>
+                <w:kern w:val="0"/>
+                <w:szCs w:val="22"/>
+                <w:lang w:val="en-US" w:eastAsia="en-US" w:bidi="ar-SA"/>
+              </w:rPr>
+            </w:pPr>
+            <w:r>
+              <w:rPr>
+                <w:rFonts w:eastAsia="ＭＳ 明朝" w:cs=""/>
+                <w:kern w:val="0"/>
+                <w:sz w:val="20"/>
+                <w:szCs w:val="22"/>
+                <w:lang w:val="en-US" w:eastAsia="en-US" w:bidi="ar-SA"/>
+              </w:rPr>
+              <w:t>Password of the initial admin account</w:t>
+            </w:r>
+          </w:p>
+        </w:tc>
+      </w:tr>
+      <w:tr>
+        <w:trPr/>
+        <w:tc>
+          <w:tcPr>
+            <w:tcW w:w="3120" w:type="dxa"/>
+            <w:tcBorders/>
+          </w:tcPr>
+          <w:p>
+            <w:pPr>
+              <w:pStyle w:val="Normal"/>
+              <w:widowControl/>
+              <w:spacing w:lineRule="auto" w:line="240" w:before="0" w:after="40"/>
+              <w:jc w:val="left"/>
+              <w:rPr>
+                <w:rFonts w:eastAsia="ＭＳ 明朝" w:cs=""/>
+                <w:kern w:val="0"/>
+                <w:szCs w:val="22"/>
+                <w:lang w:val="en-US" w:eastAsia="en-US" w:bidi="ar-SA"/>
+              </w:rPr>
+            </w:pPr>
+            <w:r>
+              <w:rPr>
+                <w:rFonts w:eastAsia="ＭＳ 明朝" w:cs=""/>
+                <w:kern w:val="0"/>
+                <w:sz w:val="20"/>
+                <w:szCs w:val="22"/>
+                <w:lang w:val="en-US" w:eastAsia="en-US" w:bidi="ar-SA"/>
+              </w:rPr>
+              <w:t>SFTPGO_ADMIN_USER</w:t>
+            </w:r>
+          </w:p>
+        </w:tc>
+        <w:tc>
+          <w:tcPr>
+            <w:tcW w:w="3120" w:type="dxa"/>
+            <w:tcBorders/>
+          </w:tcPr>
+          <w:p>
+            <w:pPr>
+              <w:pStyle w:val="Normal"/>
+              <w:widowControl/>
+              <w:spacing w:lineRule="auto" w:line="240" w:before="0" w:after="40"/>
+              <w:jc w:val="left"/>
+              <w:rPr>
+                <w:rFonts w:eastAsia="ＭＳ 明朝" w:cs=""/>
+                <w:kern w:val="0"/>
+                <w:szCs w:val="22"/>
+                <w:lang w:val="en-US" w:eastAsia="en-US" w:bidi="ar-SA"/>
+              </w:rPr>
+            </w:pPr>
+            <w:r>
+              <w:rPr>
+                <w:rFonts w:eastAsia="ＭＳ 明朝" w:cs=""/>
+                <w:kern w:val="0"/>
+                <w:sz w:val="20"/>
+                <w:szCs w:val="22"/>
+                <w:lang w:val="en-US" w:eastAsia="en-US" w:bidi="ar-SA"/>
+              </w:rPr>
+              <w:t>admin</w:t>
+            </w:r>
+          </w:p>
+        </w:tc>
+        <w:tc>
+          <w:tcPr>
+            <w:tcW w:w="3120" w:type="dxa"/>
+            <w:tcBorders/>
+          </w:tcPr>
+          <w:p>
+            <w:pPr>
+              <w:pStyle w:val="Normal"/>
+              <w:widowControl/>
+              <w:spacing w:lineRule="auto" w:line="240" w:before="0" w:after="40"/>
+              <w:jc w:val="left"/>
+              <w:rPr>
+                <w:rFonts w:eastAsia="ＭＳ 明朝" w:cs=""/>
+                <w:kern w:val="0"/>
+                <w:szCs w:val="22"/>
+                <w:lang w:val="en-US" w:eastAsia="en-US" w:bidi="ar-SA"/>
+              </w:rPr>
+            </w:pPr>
+            <w:r>
+              <w:rPr>
+                <w:rFonts w:eastAsia="ＭＳ 明朝" w:cs=""/>
+                <w:kern w:val="0"/>
+                <w:sz w:val="20"/>
+                <w:szCs w:val="22"/>
+                <w:lang w:val="en-US" w:eastAsia="en-US" w:bidi="ar-SA"/>
+              </w:rPr>
+              <w:t>Username of the initial admin account</w:t>
+            </w:r>
+          </w:p>
+        </w:tc>
+      </w:tr>
+      <w:tr>
+        <w:trPr/>
+        <w:tc>
+          <w:tcPr>
+            <w:tcW w:w="3120" w:type="dxa"/>
+            <w:tcBorders/>
+          </w:tcPr>
+          <w:p>
+            <w:pPr>
+              <w:pStyle w:val="Normal"/>
+              <w:widowControl/>
+              <w:spacing w:lineRule="auto" w:line="240" w:before="0" w:after="40"/>
+              <w:jc w:val="left"/>
+              <w:rPr>
+                <w:rFonts w:eastAsia="ＭＳ 明朝" w:cs=""/>
+                <w:kern w:val="0"/>
+                <w:szCs w:val="22"/>
+                <w:lang w:val="en-US" w:eastAsia="en-US" w:bidi="ar-SA"/>
+              </w:rPr>
+            </w:pPr>
+            <w:r>
+              <w:rPr>
+                <w:rFonts w:eastAsia="ＭＳ 明朝" w:cs=""/>
+                <w:kern w:val="0"/>
+                <w:sz w:val="20"/>
+                <w:szCs w:val="22"/>
+                <w:lang w:val="en-US" w:eastAsia="en-US" w:bidi="ar-SA"/>
+              </w:rPr>
+              <w:t>FTP_PORT</w:t>
+            </w:r>
+          </w:p>
+        </w:tc>
+        <w:tc>
+          <w:tcPr>
+            <w:tcW w:w="3120" w:type="dxa"/>
+            <w:tcBorders/>
+          </w:tcPr>
+          <w:p>
+            <w:pPr>
+              <w:pStyle w:val="Normal"/>
+              <w:widowControl/>
+              <w:spacing w:lineRule="auto" w:line="240" w:before="0" w:after="40"/>
+              <w:jc w:val="left"/>
+              <w:rPr>
+                <w:rFonts w:eastAsia="ＭＳ 明朝" w:cs=""/>
+                <w:kern w:val="0"/>
+                <w:szCs w:val="22"/>
+                <w:lang w:val="en-US" w:eastAsia="en-US" w:bidi="ar-SA"/>
+              </w:rPr>
+            </w:pPr>
+            <w:r>
+              <w:rPr>
+                <w:rFonts w:eastAsia="ＭＳ 明朝" w:cs=""/>
+                <w:kern w:val="0"/>
+                <w:sz w:val="20"/>
+                <w:szCs w:val="22"/>
+                <w:lang w:val="en-US" w:eastAsia="en-US" w:bidi="ar-SA"/>
+              </w:rPr>
+              <w:t>0 (disabled)</w:t>
+            </w:r>
+          </w:p>
+        </w:tc>
+        <w:tc>
+          <w:tcPr>
+            <w:tcW w:w="3120" w:type="dxa"/>
+            <w:tcBorders/>
+          </w:tcPr>
+          <w:p>
+            <w:pPr>
+              <w:pStyle w:val="Normal"/>
+              <w:widowControl/>
+              <w:spacing w:lineRule="auto" w:line="240" w:before="0" w:after="40"/>
+              <w:jc w:val="left"/>
+              <w:rPr>
+                <w:rFonts w:eastAsia="ＭＳ 明朝" w:cs=""/>
+                <w:kern w:val="0"/>
+                <w:szCs w:val="22"/>
+                <w:lang w:val="en-US" w:eastAsia="en-US" w:bidi="ar-SA"/>
+              </w:rPr>
+            </w:pPr>
+            <w:r>
+              <w:rPr>
+                <w:rFonts w:eastAsia="ＭＳ 明朝" w:cs=""/>
+                <w:kern w:val="0"/>
+                <w:sz w:val="20"/>
+                <w:szCs w:val="22"/>
+                <w:lang w:val="en-US" w:eastAsia="en-US" w:bidi="ar-SA"/>
+              </w:rPr>
+              <w:t>Set to 2121 to enable FTP</w:t>
+            </w:r>
+          </w:p>
+        </w:tc>
+      </w:tr>
+      <w:tr>
+        <w:trPr/>
+        <w:tc>
+          <w:tcPr>
+            <w:tcW w:w="3120" w:type="dxa"/>
+            <w:tcBorders/>
+          </w:tcPr>
+          <w:p>
+            <w:pPr>
+              <w:pStyle w:val="Normal"/>
+              <w:widowControl/>
+              <w:spacing w:lineRule="auto" w:line="240" w:before="0" w:after="40"/>
+              <w:jc w:val="left"/>
+              <w:rPr>
+                <w:rFonts w:eastAsia="ＭＳ 明朝" w:cs=""/>
+                <w:kern w:val="0"/>
+                <w:szCs w:val="22"/>
+                <w:lang w:val="en-US" w:eastAsia="en-US" w:bidi="ar-SA"/>
+              </w:rPr>
+            </w:pPr>
+            <w:r>
+              <w:rPr>
+                <w:rFonts w:eastAsia="ＭＳ 明朝" w:cs=""/>
+                <w:kern w:val="0"/>
+                <w:sz w:val="20"/>
+                <w:szCs w:val="22"/>
+                <w:lang w:val="en-US" w:eastAsia="en-US" w:bidi="ar-SA"/>
+              </w:rPr>
+              <w:t>FTP_PASSIVE_IP</w:t>
+            </w:r>
+          </w:p>
+        </w:tc>
+        <w:tc>
+          <w:tcPr>
+            <w:tcW w:w="3120" w:type="dxa"/>
+            <w:tcBorders/>
+          </w:tcPr>
+          <w:p>
+            <w:pPr>
+              <w:pStyle w:val="Normal"/>
+              <w:widowControl/>
+              <w:spacing w:lineRule="auto" w:line="240" w:before="0" w:after="40"/>
+              <w:jc w:val="left"/>
+              <w:rPr>
+                <w:rFonts w:eastAsia="ＭＳ 明朝" w:cs=""/>
+                <w:kern w:val="0"/>
+                <w:szCs w:val="22"/>
+                <w:lang w:val="en-US" w:eastAsia="en-US" w:bidi="ar-SA"/>
+              </w:rPr>
+            </w:pPr>
+            <w:r>
+              <w:rPr>
+                <w:rFonts w:eastAsia="ＭＳ 明朝" w:cs=""/>
+                <w:kern w:val="0"/>
+                <w:sz w:val="20"/>
+                <w:szCs w:val="22"/>
+                <w:lang w:val="en-US" w:eastAsia="en-US" w:bidi="ar-SA"/>
+              </w:rPr>
+              <w:t>empty</w:t>
+            </w:r>
+          </w:p>
+        </w:tc>
+        <w:tc>
+          <w:tcPr>
+            <w:tcW w:w="3120" w:type="dxa"/>
+            <w:tcBorders/>
+          </w:tcPr>
+          <w:p>
+            <w:pPr>
+              <w:pStyle w:val="Normal"/>
+              <w:widowControl/>
+              <w:spacing w:lineRule="auto" w:line="240" w:before="0" w:after="40"/>
+              <w:jc w:val="left"/>
+              <w:rPr>
+                <w:rFonts w:eastAsia="ＭＳ 明朝" w:cs=""/>
+                <w:kern w:val="0"/>
+                <w:szCs w:val="22"/>
+                <w:lang w:val="en-US" w:eastAsia="en-US" w:bidi="ar-SA"/>
+              </w:rPr>
+            </w:pPr>
+            <w:r>
+              <w:rPr>
+                <w:rFonts w:eastAsia="ＭＳ 明朝" w:cs=""/>
+                <w:kern w:val="0"/>
+                <w:sz w:val="20"/>
+                <w:szCs w:val="22"/>
+                <w:lang w:val="en-US" w:eastAsia="en-US" w:bidi="ar-SA"/>
+              </w:rPr>
+              <w:t>Public address advertised for FTP data connections (required for FTP)</w:t>
+            </w:r>
+          </w:p>
+        </w:tc>
+      </w:tr>
+      <w:tr>
+        <w:trPr/>
+        <w:tc>
+          <w:tcPr>
+            <w:tcW w:w="3120" w:type="dxa"/>
+            <w:tcBorders/>
+          </w:tcPr>
+          <w:p>
+            <w:pPr>
+              <w:pStyle w:val="Normal"/>
+              <w:widowControl/>
+              <w:spacing w:lineRule="auto" w:line="240" w:before="0" w:after="40"/>
+              <w:jc w:val="left"/>
+              <w:rPr>
+                <w:rFonts w:eastAsia="ＭＳ 明朝" w:cs=""/>
+                <w:kern w:val="0"/>
+                <w:szCs w:val="22"/>
+                <w:lang w:val="en-US" w:eastAsia="en-US" w:bidi="ar-SA"/>
+              </w:rPr>
+            </w:pPr>
+            <w:r>
+              <w:rPr>
+                <w:rFonts w:eastAsia="ＭＳ 明朝" w:cs=""/>
+                <w:kern w:val="0"/>
+                <w:sz w:val="20"/>
+                <w:szCs w:val="22"/>
+                <w:lang w:val="en-US" w:eastAsia="en-US" w:bidi="ar-SA"/>
+              </w:rPr>
+              <w:t>WEBDAV_PORT</w:t>
+            </w:r>
+          </w:p>
+        </w:tc>
+        <w:tc>
+          <w:tcPr>
+            <w:tcW w:w="3120" w:type="dxa"/>
+            <w:tcBorders/>
+          </w:tcPr>
+          <w:p>
+            <w:pPr>
+              <w:pStyle w:val="Normal"/>
+              <w:widowControl/>
+              <w:spacing w:lineRule="auto" w:line="240" w:before="0" w:after="40"/>
+              <w:jc w:val="left"/>
+              <w:rPr>
+                <w:rFonts w:eastAsia="ＭＳ 明朝" w:cs=""/>
+                <w:kern w:val="0"/>
+                <w:szCs w:val="22"/>
+                <w:lang w:val="en-US" w:eastAsia="en-US" w:bidi="ar-SA"/>
+              </w:rPr>
+            </w:pPr>
+            <w:r>
+              <w:rPr>
+                <w:rFonts w:eastAsia="ＭＳ 明朝" w:cs=""/>
+                <w:kern w:val="0"/>
+                <w:sz w:val="20"/>
+                <w:szCs w:val="22"/>
+                <w:lang w:val="en-US" w:eastAsia="en-US" w:bidi="ar-SA"/>
+              </w:rPr>
+              <w:t>0 (disabled)</w:t>
+            </w:r>
+          </w:p>
+        </w:tc>
+        <w:tc>
+          <w:tcPr>
+            <w:tcW w:w="3120" w:type="dxa"/>
+            <w:tcBorders/>
+          </w:tcPr>
+          <w:p>
+            <w:pPr>
+              <w:pStyle w:val="Normal"/>
+              <w:widowControl/>
+              <w:spacing w:lineRule="auto" w:line="240" w:before="0" w:after="40"/>
+              <w:jc w:val="left"/>
+              <w:rPr>
+                <w:rFonts w:eastAsia="ＭＳ 明朝" w:cs=""/>
+                <w:kern w:val="0"/>
+                <w:szCs w:val="22"/>
+                <w:lang w:val="en-US" w:eastAsia="en-US" w:bidi="ar-SA"/>
+              </w:rPr>
+            </w:pPr>
+            <w:r>
+              <w:rPr>
+                <w:rFonts w:eastAsia="ＭＳ 明朝" w:cs=""/>
+                <w:kern w:val="0"/>
+                <w:sz w:val="20"/>
+                <w:szCs w:val="22"/>
+                <w:lang w:val="en-US" w:eastAsia="en-US" w:bidi="ar-SA"/>
+              </w:rPr>
+              <w:t>Set to 10080 to enable WebDAV</w:t>
+            </w:r>
+          </w:p>
+        </w:tc>
+      </w:tr>
+    </w:tbl>
+    <w:p>
+      <w:pPr>
+        <w:pStyle w:val="Normal"/>
+        <w:rPr/>
+      </w:pPr>
+      <w:r>
+        <w:rPr/>
+      </w:r>
+    </w:p>
+    <w:p>
+      <w:pPr>
+        <w:pStyle w:val="Normal"/>
+        <w:rPr/>
+      </w:pPr>
+      <w:r>
+        <w:rPr/>
+        <w:t>The .env file is excluded from git. .env.example is the committed template. The initial admin account is only created on first start; afterwards change the password in the web admin.</w:t>
+      </w:r>
+    </w:p>
+    <w:p>
+      <w:pPr>
+        <w:pStyle w:val="Heading2"/>
+        <w:rPr/>
+      </w:pPr>
+      <w:bookmarkStart w:id="917" w:name="_Toc100017"/>
+      <w:r>
+        <w:rPr/>
+        <w:t>6.2 Gateway settings</w:t>
+      </w:r>
+      <w:bookmarkEnd w:id="917"/>
+    </w:p>
+    <w:tbl>
+      <w:tblPr>
+        <w:tblStyle w:val="TableGrid"/>
+        <w:tblW w:w="9360" w:type="dxa"/>
+        <w:jc w:val="left"/>
+        <w:tblInd w:w="0" w:type="dxa"/>
+        <w:tblLayout w:type="fixed"/>
+        <w:tblCellMar>
+          <w:top w:w="0" w:type="dxa"/>
+          <w:left w:w="108" w:type="dxa"/>
+          <w:bottom w:w="0" w:type="dxa"/>
+          <w:right w:w="108" w:type="dxa"/>
+        </w:tblCellMar>
+        <w:tblLook w:val="04a0" w:noHBand="0" w:noVBand="1" w:firstColumn="1" w:lastRow="0" w:lastColumn="0" w:firstRow="1"/>
+      </w:tblPr>
+      <w:tblGrid>
+        <w:gridCol w:w="3120"/>
+        <w:gridCol w:w="3120"/>
+        <w:gridCol w:w="3120"/>
+      </w:tblGrid>
+      <w:tr>
+        <w:trPr/>
+        <w:tc>
+          <w:tcPr>
+            <w:tcW w:w="3120" w:type="dxa"/>
+            <w:tcBorders/>
+            <w:shd w:color="auto" w:fill="DCE6F1" w:val="clear"/>
+          </w:tcPr>
+          <w:p>
+            <w:pPr>
+              <w:pStyle w:val="Normal"/>
+              <w:widowControl/>
+              <w:spacing w:lineRule="auto" w:line="240" w:before="0" w:after="40"/>
+              <w:jc w:val="left"/>
+              <w:rPr>
+                <w:rFonts w:eastAsia="ＭＳ 明朝" w:cs=""/>
+                <w:kern w:val="0"/>
+                <w:szCs w:val="22"/>
+                <w:lang w:val="en-US" w:eastAsia="en-US" w:bidi="ar-SA"/>
+              </w:rPr>
+            </w:pPr>
+            <w:r>
+              <w:rPr>
+                <w:rFonts w:eastAsia="ＭＳ 明朝" w:cs=""/>
+                <w:b/>
+                <w:kern w:val="0"/>
+                <w:sz w:val="20"/>
+                <w:szCs w:val="22"/>
+                <w:lang w:val="en-US" w:eastAsia="en-US" w:bidi="ar-SA"/>
+              </w:rPr>
+              <w:t>Variable</w:t>
+            </w:r>
+          </w:p>
+        </w:tc>
+        <w:tc>
+          <w:tcPr>
+            <w:tcW w:w="3120" w:type="dxa"/>
+            <w:tcBorders/>
+            <w:shd w:color="auto" w:fill="DCE6F1" w:val="clear"/>
+          </w:tcPr>
+          <w:p>
+            <w:pPr>
+              <w:pStyle w:val="Normal"/>
+              <w:widowControl/>
+              <w:spacing w:lineRule="auto" w:line="240" w:before="0" w:after="40"/>
+              <w:jc w:val="left"/>
+              <w:rPr>
+                <w:rFonts w:eastAsia="ＭＳ 明朝" w:cs=""/>
+                <w:kern w:val="0"/>
+                <w:szCs w:val="22"/>
+                <w:lang w:val="en-US" w:eastAsia="en-US" w:bidi="ar-SA"/>
+              </w:rPr>
+            </w:pPr>
+            <w:r>
+              <w:rPr>
+                <w:rFonts w:eastAsia="ＭＳ 明朝" w:cs=""/>
+                <w:b/>
+                <w:kern w:val="0"/>
+                <w:sz w:val="20"/>
+                <w:szCs w:val="22"/>
+                <w:lang w:val="en-US" w:eastAsia="en-US" w:bidi="ar-SA"/>
+              </w:rPr>
+              <w:t>Default</w:t>
+            </w:r>
+          </w:p>
+        </w:tc>
+        <w:tc>
+          <w:tcPr>
+            <w:tcW w:w="3120" w:type="dxa"/>
+            <w:tcBorders/>
+            <w:shd w:color="auto" w:fill="DCE6F1" w:val="clear"/>
+          </w:tcPr>
+          <w:p>
+            <w:pPr>
+              <w:pStyle w:val="Normal"/>
+              <w:widowControl/>
+              <w:spacing w:lineRule="auto" w:line="240" w:before="0" w:after="40"/>
+              <w:jc w:val="left"/>
+              <w:rPr>
+                <w:rFonts w:eastAsia="ＭＳ 明朝" w:cs=""/>
+                <w:kern w:val="0"/>
+                <w:szCs w:val="22"/>
+                <w:lang w:val="en-US" w:eastAsia="en-US" w:bidi="ar-SA"/>
+              </w:rPr>
+            </w:pPr>
+            <w:r>
+              <w:rPr>
+                <w:rFonts w:eastAsia="ＭＳ 明朝" w:cs=""/>
+                <w:b/>
+                <w:kern w:val="0"/>
+                <w:sz w:val="20"/>
+                <w:szCs w:val="22"/>
+                <w:lang w:val="en-US" w:eastAsia="en-US" w:bidi="ar-SA"/>
+              </w:rPr>
               <w:t>Meaning</w:t>
             </w:r>
           </w:p>
@@ -4621,6 +3854,1077 @@
                 <w:szCs w:val="22"/>
                 <w:lang w:val="en-US" w:eastAsia="en-US" w:bidi="ar-SA"/>
               </w:rPr>
+              <w:t>PROXY_HTTP_LISTEN</w:t>
+            </w:r>
+          </w:p>
+        </w:tc>
+        <w:tc>
+          <w:tcPr>
+            <w:tcW w:w="3120" w:type="dxa"/>
+            <w:tcBorders/>
+          </w:tcPr>
+          <w:p>
+            <w:pPr>
+              <w:pStyle w:val="Normal"/>
+              <w:widowControl/>
+              <w:spacing w:lineRule="auto" w:line="240" w:before="0" w:after="40"/>
+              <w:jc w:val="left"/>
+              <w:rPr>
+                <w:rFonts w:eastAsia="ＭＳ 明朝" w:cs=""/>
+                <w:kern w:val="0"/>
+                <w:szCs w:val="22"/>
+                <w:lang w:val="en-US" w:eastAsia="en-US" w:bidi="ar-SA"/>
+              </w:rPr>
+            </w:pPr>
+            <w:r>
+              <w:rPr>
+                <w:rFonts w:eastAsia="ＭＳ 明朝" w:cs=""/>
+                <w:kern w:val="0"/>
+                <w:sz w:val="20"/>
+                <w:szCs w:val="22"/>
+                <w:lang w:val="en-US" w:eastAsia="en-US" w:bidi="ar-SA"/>
+              </w:rPr>
+              <w:t>:8000</w:t>
+            </w:r>
+          </w:p>
+        </w:tc>
+        <w:tc>
+          <w:tcPr>
+            <w:tcW w:w="3120" w:type="dxa"/>
+            <w:tcBorders/>
+          </w:tcPr>
+          <w:p>
+            <w:pPr>
+              <w:pStyle w:val="Normal"/>
+              <w:widowControl/>
+              <w:spacing w:lineRule="auto" w:line="240" w:before="0" w:after="40"/>
+              <w:jc w:val="left"/>
+              <w:rPr>
+                <w:rFonts w:eastAsia="ＭＳ 明朝" w:cs=""/>
+                <w:kern w:val="0"/>
+                <w:szCs w:val="22"/>
+                <w:lang w:val="en-US" w:eastAsia="en-US" w:bidi="ar-SA"/>
+              </w:rPr>
+            </w:pPr>
+            <w:r>
+              <w:rPr>
+                <w:rFonts w:eastAsia="ＭＳ 明朝" w:cs=""/>
+                <w:kern w:val="0"/>
+                <w:sz w:val="20"/>
+                <w:szCs w:val="22"/>
+                <w:lang w:val="en-US" w:eastAsia="en-US" w:bidi="ar-SA"/>
+              </w:rPr>
+              <w:t>HTTP listen address</w:t>
+            </w:r>
+          </w:p>
+        </w:tc>
+      </w:tr>
+      <w:tr>
+        <w:trPr/>
+        <w:tc>
+          <w:tcPr>
+            <w:tcW w:w="3120" w:type="dxa"/>
+            <w:tcBorders/>
+          </w:tcPr>
+          <w:p>
+            <w:pPr>
+              <w:pStyle w:val="Normal"/>
+              <w:widowControl/>
+              <w:spacing w:lineRule="auto" w:line="240" w:before="0" w:after="40"/>
+              <w:jc w:val="left"/>
+              <w:rPr>
+                <w:rFonts w:eastAsia="ＭＳ 明朝" w:cs=""/>
+                <w:kern w:val="0"/>
+                <w:szCs w:val="22"/>
+                <w:lang w:val="en-US" w:eastAsia="en-US" w:bidi="ar-SA"/>
+              </w:rPr>
+            </w:pPr>
+            <w:r>
+              <w:rPr>
+                <w:rFonts w:eastAsia="ＭＳ 明朝" w:cs=""/>
+                <w:kern w:val="0"/>
+                <w:sz w:val="20"/>
+                <w:szCs w:val="22"/>
+                <w:lang w:val="en-US" w:eastAsia="en-US" w:bidi="ar-SA"/>
+              </w:rPr>
+              <w:t>PROXY_SFTP_LISTEN</w:t>
+            </w:r>
+          </w:p>
+        </w:tc>
+        <w:tc>
+          <w:tcPr>
+            <w:tcW w:w="3120" w:type="dxa"/>
+            <w:tcBorders/>
+          </w:tcPr>
+          <w:p>
+            <w:pPr>
+              <w:pStyle w:val="Normal"/>
+              <w:widowControl/>
+              <w:spacing w:lineRule="auto" w:line="240" w:before="0" w:after="40"/>
+              <w:jc w:val="left"/>
+              <w:rPr>
+                <w:rFonts w:eastAsia="ＭＳ 明朝" w:cs=""/>
+                <w:kern w:val="0"/>
+                <w:szCs w:val="22"/>
+                <w:lang w:val="en-US" w:eastAsia="en-US" w:bidi="ar-SA"/>
+              </w:rPr>
+            </w:pPr>
+            <w:r>
+              <w:rPr>
+                <w:rFonts w:eastAsia="ＭＳ 明朝" w:cs=""/>
+                <w:kern w:val="0"/>
+                <w:sz w:val="20"/>
+                <w:szCs w:val="22"/>
+                <w:lang w:val="en-US" w:eastAsia="en-US" w:bidi="ar-SA"/>
+              </w:rPr>
+              <w:t>:2222</w:t>
+            </w:r>
+          </w:p>
+        </w:tc>
+        <w:tc>
+          <w:tcPr>
+            <w:tcW w:w="3120" w:type="dxa"/>
+            <w:tcBorders/>
+          </w:tcPr>
+          <w:p>
+            <w:pPr>
+              <w:pStyle w:val="Normal"/>
+              <w:widowControl/>
+              <w:spacing w:lineRule="auto" w:line="240" w:before="0" w:after="40"/>
+              <w:jc w:val="left"/>
+              <w:rPr>
+                <w:rFonts w:eastAsia="ＭＳ 明朝" w:cs=""/>
+                <w:kern w:val="0"/>
+                <w:szCs w:val="22"/>
+                <w:lang w:val="en-US" w:eastAsia="en-US" w:bidi="ar-SA"/>
+              </w:rPr>
+            </w:pPr>
+            <w:r>
+              <w:rPr>
+                <w:rFonts w:eastAsia="ＭＳ 明朝" w:cs=""/>
+                <w:kern w:val="0"/>
+                <w:sz w:val="20"/>
+                <w:szCs w:val="22"/>
+                <w:lang w:val="en-US" w:eastAsia="en-US" w:bidi="ar-SA"/>
+              </w:rPr>
+              <w:t>SFTP listen address</w:t>
+            </w:r>
+          </w:p>
+        </w:tc>
+      </w:tr>
+      <w:tr>
+        <w:trPr/>
+        <w:tc>
+          <w:tcPr>
+            <w:tcW w:w="3120" w:type="dxa"/>
+            <w:tcBorders/>
+          </w:tcPr>
+          <w:p>
+            <w:pPr>
+              <w:pStyle w:val="Normal"/>
+              <w:widowControl/>
+              <w:spacing w:lineRule="auto" w:line="240" w:before="0" w:after="40"/>
+              <w:jc w:val="left"/>
+              <w:rPr>
+                <w:rFonts w:eastAsia="ＭＳ 明朝" w:cs=""/>
+                <w:kern w:val="0"/>
+                <w:szCs w:val="22"/>
+                <w:lang w:val="en-US" w:eastAsia="en-US" w:bidi="ar-SA"/>
+              </w:rPr>
+            </w:pPr>
+            <w:r>
+              <w:rPr>
+                <w:rFonts w:eastAsia="ＭＳ 明朝" w:cs=""/>
+                <w:kern w:val="0"/>
+                <w:sz w:val="20"/>
+                <w:szCs w:val="22"/>
+                <w:lang w:val="en-US" w:eastAsia="en-US" w:bidi="ar-SA"/>
+              </w:rPr>
+              <w:t>UPSTREAM_HTTP</w:t>
+            </w:r>
+          </w:p>
+        </w:tc>
+        <w:tc>
+          <w:tcPr>
+            <w:tcW w:w="3120" w:type="dxa"/>
+            <w:tcBorders/>
+          </w:tcPr>
+          <w:p>
+            <w:pPr>
+              <w:pStyle w:val="Normal"/>
+              <w:widowControl/>
+              <w:spacing w:lineRule="auto" w:line="240" w:before="0" w:after="40"/>
+              <w:jc w:val="left"/>
+              <w:rPr>
+                <w:rFonts w:eastAsia="ＭＳ 明朝" w:cs=""/>
+                <w:kern w:val="0"/>
+                <w:szCs w:val="22"/>
+                <w:lang w:val="en-US" w:eastAsia="en-US" w:bidi="ar-SA"/>
+              </w:rPr>
+            </w:pPr>
+            <w:r>
+              <w:rPr>
+                <w:rFonts w:eastAsia="ＭＳ 明朝" w:cs=""/>
+                <w:kern w:val="0"/>
+                <w:sz w:val="20"/>
+                <w:szCs w:val="22"/>
+                <w:lang w:val="en-US" w:eastAsia="en-US" w:bidi="ar-SA"/>
+              </w:rPr>
+              <w:t>http://sftpgo:8080</w:t>
+            </w:r>
+          </w:p>
+        </w:tc>
+        <w:tc>
+          <w:tcPr>
+            <w:tcW w:w="3120" w:type="dxa"/>
+            <w:tcBorders/>
+          </w:tcPr>
+          <w:p>
+            <w:pPr>
+              <w:pStyle w:val="Normal"/>
+              <w:widowControl/>
+              <w:spacing w:lineRule="auto" w:line="240" w:before="0" w:after="40"/>
+              <w:jc w:val="left"/>
+              <w:rPr>
+                <w:rFonts w:eastAsia="ＭＳ 明朝" w:cs=""/>
+                <w:kern w:val="0"/>
+                <w:szCs w:val="22"/>
+                <w:lang w:val="en-US" w:eastAsia="en-US" w:bidi="ar-SA"/>
+              </w:rPr>
+            </w:pPr>
+            <w:r>
+              <w:rPr>
+                <w:rFonts w:eastAsia="ＭＳ 明朝" w:cs=""/>
+                <w:kern w:val="0"/>
+                <w:sz w:val="20"/>
+                <w:szCs w:val="22"/>
+                <w:lang w:val="en-US" w:eastAsia="en-US" w:bidi="ar-SA"/>
+              </w:rPr>
+              <w:t>SFTPGo web/API endpoint</w:t>
+            </w:r>
+          </w:p>
+        </w:tc>
+      </w:tr>
+      <w:tr>
+        <w:trPr/>
+        <w:tc>
+          <w:tcPr>
+            <w:tcW w:w="3120" w:type="dxa"/>
+            <w:tcBorders/>
+          </w:tcPr>
+          <w:p>
+            <w:pPr>
+              <w:pStyle w:val="Normal"/>
+              <w:widowControl/>
+              <w:spacing w:lineRule="auto" w:line="240" w:before="0" w:after="40"/>
+              <w:jc w:val="left"/>
+              <w:rPr>
+                <w:rFonts w:eastAsia="ＭＳ 明朝" w:cs=""/>
+                <w:kern w:val="0"/>
+                <w:szCs w:val="22"/>
+                <w:lang w:val="en-US" w:eastAsia="en-US" w:bidi="ar-SA"/>
+              </w:rPr>
+            </w:pPr>
+            <w:r>
+              <w:rPr>
+                <w:rFonts w:eastAsia="ＭＳ 明朝" w:cs=""/>
+                <w:kern w:val="0"/>
+                <w:sz w:val="20"/>
+                <w:szCs w:val="22"/>
+                <w:lang w:val="en-US" w:eastAsia="en-US" w:bidi="ar-SA"/>
+              </w:rPr>
+              <w:t>UPSTREAM_SFTP</w:t>
+            </w:r>
+          </w:p>
+        </w:tc>
+        <w:tc>
+          <w:tcPr>
+            <w:tcW w:w="3120" w:type="dxa"/>
+            <w:tcBorders/>
+          </w:tcPr>
+          <w:p>
+            <w:pPr>
+              <w:pStyle w:val="Normal"/>
+              <w:widowControl/>
+              <w:spacing w:lineRule="auto" w:line="240" w:before="0" w:after="40"/>
+              <w:jc w:val="left"/>
+              <w:rPr>
+                <w:rFonts w:eastAsia="ＭＳ 明朝" w:cs=""/>
+                <w:kern w:val="0"/>
+                <w:szCs w:val="22"/>
+                <w:lang w:val="en-US" w:eastAsia="en-US" w:bidi="ar-SA"/>
+              </w:rPr>
+            </w:pPr>
+            <w:r>
+              <w:rPr>
+                <w:rFonts w:eastAsia="ＭＳ 明朝" w:cs=""/>
+                <w:kern w:val="0"/>
+                <w:sz w:val="20"/>
+                <w:szCs w:val="22"/>
+                <w:lang w:val="en-US" w:eastAsia="en-US" w:bidi="ar-SA"/>
+              </w:rPr>
+              <w:t>sftpgo:2022</w:t>
+            </w:r>
+          </w:p>
+        </w:tc>
+        <w:tc>
+          <w:tcPr>
+            <w:tcW w:w="3120" w:type="dxa"/>
+            <w:tcBorders/>
+          </w:tcPr>
+          <w:p>
+            <w:pPr>
+              <w:pStyle w:val="Normal"/>
+              <w:widowControl/>
+              <w:spacing w:lineRule="auto" w:line="240" w:before="0" w:after="40"/>
+              <w:jc w:val="left"/>
+              <w:rPr>
+                <w:rFonts w:eastAsia="ＭＳ 明朝" w:cs=""/>
+                <w:kern w:val="0"/>
+                <w:szCs w:val="22"/>
+                <w:lang w:val="en-US" w:eastAsia="en-US" w:bidi="ar-SA"/>
+              </w:rPr>
+            </w:pPr>
+            <w:r>
+              <w:rPr>
+                <w:rFonts w:eastAsia="ＭＳ 明朝" w:cs=""/>
+                <w:kern w:val="0"/>
+                <w:sz w:val="20"/>
+                <w:szCs w:val="22"/>
+                <w:lang w:val="en-US" w:eastAsia="en-US" w:bidi="ar-SA"/>
+              </w:rPr>
+              <w:t>SFTPGo SFTP endpoint</w:t>
+            </w:r>
+          </w:p>
+        </w:tc>
+      </w:tr>
+      <w:tr>
+        <w:trPr/>
+        <w:tc>
+          <w:tcPr>
+            <w:tcW w:w="3120" w:type="dxa"/>
+            <w:tcBorders/>
+          </w:tcPr>
+          <w:p>
+            <w:pPr>
+              <w:pStyle w:val="Normal"/>
+              <w:widowControl/>
+              <w:spacing w:lineRule="auto" w:line="240" w:before="0" w:after="40"/>
+              <w:jc w:val="left"/>
+              <w:rPr>
+                <w:rFonts w:eastAsia="ＭＳ 明朝" w:cs=""/>
+                <w:kern w:val="0"/>
+                <w:szCs w:val="22"/>
+                <w:lang w:val="en-US" w:eastAsia="en-US" w:bidi="ar-SA"/>
+              </w:rPr>
+            </w:pPr>
+            <w:r>
+              <w:rPr>
+                <w:rFonts w:eastAsia="ＭＳ 明朝" w:cs=""/>
+                <w:kern w:val="0"/>
+                <w:sz w:val="20"/>
+                <w:szCs w:val="22"/>
+                <w:lang w:val="en-US" w:eastAsia="en-US" w:bidi="ar-SA"/>
+              </w:rPr>
+              <w:t>PROXY_FTP_LISTEN</w:t>
+            </w:r>
+          </w:p>
+        </w:tc>
+        <w:tc>
+          <w:tcPr>
+            <w:tcW w:w="3120" w:type="dxa"/>
+            <w:tcBorders/>
+          </w:tcPr>
+          <w:p>
+            <w:pPr>
+              <w:pStyle w:val="Normal"/>
+              <w:widowControl/>
+              <w:spacing w:lineRule="auto" w:line="240" w:before="0" w:after="40"/>
+              <w:jc w:val="left"/>
+              <w:rPr>
+                <w:rFonts w:eastAsia="ＭＳ 明朝" w:cs=""/>
+                <w:kern w:val="0"/>
+                <w:szCs w:val="22"/>
+                <w:lang w:val="en-US" w:eastAsia="en-US" w:bidi="ar-SA"/>
+              </w:rPr>
+            </w:pPr>
+            <w:r>
+              <w:rPr>
+                <w:rFonts w:eastAsia="ＭＳ 明朝" w:cs=""/>
+                <w:kern w:val="0"/>
+                <w:sz w:val="20"/>
+                <w:szCs w:val="22"/>
+                <w:lang w:val="en-US" w:eastAsia="en-US" w:bidi="ar-SA"/>
+              </w:rPr>
+              <w:t>0 (disabled)</w:t>
+            </w:r>
+          </w:p>
+        </w:tc>
+        <w:tc>
+          <w:tcPr>
+            <w:tcW w:w="3120" w:type="dxa"/>
+            <w:tcBorders/>
+          </w:tcPr>
+          <w:p>
+            <w:pPr>
+              <w:pStyle w:val="Normal"/>
+              <w:widowControl/>
+              <w:spacing w:lineRule="auto" w:line="240" w:before="0" w:after="40"/>
+              <w:jc w:val="left"/>
+              <w:rPr>
+                <w:rFonts w:eastAsia="ＭＳ 明朝" w:cs=""/>
+                <w:kern w:val="0"/>
+                <w:szCs w:val="22"/>
+                <w:lang w:val="en-US" w:eastAsia="en-US" w:bidi="ar-SA"/>
+              </w:rPr>
+            </w:pPr>
+            <w:r>
+              <w:rPr>
+                <w:rFonts w:eastAsia="ＭＳ 明朝" w:cs=""/>
+                <w:kern w:val="0"/>
+                <w:sz w:val="20"/>
+                <w:szCs w:val="22"/>
+                <w:lang w:val="en-US" w:eastAsia="en-US" w:bidi="ar-SA"/>
+              </w:rPr>
+              <w:t>FTP listen port; 0 or empty disables</w:t>
+            </w:r>
+          </w:p>
+        </w:tc>
+      </w:tr>
+      <w:tr>
+        <w:trPr/>
+        <w:tc>
+          <w:tcPr>
+            <w:tcW w:w="3120" w:type="dxa"/>
+            <w:tcBorders/>
+          </w:tcPr>
+          <w:p>
+            <w:pPr>
+              <w:pStyle w:val="Normal"/>
+              <w:widowControl/>
+              <w:spacing w:lineRule="auto" w:line="240" w:before="0" w:after="40"/>
+              <w:jc w:val="left"/>
+              <w:rPr>
+                <w:rFonts w:eastAsia="ＭＳ 明朝" w:cs=""/>
+                <w:kern w:val="0"/>
+                <w:szCs w:val="22"/>
+                <w:lang w:val="en-US" w:eastAsia="en-US" w:bidi="ar-SA"/>
+              </w:rPr>
+            </w:pPr>
+            <w:r>
+              <w:rPr>
+                <w:rFonts w:eastAsia="ＭＳ 明朝" w:cs=""/>
+                <w:kern w:val="0"/>
+                <w:sz w:val="20"/>
+                <w:szCs w:val="22"/>
+                <w:lang w:val="en-US" w:eastAsia="en-US" w:bidi="ar-SA"/>
+              </w:rPr>
+              <w:t>UPSTREAM_FTP</w:t>
+            </w:r>
+          </w:p>
+        </w:tc>
+        <w:tc>
+          <w:tcPr>
+            <w:tcW w:w="3120" w:type="dxa"/>
+            <w:tcBorders/>
+          </w:tcPr>
+          <w:p>
+            <w:pPr>
+              <w:pStyle w:val="Normal"/>
+              <w:widowControl/>
+              <w:spacing w:lineRule="auto" w:line="240" w:before="0" w:after="40"/>
+              <w:jc w:val="left"/>
+              <w:rPr>
+                <w:rFonts w:eastAsia="ＭＳ 明朝" w:cs=""/>
+                <w:kern w:val="0"/>
+                <w:szCs w:val="22"/>
+                <w:lang w:val="en-US" w:eastAsia="en-US" w:bidi="ar-SA"/>
+              </w:rPr>
+            </w:pPr>
+            <w:r>
+              <w:rPr>
+                <w:rFonts w:eastAsia="ＭＳ 明朝" w:cs=""/>
+                <w:kern w:val="0"/>
+                <w:sz w:val="20"/>
+                <w:szCs w:val="22"/>
+                <w:lang w:val="en-US" w:eastAsia="en-US" w:bidi="ar-SA"/>
+              </w:rPr>
+              <w:t>sftpgo:2121</w:t>
+            </w:r>
+          </w:p>
+        </w:tc>
+        <w:tc>
+          <w:tcPr>
+            <w:tcW w:w="3120" w:type="dxa"/>
+            <w:tcBorders/>
+          </w:tcPr>
+          <w:p>
+            <w:pPr>
+              <w:pStyle w:val="Normal"/>
+              <w:widowControl/>
+              <w:spacing w:lineRule="auto" w:line="240" w:before="0" w:after="40"/>
+              <w:jc w:val="left"/>
+              <w:rPr>
+                <w:rFonts w:eastAsia="ＭＳ 明朝" w:cs=""/>
+                <w:kern w:val="0"/>
+                <w:szCs w:val="22"/>
+                <w:lang w:val="en-US" w:eastAsia="en-US" w:bidi="ar-SA"/>
+              </w:rPr>
+            </w:pPr>
+            <w:r>
+              <w:rPr>
+                <w:rFonts w:eastAsia="ＭＳ 明朝" w:cs=""/>
+                <w:kern w:val="0"/>
+                <w:sz w:val="20"/>
+                <w:szCs w:val="22"/>
+                <w:lang w:val="en-US" w:eastAsia="en-US" w:bidi="ar-SA"/>
+              </w:rPr>
+              <w:t>SFTPGo FTP endpoint</w:t>
+            </w:r>
+          </w:p>
+        </w:tc>
+      </w:tr>
+      <w:tr>
+        <w:trPr/>
+        <w:tc>
+          <w:tcPr>
+            <w:tcW w:w="3120" w:type="dxa"/>
+            <w:tcBorders/>
+          </w:tcPr>
+          <w:p>
+            <w:pPr>
+              <w:pStyle w:val="Normal"/>
+              <w:widowControl/>
+              <w:spacing w:lineRule="auto" w:line="240" w:before="0" w:after="40"/>
+              <w:jc w:val="left"/>
+              <w:rPr>
+                <w:rFonts w:eastAsia="ＭＳ 明朝" w:cs=""/>
+                <w:kern w:val="0"/>
+                <w:szCs w:val="22"/>
+                <w:lang w:val="en-US" w:eastAsia="en-US" w:bidi="ar-SA"/>
+              </w:rPr>
+            </w:pPr>
+            <w:r>
+              <w:rPr>
+                <w:rFonts w:eastAsia="ＭＳ 明朝" w:cs=""/>
+                <w:kern w:val="0"/>
+                <w:sz w:val="20"/>
+                <w:szCs w:val="22"/>
+                <w:lang w:val="en-US" w:eastAsia="en-US" w:bidi="ar-SA"/>
+              </w:rPr>
+              <w:t>PROXY_FTP_PASV_RANGE</w:t>
+            </w:r>
+          </w:p>
+        </w:tc>
+        <w:tc>
+          <w:tcPr>
+            <w:tcW w:w="3120" w:type="dxa"/>
+            <w:tcBorders/>
+          </w:tcPr>
+          <w:p>
+            <w:pPr>
+              <w:pStyle w:val="Normal"/>
+              <w:widowControl/>
+              <w:spacing w:lineRule="auto" w:line="240" w:before="0" w:after="40"/>
+              <w:jc w:val="left"/>
+              <w:rPr>
+                <w:rFonts w:eastAsia="ＭＳ 明朝" w:cs=""/>
+                <w:kern w:val="0"/>
+                <w:szCs w:val="22"/>
+                <w:lang w:val="en-US" w:eastAsia="en-US" w:bidi="ar-SA"/>
+              </w:rPr>
+            </w:pPr>
+            <w:r>
+              <w:rPr>
+                <w:rFonts w:eastAsia="ＭＳ 明朝" w:cs=""/>
+                <w:kern w:val="0"/>
+                <w:sz w:val="20"/>
+                <w:szCs w:val="22"/>
+                <w:lang w:val="en-US" w:eastAsia="en-US" w:bidi="ar-SA"/>
+              </w:rPr>
+              <w:t>50000-50009</w:t>
+            </w:r>
+          </w:p>
+        </w:tc>
+        <w:tc>
+          <w:tcPr>
+            <w:tcW w:w="3120" w:type="dxa"/>
+            <w:tcBorders/>
+          </w:tcPr>
+          <w:p>
+            <w:pPr>
+              <w:pStyle w:val="Normal"/>
+              <w:widowControl/>
+              <w:spacing w:lineRule="auto" w:line="240" w:before="0" w:after="40"/>
+              <w:jc w:val="left"/>
+              <w:rPr>
+                <w:rFonts w:eastAsia="ＭＳ 明朝" w:cs=""/>
+                <w:kern w:val="0"/>
+                <w:szCs w:val="22"/>
+                <w:lang w:val="en-US" w:eastAsia="en-US" w:bidi="ar-SA"/>
+              </w:rPr>
+            </w:pPr>
+            <w:r>
+              <w:rPr>
+                <w:rFonts w:eastAsia="ＭＳ 明朝" w:cs=""/>
+                <w:kern w:val="0"/>
+                <w:sz w:val="20"/>
+                <w:szCs w:val="22"/>
+                <w:lang w:val="en-US" w:eastAsia="en-US" w:bidi="ar-SA"/>
+              </w:rPr>
+              <w:t>Passive data ports relayed 1:1</w:t>
+            </w:r>
+          </w:p>
+        </w:tc>
+      </w:tr>
+      <w:tr>
+        <w:trPr/>
+        <w:tc>
+          <w:tcPr>
+            <w:tcW w:w="3120" w:type="dxa"/>
+            <w:tcBorders/>
+          </w:tcPr>
+          <w:p>
+            <w:pPr>
+              <w:pStyle w:val="Normal"/>
+              <w:widowControl/>
+              <w:spacing w:lineRule="auto" w:line="240" w:before="0" w:after="40"/>
+              <w:jc w:val="left"/>
+              <w:rPr>
+                <w:rFonts w:eastAsia="ＭＳ 明朝" w:cs=""/>
+                <w:kern w:val="0"/>
+                <w:szCs w:val="22"/>
+                <w:lang w:val="en-US" w:eastAsia="en-US" w:bidi="ar-SA"/>
+              </w:rPr>
+            </w:pPr>
+            <w:r>
+              <w:rPr>
+                <w:rFonts w:eastAsia="ＭＳ 明朝" w:cs=""/>
+                <w:kern w:val="0"/>
+                <w:sz w:val="20"/>
+                <w:szCs w:val="22"/>
+                <w:lang w:val="en-US" w:eastAsia="en-US" w:bidi="ar-SA"/>
+              </w:rPr>
+              <w:t>PROXY_WEBDAV_LISTEN</w:t>
+            </w:r>
+          </w:p>
+        </w:tc>
+        <w:tc>
+          <w:tcPr>
+            <w:tcW w:w="3120" w:type="dxa"/>
+            <w:tcBorders/>
+          </w:tcPr>
+          <w:p>
+            <w:pPr>
+              <w:pStyle w:val="Normal"/>
+              <w:widowControl/>
+              <w:spacing w:lineRule="auto" w:line="240" w:before="0" w:after="40"/>
+              <w:jc w:val="left"/>
+              <w:rPr>
+                <w:rFonts w:eastAsia="ＭＳ 明朝" w:cs=""/>
+                <w:kern w:val="0"/>
+                <w:szCs w:val="22"/>
+                <w:lang w:val="en-US" w:eastAsia="en-US" w:bidi="ar-SA"/>
+              </w:rPr>
+            </w:pPr>
+            <w:r>
+              <w:rPr>
+                <w:rFonts w:eastAsia="ＭＳ 明朝" w:cs=""/>
+                <w:kern w:val="0"/>
+                <w:sz w:val="20"/>
+                <w:szCs w:val="22"/>
+                <w:lang w:val="en-US" w:eastAsia="en-US" w:bidi="ar-SA"/>
+              </w:rPr>
+              <w:t>0 (disabled)</w:t>
+            </w:r>
+          </w:p>
+        </w:tc>
+        <w:tc>
+          <w:tcPr>
+            <w:tcW w:w="3120" w:type="dxa"/>
+            <w:tcBorders/>
+          </w:tcPr>
+          <w:p>
+            <w:pPr>
+              <w:pStyle w:val="Normal"/>
+              <w:widowControl/>
+              <w:spacing w:lineRule="auto" w:line="240" w:before="0" w:after="40"/>
+              <w:jc w:val="left"/>
+              <w:rPr>
+                <w:rFonts w:eastAsia="ＭＳ 明朝" w:cs=""/>
+                <w:kern w:val="0"/>
+                <w:szCs w:val="22"/>
+                <w:lang w:val="en-US" w:eastAsia="en-US" w:bidi="ar-SA"/>
+              </w:rPr>
+            </w:pPr>
+            <w:r>
+              <w:rPr>
+                <w:rFonts w:eastAsia="ＭＳ 明朝" w:cs=""/>
+                <w:kern w:val="0"/>
+                <w:sz w:val="20"/>
+                <w:szCs w:val="22"/>
+                <w:lang w:val="en-US" w:eastAsia="en-US" w:bidi="ar-SA"/>
+              </w:rPr>
+              <w:t>WebDAV listen port; 0 or empty disables</w:t>
+            </w:r>
+          </w:p>
+        </w:tc>
+      </w:tr>
+      <w:tr>
+        <w:trPr/>
+        <w:tc>
+          <w:tcPr>
+            <w:tcW w:w="3120" w:type="dxa"/>
+            <w:tcBorders/>
+          </w:tcPr>
+          <w:p>
+            <w:pPr>
+              <w:pStyle w:val="Normal"/>
+              <w:widowControl/>
+              <w:spacing w:lineRule="auto" w:line="240" w:before="0" w:after="40"/>
+              <w:jc w:val="left"/>
+              <w:rPr>
+                <w:rFonts w:eastAsia="ＭＳ 明朝" w:cs=""/>
+                <w:kern w:val="0"/>
+                <w:szCs w:val="22"/>
+                <w:lang w:val="en-US" w:eastAsia="en-US" w:bidi="ar-SA"/>
+              </w:rPr>
+            </w:pPr>
+            <w:r>
+              <w:rPr>
+                <w:rFonts w:eastAsia="ＭＳ 明朝" w:cs=""/>
+                <w:kern w:val="0"/>
+                <w:sz w:val="20"/>
+                <w:szCs w:val="22"/>
+                <w:lang w:val="en-US" w:eastAsia="en-US" w:bidi="ar-SA"/>
+              </w:rPr>
+              <w:t>UPSTREAM_WEBDAV</w:t>
+            </w:r>
+          </w:p>
+        </w:tc>
+        <w:tc>
+          <w:tcPr>
+            <w:tcW w:w="3120" w:type="dxa"/>
+            <w:tcBorders/>
+          </w:tcPr>
+          <w:p>
+            <w:pPr>
+              <w:pStyle w:val="Normal"/>
+              <w:widowControl/>
+              <w:spacing w:lineRule="auto" w:line="240" w:before="0" w:after="40"/>
+              <w:jc w:val="left"/>
+              <w:rPr>
+                <w:rFonts w:eastAsia="ＭＳ 明朝" w:cs=""/>
+                <w:kern w:val="0"/>
+                <w:szCs w:val="22"/>
+                <w:lang w:val="en-US" w:eastAsia="en-US" w:bidi="ar-SA"/>
+              </w:rPr>
+            </w:pPr>
+            <w:r>
+              <w:rPr>
+                <w:rFonts w:eastAsia="ＭＳ 明朝" w:cs=""/>
+                <w:kern w:val="0"/>
+                <w:sz w:val="20"/>
+                <w:szCs w:val="22"/>
+                <w:lang w:val="en-US" w:eastAsia="en-US" w:bidi="ar-SA"/>
+              </w:rPr>
+              <w:t>http://sftpgo:10080</w:t>
+            </w:r>
+          </w:p>
+        </w:tc>
+        <w:tc>
+          <w:tcPr>
+            <w:tcW w:w="3120" w:type="dxa"/>
+            <w:tcBorders/>
+          </w:tcPr>
+          <w:p>
+            <w:pPr>
+              <w:pStyle w:val="Normal"/>
+              <w:widowControl/>
+              <w:spacing w:lineRule="auto" w:line="240" w:before="0" w:after="40"/>
+              <w:jc w:val="left"/>
+              <w:rPr>
+                <w:rFonts w:eastAsia="ＭＳ 明朝" w:cs=""/>
+                <w:kern w:val="0"/>
+                <w:szCs w:val="22"/>
+                <w:lang w:val="en-US" w:eastAsia="en-US" w:bidi="ar-SA"/>
+              </w:rPr>
+            </w:pPr>
+            <w:r>
+              <w:rPr>
+                <w:rFonts w:eastAsia="ＭＳ 明朝" w:cs=""/>
+                <w:kern w:val="0"/>
+                <w:sz w:val="20"/>
+                <w:szCs w:val="22"/>
+                <w:lang w:val="en-US" w:eastAsia="en-US" w:bidi="ar-SA"/>
+              </w:rPr>
+              <w:t>SFTPGo WebDAV endpoint</w:t>
+            </w:r>
+          </w:p>
+        </w:tc>
+      </w:tr>
+      <w:tr>
+        <w:trPr/>
+        <w:tc>
+          <w:tcPr>
+            <w:tcW w:w="3120" w:type="dxa"/>
+            <w:tcBorders/>
+          </w:tcPr>
+          <w:p>
+            <w:pPr>
+              <w:pStyle w:val="Normal"/>
+              <w:widowControl/>
+              <w:spacing w:lineRule="auto" w:line="240" w:before="0" w:after="40"/>
+              <w:jc w:val="left"/>
+              <w:rPr>
+                <w:rFonts w:eastAsia="ＭＳ 明朝" w:cs=""/>
+                <w:kern w:val="0"/>
+                <w:szCs w:val="22"/>
+                <w:lang w:val="en-US" w:eastAsia="en-US" w:bidi="ar-SA"/>
+              </w:rPr>
+            </w:pPr>
+            <w:r>
+              <w:rPr>
+                <w:rFonts w:eastAsia="ＭＳ 明朝" w:cs=""/>
+                <w:kern w:val="0"/>
+                <w:sz w:val="20"/>
+                <w:szCs w:val="22"/>
+                <w:lang w:val="en-US" w:eastAsia="en-US" w:bidi="ar-SA"/>
+              </w:rPr>
+              <w:t xml:space="preserve">PROXY_UI</w:t>
+            </w:r>
+          </w:p>
+        </w:tc>
+        <w:tc>
+          <w:tcPr>
+            <w:tcW w:w="3120" w:type="dxa"/>
+            <w:tcBorders/>
+          </w:tcPr>
+          <w:p>
+            <w:pPr>
+              <w:pStyle w:val="Normal"/>
+              <w:widowControl/>
+              <w:spacing w:lineRule="auto" w:line="240" w:before="0" w:after="40"/>
+              <w:jc w:val="left"/>
+              <w:rPr>
+                <w:rFonts w:eastAsia="ＭＳ 明朝" w:cs=""/>
+                <w:kern w:val="0"/>
+                <w:szCs w:val="22"/>
+                <w:lang w:val="en-US" w:eastAsia="en-US" w:bidi="ar-SA"/>
+              </w:rPr>
+            </w:pPr>
+            <w:r>
+              <w:rPr>
+                <w:rFonts w:eastAsia="ＭＳ 明朝" w:cs=""/>
+                <w:kern w:val="0"/>
+                <w:sz w:val="20"/>
+                <w:szCs w:val="22"/>
+                <w:lang w:val="en-US" w:eastAsia="en-US" w:bidi="ar-SA"/>
+              </w:rPr>
+              <w:t xml:space="preserve">true</w:t>
+            </w:r>
+          </w:p>
+        </w:tc>
+        <w:tc>
+          <w:tcPr>
+            <w:tcW w:w="3120" w:type="dxa"/>
+            <w:tcBorders/>
+          </w:tcPr>
+          <w:p>
+            <w:pPr>
+              <w:pStyle w:val="Normal"/>
+              <w:widowControl/>
+              <w:spacing w:lineRule="auto" w:line="240" w:before="0" w:after="40"/>
+              <w:jc w:val="left"/>
+              <w:rPr>
+                <w:rFonts w:eastAsia="ＭＳ 明朝" w:cs=""/>
+                <w:kern w:val="0"/>
+                <w:szCs w:val="22"/>
+                <w:lang w:val="en-US" w:eastAsia="en-US" w:bidi="ar-SA"/>
+              </w:rPr>
+            </w:pPr>
+            <w:r>
+              <w:rPr>
+                <w:rFonts w:eastAsia="ＭＳ 明朝" w:cs=""/>
+                <w:kern w:val="0"/>
+                <w:sz w:val="20"/>
+                <w:szCs w:val="22"/>
+                <w:lang w:val="en-US" w:eastAsia="en-US" w:bidi="ar-SA"/>
+              </w:rPr>
+              <w:t xml:space="preserve">false disables the mlw-storage web UI (/mlw/) and the redirect from /</w:t>
+            </w:r>
+          </w:p>
+        </w:tc>
+      </w:tr>
+    </w:tbl>
+    <w:p>
+      <w:pPr>
+        <w:pStyle w:val="Normal"/>
+        <w:rPr/>
+      </w:pPr>
+      <w:r>
+        <w:rPr/>
+      </w:r>
+    </w:p>
+    <w:p>
+      <w:pPr>
+        <w:pStyle w:val="Heading2"/>
+        <w:rPr/>
+      </w:pPr>
+      <w:bookmarkStart w:id="918" w:name="_Toc100018"/>
+      <w:r>
+        <w:rPr/>
+        <w:t>6.3 Keycloak settings (optional)</w:t>
+      </w:r>
+      <w:bookmarkEnd w:id="918"/>
+    </w:p>
+    <w:tbl>
+      <w:tblPr>
+        <w:tblStyle w:val="TableGrid"/>
+        <w:tblW w:w="9360" w:type="dxa"/>
+        <w:jc w:val="left"/>
+        <w:tblInd w:w="0" w:type="dxa"/>
+        <w:tblLayout w:type="fixed"/>
+        <w:tblCellMar>
+          <w:top w:w="0" w:type="dxa"/>
+          <w:left w:w="108" w:type="dxa"/>
+          <w:bottom w:w="0" w:type="dxa"/>
+          <w:right w:w="108" w:type="dxa"/>
+        </w:tblCellMar>
+        <w:tblLook w:val="04a0" w:noHBand="0" w:noVBand="1" w:firstColumn="1" w:lastRow="0" w:lastColumn="0" w:firstRow="1"/>
+      </w:tblPr>
+      <w:tblGrid>
+        <w:gridCol w:w="3120"/>
+        <w:gridCol w:w="3120"/>
+        <w:gridCol w:w="3120"/>
+      </w:tblGrid>
+      <w:tr>
+        <w:trPr/>
+        <w:tc>
+          <w:tcPr>
+            <w:tcW w:w="3120" w:type="dxa"/>
+            <w:tcBorders/>
+            <w:shd w:color="auto" w:fill="DCE6F1" w:val="clear"/>
+          </w:tcPr>
+          <w:p>
+            <w:pPr>
+              <w:pStyle w:val="Normal"/>
+              <w:widowControl/>
+              <w:spacing w:lineRule="auto" w:line="240" w:before="0" w:after="40"/>
+              <w:jc w:val="left"/>
+              <w:rPr>
+                <w:rFonts w:eastAsia="ＭＳ 明朝" w:cs=""/>
+                <w:kern w:val="0"/>
+                <w:szCs w:val="22"/>
+                <w:lang w:val="en-US" w:eastAsia="en-US" w:bidi="ar-SA"/>
+              </w:rPr>
+            </w:pPr>
+            <w:r>
+              <w:rPr>
+                <w:rFonts w:eastAsia="ＭＳ 明朝" w:cs=""/>
+                <w:b/>
+                <w:kern w:val="0"/>
+                <w:sz w:val="20"/>
+                <w:szCs w:val="22"/>
+                <w:lang w:val="en-US" w:eastAsia="en-US" w:bidi="ar-SA"/>
+              </w:rPr>
+              <w:t>Variable</w:t>
+            </w:r>
+          </w:p>
+        </w:tc>
+        <w:tc>
+          <w:tcPr>
+            <w:tcW w:w="3120" w:type="dxa"/>
+            <w:tcBorders/>
+            <w:shd w:color="auto" w:fill="DCE6F1" w:val="clear"/>
+          </w:tcPr>
+          <w:p>
+            <w:pPr>
+              <w:pStyle w:val="Normal"/>
+              <w:widowControl/>
+              <w:spacing w:lineRule="auto" w:line="240" w:before="0" w:after="40"/>
+              <w:jc w:val="left"/>
+              <w:rPr>
+                <w:rFonts w:eastAsia="ＭＳ 明朝" w:cs=""/>
+                <w:kern w:val="0"/>
+                <w:szCs w:val="22"/>
+                <w:lang w:val="en-US" w:eastAsia="en-US" w:bidi="ar-SA"/>
+              </w:rPr>
+            </w:pPr>
+            <w:r>
+              <w:rPr>
+                <w:rFonts w:eastAsia="ＭＳ 明朝" w:cs=""/>
+                <w:b/>
+                <w:kern w:val="0"/>
+                <w:sz w:val="20"/>
+                <w:szCs w:val="22"/>
+                <w:lang w:val="en-US" w:eastAsia="en-US" w:bidi="ar-SA"/>
+              </w:rPr>
+              <w:t>Default</w:t>
+            </w:r>
+          </w:p>
+        </w:tc>
+        <w:tc>
+          <w:tcPr>
+            <w:tcW w:w="3120" w:type="dxa"/>
+            <w:tcBorders/>
+            <w:shd w:color="auto" w:fill="DCE6F1" w:val="clear"/>
+          </w:tcPr>
+          <w:p>
+            <w:pPr>
+              <w:pStyle w:val="Normal"/>
+              <w:widowControl/>
+              <w:spacing w:lineRule="auto" w:line="240" w:before="0" w:after="40"/>
+              <w:jc w:val="left"/>
+              <w:rPr>
+                <w:rFonts w:eastAsia="ＭＳ 明朝" w:cs=""/>
+                <w:kern w:val="0"/>
+                <w:szCs w:val="22"/>
+                <w:lang w:val="en-US" w:eastAsia="en-US" w:bidi="ar-SA"/>
+              </w:rPr>
+            </w:pPr>
+            <w:r>
+              <w:rPr>
+                <w:rFonts w:eastAsia="ＭＳ 明朝" w:cs=""/>
+                <w:b/>
+                <w:kern w:val="0"/>
+                <w:sz w:val="20"/>
+                <w:szCs w:val="22"/>
+                <w:lang w:val="en-US" w:eastAsia="en-US" w:bidi="ar-SA"/>
+              </w:rPr>
+              <w:t>Meaning</w:t>
+            </w:r>
+          </w:p>
+        </w:tc>
+      </w:tr>
+      <w:tr>
+        <w:trPr/>
+        <w:tc>
+          <w:tcPr>
+            <w:tcW w:w="3120" w:type="dxa"/>
+            <w:tcBorders/>
+          </w:tcPr>
+          <w:p>
+            <w:pPr>
+              <w:pStyle w:val="Normal"/>
+              <w:widowControl/>
+              <w:spacing w:lineRule="auto" w:line="240" w:before="0" w:after="40"/>
+              <w:jc w:val="left"/>
+              <w:rPr>
+                <w:rFonts w:eastAsia="ＭＳ 明朝" w:cs=""/>
+                <w:kern w:val="0"/>
+                <w:szCs w:val="22"/>
+                <w:lang w:val="en-US" w:eastAsia="en-US" w:bidi="ar-SA"/>
+              </w:rPr>
+            </w:pPr>
+            <w:r>
+              <w:rPr>
+                <w:rFonts w:eastAsia="ＭＳ 明朝" w:cs=""/>
+                <w:kern w:val="0"/>
+                <w:sz w:val="20"/>
+                <w:szCs w:val="22"/>
+                <w:lang w:val="en-US" w:eastAsia="en-US" w:bidi="ar-SA"/>
+              </w:rPr>
               <w:t>OIDC_ISSUER</w:t>
             </w:r>
           </w:p>
@@ -5445,12 +5749,12 @@
         <w:pStyle w:val="Heading2"/>
         <w:rPr/>
       </w:pPr>
-      <w:bookmarkStart w:id="917" w:name="_Toc100017"/>
+      <w:bookmarkStart w:id="919" w:name="_Toc100019"/>
       <w:r>
         <w:rPr/>
         <w:t>6.4 Production deployment (docker-compose.prod.yml)</w:t>
       </w:r>
-      <w:bookmarkEnd w:id="917"/>
+      <w:bookmarkEnd w:id="919"/>
     </w:p>
     <w:p>
       <w:pPr>
@@ -6165,12 +6469,12 @@
         <w:pStyle w:val="Heading1"/>
         <w:rPr/>
       </w:pPr>
-      <w:bookmarkStart w:id="918" w:name="_Toc100018"/>
+      <w:bookmarkStart w:id="920" w:name="_Toc100020"/>
       <w:r>
         <w:rPr/>
         <w:t>7. Data and persistence</w:t>
       </w:r>
-      <w:bookmarkEnd w:id="918"/>
+      <w:bookmarkEnd w:id="920"/>
     </w:p>
     <w:p>
       <w:pPr>
@@ -6229,7 +6533,7 @@
       </w:r>
       <w:r>
         <w:rPr/>
-        <w:t xml:space="preserve"> the gateway keeps no state, except (Keycloak feature) the users' chosen root directories in volume proxy-state.</w:t>
+        <w:t xml:space="preserve"> the gateway keeps no state, except (Keycloak feature) the users' chosen root directories in volume proxy-state. Web UI sessions are held in memory only and are lost when the gateway restarts.</w:t>
       </w:r>
     </w:p>
     <w:p>
@@ -6237,12 +6541,12 @@
         <w:pStyle w:val="Heading1"/>
         <w:rPr/>
       </w:pPr>
-      <w:bookmarkStart w:id="919" w:name="_Toc100019"/>
+      <w:bookmarkStart w:id="921" w:name="_Toc100021"/>
       <w:r>
         <w:rPr/>
         <w:t>8. Security considerations</w:t>
       </w:r>
-      <w:bookmarkEnd w:id="919"/>
+      <w:bookmarkEnd w:id="921"/>
     </w:p>
     <w:p>
       <w:pPr>
@@ -6386,15 +6690,29 @@
     </w:p>
     <w:p>
       <w:pPr>
+        <w:pStyle w:val="ListBullet"/>
+        <w:numPr>
+          <w:ilvl w:val="0"/>
+          <w:numId w:val="1"/>
+        </w:numPr>
+        <w:rPr/>
+      </w:pPr>
+      <w:r>
+        <w:rPr/>
+        <w:t xml:space="preserve">Web UI: administrator credentials are checked by SFTPGo and never stored by the gateway. The SFTPGo API token stays on the server; the browser holds only an HttpOnly, SameSite=Strict session cookie. Sign-in and logout require a same-site request, repeated failed sign-ins are throttled per client address, and pages are not cached. The gateway serves plain HTTP, so terminate TLS in front of it or the password and cookie travel unencrypted.</w:t>
+      </w:r>
+    </w:p>
+    <w:p>
+      <w:pPr>
         <w:pStyle w:val="Heading1"/>
         <w:rPr/>
       </w:pPr>
-      <w:bookmarkStart w:id="920" w:name="_Toc100020"/>
+      <w:bookmarkStart w:id="922" w:name="_Toc100022"/>
       <w:r>
         <w:rPr/>
         <w:t>9. Operations</w:t>
       </w:r>
-      <w:bookmarkEnd w:id="920"/>
+      <w:bookmarkEnd w:id="922"/>
     </w:p>
     <w:p>
       <w:pPr>
@@ -6423,7 +6741,7 @@
       </w:pPr>
       <w:r>
         <w:rPr/>
-        <w:t>Web admin: http://localhost:8380. Create SFTP users there, then connect remote servers with an SFTP client on port 2222.</w:t>
+        <w:t xml:space="preserve">Web UI: http://localhost:8380 shows the mlw-storage sign-in page; sign in with the SFTPGo admin account. The Dashboard lists the users, and its SFTPGo administration button (or http://localhost:8380/web/admin/) opens the SFTPGo console. Create SFTP users there, then connect remote servers with an SFTP client on port 2222.</w:t>
       </w:r>
     </w:p>
     <w:p>
@@ -6459,12 +6777,12 @@
         <w:pStyle w:val="Heading1"/>
         <w:rPr/>
       </w:pPr>
-      <w:bookmarkStart w:id="921" w:name="_Toc100021"/>
+      <w:bookmarkStart w:id="923" w:name="_Toc100023"/>
       <w:r>
         <w:rPr/>
         <w:t>10. Limitations and possible next steps</w:t>
       </w:r>
-      <w:bookmarkEnd w:id="921"/>
+      <w:bookmarkEnd w:id="923"/>
     </w:p>
     <w:p>
       <w:pPr>
@@ -6536,6 +6854,22 @@
       <w:r>
         <w:rPr/>
         <w:t>Token login: no session revocation when a token expires or a user is disabled in Keycloak, and no fallback to SFTPGo password logins while the feature is enabled.</w:t>
+      </w:r>
+    </w:p>
+    <w:p>
+      <w:pPr>
+        <w:pStyle w:val="ListBullet"/>
+        <w:numPr>
+          <w:ilvl w:val="0"/>
+          <w:numId w:val="1"/>
+        </w:numPr>
+        <w:spacing w:before="0" w:after="200"/>
+        <w:contextualSpacing/>
+        <w:rPr/>
+      </w:pPr>
+      <w:r>
+        <w:rPr/>
+        <w:t xml:space="preserve">Web UI: sessions are in memory and end at gateway restart. Any SFTPGo administrator who can list users sees the whole Dashboard; there are no per-admin roles. Administrators with two-factor authentication enabled cannot sign in to the mlw-storage UI. Signing in does not sign in to the SFTPGo console, which keeps its own login.</w:t>
       </w:r>
     </w:p>
     <w:sectPr>

</xml_diff>

<commit_message>
Add manual drive entry to the Drives page
An Add drive button opens a dialog (name, mount point, optional device and
file system, enable now) for volumes mounted below the media directory that
detection does not report. Manual drives are validated, persisted in
media.json, and can be disabled, enabled and removed. Docs updated.

Co-Authored-By: Claude Sonnet 5.5 <noreply@anthropic.com>
</commit_message>
<xml_diff>
--- a/doc/mlw-storage_Architecture.docx
+++ b/doc/mlw-storage_Architecture.docx
@@ -437,7 +437,7 @@
           <w:rPr>
             <w:b/>
           </w:rPr>
-          <w:t xml:space="preserve">6</w:t>
+          <w:t xml:space="preserve">7</w:t>
         </w:r>
         <w:r>
           <w:rPr>
@@ -472,7 +472,7 @@
           <w:fldChar w:fldCharType="separate"/>
         </w:r>
         <w:r>
-          <w:t xml:space="preserve">6</w:t>
+          <w:t xml:space="preserve">7</w:t>
         </w:r>
         <w:r>
           <w:fldChar w:fldCharType="end"/>
@@ -504,7 +504,7 @@
           <w:fldChar w:fldCharType="separate"/>
         </w:r>
         <w:r>
-          <w:t xml:space="preserve">6</w:t>
+          <w:t xml:space="preserve">7</w:t>
         </w:r>
         <w:r>
           <w:fldChar w:fldCharType="end"/>
@@ -536,7 +536,7 @@
           <w:fldChar w:fldCharType="separate"/>
         </w:r>
         <w:r>
-          <w:t xml:space="preserve">6</w:t>
+          <w:t xml:space="preserve">7</w:t>
         </w:r>
         <w:r>
           <w:fldChar w:fldCharType="end"/>
@@ -746,7 +746,7 @@
           <w:rPr>
             <w:b/>
           </w:rPr>
-          <w:t xml:space="preserve">9</w:t>
+          <w:t xml:space="preserve">10</w:t>
         </w:r>
         <w:r>
           <w:rPr>
@@ -866,7 +866,7 @@
           <w:fldChar w:fldCharType="separate"/>
         </w:r>
         <w:r>
-          <w:t xml:space="preserve">10</w:t>
+          <w:t xml:space="preserve">11</w:t>
         </w:r>
         <w:r>
           <w:fldChar w:fldCharType="end"/>
@@ -930,7 +930,7 @@
           <w:fldChar w:fldCharType="separate"/>
         </w:r>
         <w:r>
-          <w:t xml:space="preserve">11</w:t>
+          <w:t xml:space="preserve">12</w:t>
         </w:r>
         <w:r>
           <w:fldChar w:fldCharType="end"/>
@@ -980,7 +980,7 @@
           <w:rPr>
             <w:b/>
           </w:rPr>
-          <w:t xml:space="preserve">12</w:t>
+          <w:t xml:space="preserve">13</w:t>
         </w:r>
         <w:r>
           <w:rPr>
@@ -1139,7 +1139,7 @@
           <w:rPr>
             <w:b/>
           </w:rPr>
-          <w:t xml:space="preserve">14</w:t>
+          <w:t xml:space="preserve">15</w:t>
         </w:r>
         <w:r>
           <w:rPr>
@@ -1734,6 +1734,46 @@
         <w:rPr>
           <w:b/>
         </w:rPr>
+        <w:t xml:space="preserve">Adding a drive by hand.</w:t>
+      </w:r>
+      <w:r>
+        <w:rPr/>
+        <w:t xml:space="preserve"> For a volume that is mounted below the media directory but that detection does not report (a FUSE or exFAT-fuse mount, a network share, or a drive with no sysfs entry), the Drives page has an Add drive button that opens a dialog. Required fields are a name and the mount point (an absolute host path below the media directory). Device and file system are optional and default to what the kernel reports in mountinfo; a checkbox decides whether the drive is enabled at once. The gateway checks that the path is a directory that exists, that it does not resolve through a symlink to somewhere outside the media directory, that something is mounted exactly there, and that the drive was not already detected or added. The entry is stored in media.json under the key mp:&lt;mount point&gt; with a manual flag, and the mount table is re-read at once so that the page shows the drive without waiting for a mount event.</w:t>
+      </w:r>
+    </w:p>
+    <w:p>
+      <w:pPr>
+        <w:pStyle w:val="ListBullet"/>
+        <w:numPr>
+          <w:ilvl w:val="0"/>
+          <w:numId w:val="1"/>
+        </w:numPr>
+        <w:rPr/>
+      </w:pPr>
+      <w:r>
+        <w:rPr>
+          <w:b/>
+        </w:rPr>
+        <w:t xml:space="preserve">Manual drives behave like detected ones:</w:t>
+      </w:r>
+      <w:r>
+        <w:rPr/>
+        <w:t xml:space="preserve"> they are listed with "manual" in the Type column, can be disabled and enabled again, stay listed as "Not mounted" (or Disabled) when the volume goes away, and are deleted with Remove, which is always offered for a manual drive. They never raise the count on the Drives link, because an administrator created them.</w:t>
+      </w:r>
+    </w:p>
+    <w:p>
+      <w:pPr>
+        <w:pStyle w:val="ListBullet"/>
+        <w:numPr>
+          <w:ilvl w:val="0"/>
+          <w:numId w:val="1"/>
+        </w:numPr>
+        <w:rPr/>
+      </w:pPr>
+      <w:r>
+        <w:rPr>
+          <w:b/>
+        </w:rPr>
         <w:t xml:space="preserve">No desktop pop-up.</w:t>
       </w:r>
       <w:r>
@@ -2516,6 +2556,16 @@
       <w:r>
         <w:rPr/>
         <w:t xml:space="preserve">A drive is mounted on the host, and the mount appears under /host/media in the container. epoll_wait returns, the gateway re-reads mountinfo and finds a new physical volume. The Drives page, if open, is notified over its event stream, fetches the table and shows the drive as "New: not enabled"; every other page updates the count on the Drives link. When an administrator presses Enable, the page posts to /mlw/drives/enable (same-site requests with a valid session only), the gateway saves the decision in media.json and the page shows the drive as Available. When the drive is unmounted or ejected, the same path updates the page to "Not mounted".</w:t>
+      </w:r>
+    </w:p>
+    <w:p>
+      <w:pPr>
+        <w:pStyle w:val="Normal"/>
+        <w:rPr/>
+      </w:pPr>
+      <w:r>
+        <w:rPr/>
+        <w:t xml:space="preserve">To add a drive by hand, the administrator presses Add drive, fills in the dialog and submits it. The page posts the fields with fetch to /mlw/drives/add (same-site requests with a valid session only). On a validation problem the gateway answers 422 with a one-line message, which the dialog shows without closing; on success it answers 204, the dialog closes and the event stream refreshes the table.</w:t>
       </w:r>
     </w:p>
     <w:p>
@@ -7341,7 +7391,7 @@
       </w:r>
       <w:r>
         <w:rPr/>
-        <w:t xml:space="preserve"> the gateway keeps no state, except (Keycloak feature) the users' chosen root directories in volume proxy-state. The drive detection feature saves the administrator's decisions about drives, by filesystem UUID, in media.json in the same volume. Web UI sessions are held in memory only and are lost when the gateway restarts.</w:t>
+        <w:t xml:space="preserve"> the gateway keeps no state, except (Keycloak feature) the users' chosen root directories in volume proxy-state. The drive detection feature saves the administrator's decisions about drives, by filesystem UUID (and drives added by hand, by mount point), in media.json in the same volume. Web UI sessions are held in memory only and are lost when the gateway restarts.</w:t>
       </w:r>
     </w:p>
     <w:p>
@@ -7521,7 +7571,7 @@
       </w:pPr>
       <w:r>
         <w:rPr/>
-        <w:t xml:space="preserve">Drive detection: the media directory and /run/udev are mounted read-only, so the gateway cannot change a drive, and it never writes to one. The bind mount makes the host's media directory visible to the container, so enable the overlay only where that is acceptable. A drive is not used until an administrator enables it; the enable, ignore and remove calls need a signed-in session and a same-site request.</w:t>
+        <w:t>Drive detection: the media directory and /run/udev are mounted read-only, so the gateway cannot change a drive, and it never writes to one. The bind mount makes the host's media directory visible to the container, so enable the overlay only where that is acceptable. A drive is not used until an administrator enables it; the enable, ignore and remove calls need a signed-in session and a same-site request. Adding a drive by hand accepts only paths below the media directory, rejects symlinks that lead out of it and device names outside /dev, and limits the length of every field.</w:t>
       </w:r>
     </w:p>
     <w:p>
@@ -7707,7 +7757,7 @@
       </w:pPr>
       <w:r>
         <w:rPr/>
-        <w:t xml:space="preserve">Drive detection: there is no desktop pop-up (the gateway is in a container). Used space is shown only if the container may read the mount point; desktop mounts are often readable only by the logged-in user, in which case only the device size is shown. Only drives mounted below the media directory are seen, and the host's / must have shared mount propagation. Enabling a drive does not yet publish its files through SFTPGo.</w:t>
+        <w:t>Drive detection: there is no desktop pop-up (the gateway is in a container). Used space is shown only if the container may read the mount point; desktop mounts are often readable only by the logged-in user, in which case only the device size is shown. Only drives mounted below the media directory are seen (a drive that is mounted there but not detected can be added by hand), and the host's / must have shared mount propagation. Enabling a drive does not yet publish its files through SFTPGo.</w:t>
       </w:r>
     </w:p>
     <w:sectPr>

</xml_diff>

<commit_message>
Publish enabled drives through SFTPGo and document removable storage
Enabling a drive opens an Access page to choose SFTPGo users and Keycloak
roles (read-write by default, optional read-only). The gateway creates an
SFTPGo virtual folder per drive, attaches it to the chosen users, and the
auth hook re-adds it for Keycloak sign-ins. Disable/Remove withdraw it.

Adds doc/mlw-storage_Removable_Storage.docx (user and admin workflows,
state diagram, troubleshooting), trims the User Guide to the happy path,
and updates the architecture, testing and release notes documents.

Co-Authored-By: Claude Sonnet 5.5 <noreply@anthropic.com>
</commit_message>
<xml_diff>
--- a/doc/mlw-storage_Architecture.docx
+++ b/doc/mlw-storage_Architecture.docx
@@ -568,7 +568,7 @@
           <w:fldChar w:fldCharType="separate"/>
         </w:r>
         <w:r>
-          <w:t xml:space="preserve">7</w:t>
+          <w:t xml:space="preserve">8</w:t>
         </w:r>
         <w:r>
           <w:fldChar w:fldCharType="end"/>
@@ -600,7 +600,7 @@
           <w:fldChar w:fldCharType="separate"/>
         </w:r>
         <w:r>
-          <w:t xml:space="preserve">7</w:t>
+          <w:t xml:space="preserve">8</w:t>
         </w:r>
         <w:r>
           <w:fldChar w:fldCharType="end"/>
@@ -632,7 +632,7 @@
           <w:fldChar w:fldCharType="separate"/>
         </w:r>
         <w:r>
-          <w:t xml:space="preserve">8</w:t>
+          <w:t xml:space="preserve">9</w:t>
         </w:r>
         <w:r>
           <w:fldChar w:fldCharType="end"/>
@@ -664,7 +664,7 @@
           <w:fldChar w:fldCharType="separate"/>
         </w:r>
         <w:r>
-          <w:t xml:space="preserve">9</w:t>
+          <w:t xml:space="preserve">10</w:t>
         </w:r>
         <w:r>
           <w:fldChar w:fldCharType="end"/>
@@ -696,7 +696,7 @@
           <w:fldChar w:fldCharType="separate"/>
         </w:r>
         <w:r>
-          <w:t xml:space="preserve">9</w:t>
+          <w:t xml:space="preserve">10</w:t>
         </w:r>
         <w:r>
           <w:fldChar w:fldCharType="end"/>
@@ -746,7 +746,7 @@
           <w:rPr>
             <w:b/>
           </w:rPr>
-          <w:t xml:space="preserve">10</w:t>
+          <w:t xml:space="preserve">11</w:t>
         </w:r>
         <w:r>
           <w:rPr>
@@ -799,7 +799,7 @@
           <w:rPr>
             <w:b/>
           </w:rPr>
-          <w:t xml:space="preserve">10</w:t>
+          <w:t xml:space="preserve">11</w:t>
         </w:r>
         <w:r>
           <w:rPr>
@@ -834,7 +834,7 @@
           <w:fldChar w:fldCharType="separate"/>
         </w:r>
         <w:r>
-          <w:t xml:space="preserve">10</w:t>
+          <w:t xml:space="preserve">11</w:t>
         </w:r>
         <w:r>
           <w:fldChar w:fldCharType="end"/>
@@ -866,7 +866,7 @@
           <w:fldChar w:fldCharType="separate"/>
         </w:r>
         <w:r>
-          <w:t xml:space="preserve">11</w:t>
+          <w:t xml:space="preserve">12</w:t>
         </w:r>
         <w:r>
           <w:fldChar w:fldCharType="end"/>
@@ -898,7 +898,7 @@
           <w:fldChar w:fldCharType="separate"/>
         </w:r>
         <w:r>
-          <w:t xml:space="preserve">11</w:t>
+          <w:t xml:space="preserve">12</w:t>
         </w:r>
         <w:r>
           <w:fldChar w:fldCharType="end"/>
@@ -930,7 +930,7 @@
           <w:fldChar w:fldCharType="separate"/>
         </w:r>
         <w:r>
-          <w:t xml:space="preserve">12</w:t>
+          <w:t xml:space="preserve">13</w:t>
         </w:r>
         <w:r>
           <w:fldChar w:fldCharType="end"/>
@@ -980,7 +980,7 @@
           <w:rPr>
             <w:b/>
           </w:rPr>
-          <w:t xml:space="preserve">13</w:t>
+          <w:t xml:space="preserve">14</w:t>
         </w:r>
         <w:r>
           <w:rPr>
@@ -1033,7 +1033,7 @@
           <w:rPr>
             <w:b/>
           </w:rPr>
-          <w:t xml:space="preserve">13</w:t>
+          <w:t xml:space="preserve">14</w:t>
         </w:r>
         <w:r>
           <w:rPr>
@@ -1086,7 +1086,7 @@
           <w:rPr>
             <w:b/>
           </w:rPr>
-          <w:t xml:space="preserve">14</w:t>
+          <w:t xml:space="preserve">15</w:t>
         </w:r>
         <w:r>
           <w:rPr>
@@ -1139,7 +1139,7 @@
           <w:rPr>
             <w:b/>
           </w:rPr>
-          <w:t xml:space="preserve">15</w:t>
+          <w:t xml:space="preserve">16</w:t>
         </w:r>
         <w:r>
           <w:rPr>
@@ -1698,7 +1698,7 @@
       </w:r>
       <w:r>
         <w:rPr/>
-        <w:t xml:space="preserve"> A new drive is listed as "New: not enabled" and a red count appears on the Drives link. Nothing uses a drive until an administrator presses Enable, which marks it Available. Ignore hides it, Disable turns an available drive off, and Remove forgets a drive that is no longer mounted. Decisions are saved by filesystem UUID (or by mount point if there is none), so a drive that is plugged in again is Available at once, even after a gateway restart.</w:t>
+        <w:t xml:space="preserve"> A new drive is listed as "New: not enabled" and a red count appears on the Drives link. Nothing uses a drive until an administrator presses Enable, which opens the Access page (see Publishing to SFTPGo) and, on save, marks the drive Available. Ignore hides a new drive, Disable withdraws an available drive, and Remove forgets a drive that is no longer mounted. Decisions are saved by filesystem UUID (or by mount point if there is none), so a drive that is plugged in again is Available at once, even after a gateway restart.</w:t>
       </w:r>
     </w:p>
     <w:p>
@@ -1794,11 +1794,31 @@
         <w:rPr>
           <w:b/>
         </w:rPr>
-        <w:t xml:space="preserve">Not connected to SFTPGo yet.</w:t>
+        <w:t xml:space="preserve">Publishing to SFTPGo. </w:t>
       </w:r>
       <w:r>
         <w:rPr/>
-        <w:t xml:space="preserve"> Enabling a drive records the decision and marks the drive available in the web UI. Its files are not published to SFTPGo users.</w:t>
+        <w:t>The overlay also bind-mounts the media directory read-write (rslave) into the sftpgo container at /srv/drives, and gives the gateway MEDIA_SFTPGO_DIR=/srv/drives. On the Access page the administrator picks SFTPGo users and, if Keycloak login is on, Keycloak realm roles, and may tick Read-only. On save the gateway uses the administrator's SFTPGo API token to (1) create or update a virtual folder mlw-drive-&lt;name&gt; whose mapped path is the drive's mount point as SFTPGo sees it, and (2) read each chosen user, add the folder at /drives/&lt;name&gt; and write the user back (SFTPGo keeps the password when none is sent); users that were chosen before and are not any more are detached. Read-write adds no permission entry, so the user's own permissions for / apply on the drive, and a read-only user stays read-only; Read-only sets list and download for the path. Disable and Remove detach the folder from the users and delete it (the files on the drive are not touched); if SFTPGo cannot be reached the drive keeps its state and the administrator sees the error.</w:t>
+      </w:r>
+    </w:p>
+    <w:p>
+      <w:pPr>
+        <w:pStyle w:val="ListBullet"/>
+        <w:numPr>
+          <w:ilvl w:val="0"/>
+          <w:numId w:val="1"/>
+        </w:numPr>
+        <w:rPr/>
+      </w:pPr>
+      <w:r>
+        <w:rPr>
+          <w:b/>
+        </w:rPr>
+        <w:t xml:space="preserve">Keycloak users and roles.</w:t>
+      </w:r>
+      <w:r>
+        <w:rPr/>
+        <w:t xml:space="preserve"> SFTPGo replaces a user's folders and permissions with what the authentication hook returns at every sign-in, so for users who log in with a token the hook (authHook) repeats the drives the user is entitled to: it asks the drive store for the enabled, mounted drives that name the token's sub or one of its realm roles and adds them as virtual_folders (with a permissions entry for read-only drives). The folder must already exist in SFTPGo, because a login that references a missing folder fails; it is created on the Access page. Roles are matched only at login, so a role change takes effect at the next sign-in.</w:t>
       </w:r>
     </w:p>
     <w:p>
@@ -2566,6 +2586,16 @@
       <w:r>
         <w:rPr/>
         <w:t xml:space="preserve">To add a drive by hand, the administrator presses Add drive, fills in the dialog and submits it. The page posts the fields with fetch to /mlw/drives/add (same-site requests with a valid session only). On a validation problem the gateway answers 422 with a one-line message, which the dialog shows without closing; on success it answers 204, the dialog closes and the event stream refreshes the table.</w:t>
+      </w:r>
+    </w:p>
+    <w:p>
+      <w:pPr>
+        <w:pStyle w:val="Normal"/>
+        <w:rPr/>
+      </w:pPr>
+      <w:r>
+        <w:rPr/>
+        <w:t xml:space="preserve">To publish a drive, the administrator presses Enable (or Access). The page /mlw/drives/access lists the SFTPGo users (read with the session token), the role field if Keycloak login is on, and the Read-only box. On save it posts to /mlw/drives/access (same-site requests with a valid session only); the gateway validates the user names against SFTPGo, the role names against a strict pattern, and the drive against the mount table, then talks to SFTPGo and only afterwards saves the drive as Available with its share in media.json.</w:t>
       </w:r>
     </w:p>
     <w:p>
@@ -5614,6 +5644,99 @@
           </w:p>
         </w:tc>
       </w:tr>
+      <w:tr>
+        <w:trPr/>
+        <w:tc>
+          <w:tcPr>
+            <w:tcW w:w="3120" w:type="dxa"/>
+            <w:tcBorders/>
+          </w:tcPr>
+          <w:p>
+            <w:pPr>
+              <w:pStyle w:val="Normal"/>
+              <w:widowControl/>
+              <w:spacing w:lineRule="auto" w:line="240" w:before="0" w:after="40"/>
+              <w:jc w:val="left"/>
+              <w:rPr>
+                <w:rFonts w:eastAsia="ＭＳ 明朝" w:cs=""/>
+                <w:kern w:val="0"/>
+                <w:szCs w:val="22"/>
+                <w:lang w:val="en-US" w:eastAsia="en-US" w:bidi="ar-SA"/>
+              </w:rPr>
+            </w:pPr>
+            <w:r>
+              <w:rPr>
+                <w:rFonts w:eastAsia="ＭＳ 明朝" w:cs=""/>
+                <w:kern w:val="0"/>
+                <w:sz w:val="20"/>
+                <w:szCs w:val="22"/>
+                <w:lang w:val="en-US" w:eastAsia="en-US" w:bidi="ar-SA"/>
+              </w:rPr>
+              <w:t xml:space="preserve">MEDIA_SFTPGO_DIR</w:t>
+            </w:r>
+          </w:p>
+        </w:tc>
+        <w:tc>
+          <w:tcPr>
+            <w:tcW w:w="3120" w:type="dxa"/>
+            <w:tcBorders/>
+          </w:tcPr>
+          <w:p>
+            <w:pPr>
+              <w:pStyle w:val="Normal"/>
+              <w:widowControl/>
+              <w:spacing w:lineRule="auto" w:line="240" w:before="0" w:after="40"/>
+              <w:jc w:val="left"/>
+              <w:rPr>
+                <w:rFonts w:eastAsia="ＭＳ 明朝" w:cs=""/>
+                <w:kern w:val="0"/>
+                <w:szCs w:val="22"/>
+                <w:lang w:val="en-US" w:eastAsia="en-US" w:bidi="ar-SA"/>
+              </w:rPr>
+            </w:pPr>
+            <w:r>
+              <w:rPr>
+                <w:rFonts w:eastAsia="ＭＳ 明朝" w:cs=""/>
+                <w:kern w:val="0"/>
+                <w:sz w:val="20"/>
+                <w:szCs w:val="22"/>
+                <w:lang w:val="en-US" w:eastAsia="en-US" w:bidi="ar-SA"/>
+              </w:rPr>
+              <w:t xml:space="preserve">(off)</w:t>
+            </w:r>
+          </w:p>
+        </w:tc>
+        <w:tc>
+          <w:tcPr>
+            <w:tcW w:w="3120" w:type="dxa"/>
+            <w:tcBorders/>
+          </w:tcPr>
+          <w:p>
+            <w:pPr>
+              <w:pStyle w:val="Normal"/>
+              <w:widowControl/>
+              <w:spacing w:lineRule="auto" w:line="240" w:before="0" w:after="40"/>
+              <w:jc w:val="left"/>
+              <w:rPr>
+                <w:rFonts w:eastAsia="ＭＳ 明朝" w:cs=""/>
+                <w:kern w:val="0"/>
+                <w:szCs w:val="22"/>
+                <w:lang w:val="en-US" w:eastAsia="en-US" w:bidi="ar-SA"/>
+              </w:rPr>
+            </w:pPr>
+            <w:r>
+              <w:rPr>
+                <w:rFonts w:eastAsia="ＭＳ 明朝" w:cs=""/>
+                <w:kern w:val="0"/>
+                <w:sz w:val="20"/>
+                <w:szCs w:val="22"/>
+                <w:lang w:val="en-US" w:eastAsia="en-US" w:bidi="ar-SA"/>
+              </w:rPr>
+              <w:t xml:space="preserve">The media directory as the sftpgo container sees it (the overlay sets /srv/drives); setting it makes Enable publish the drive through SFTPGo</w:t>
+            </w:r>
+          </w:p>
+        </w:tc>
+      </w:tr>
     </w:tbl>
     <w:p>
       <w:pPr>
@@ -7571,7 +7694,7 @@
       </w:pPr>
       <w:r>
         <w:rPr/>
-        <w:t>Drive detection: the media directory and /run/udev are mounted read-only, so the gateway cannot change a drive, and it never writes to one. The bind mount makes the host's media directory visible to the container, so enable the overlay only where that is acceptable. A drive is not used until an administrator enables it; the enable, ignore and remove calls need a signed-in session and a same-site request. Adding a drive by hand accepts only paths below the media directory, rejects symlinks that lead out of it and device names outside /dev, and limits the length of every field.</w:t>
+        <w:t>Drive detection: the media directory and /run/udev are mounted read-only, so the gateway cannot change a drive, and it never writes to one. The bind mount makes the host's media directory visible to the container, so enable the overlay only where that is acceptable. A drive is not used until an administrator enables it; the enable, ignore and remove calls need a signed-in session and a same-site request. Adding a drive by hand accepts only paths below the media directory, rejects symlinks that lead out of it and device names outside /dev, and limits the length of every field. Publishing gives the SFTPGo container read-write access to the whole media directory, but SFTPGo only serves the folders created for enabled drives. The gateway uses the signed-in administrator's token for every SFTPGo change and stores no SFTPGo credentials.</w:t>
       </w:r>
     </w:p>
     <w:p>
@@ -7757,7 +7880,7 @@
       </w:pPr>
       <w:r>
         <w:rPr/>
-        <w:t>Drive detection: there is no desktop pop-up (the gateway is in a container). Used space is shown only if the container may read the mount point; desktop mounts are often readable only by the logged-in user, in which case only the device size is shown. Only drives mounted below the media directory are seen (a drive that is mounted there but not detected can be added by hand), and the host's / must have shared mount propagation. Enabling a drive does not yet publish its files through SFTPGo.</w:t>
+        <w:t>Drive detection: there is no desktop pop-up (the gateway is in a container). Used space is shown only if the container may read the mount point; desktop mounts are often readable only by the logged-in user, in which case only the device size is shown. Only drives mounted below the media directory are seen (a drive that is mounted there but not detected can be added by hand), and the host's / must have shared mount propagation. Unplugging a drive does not revoke its access: the gateway keeps no SFTPGo credentials to do so unattended, and SFTPGo reports errors for the missing directory until the drive is disabled. Roles are applied at the next sign-in. A mlw-drive-* folder deleted in the SFTPGo console makes Keycloak logins that reference it fail until the drive is saved again on the Access page. SFTPGo runs as uid 1000, so a drive must be writable by that user for read-write access.</w:t>
       </w:r>
     </w:p>
     <w:sectPr>

</xml_diff>

<commit_message>
Add GET /mlw/v1/storage/drives: the removable drives a user may use now
Lists the drives enabled for the token's user or realm roles and mounted, with
their /drives/<name> path and a read-only flag, for applications such as
mlw-xsheet. README, architecture, removable storage and release notes updated.

Co-Authored-By: Claude Sonnet 5.5 <noreply@anthropic.com>
</commit_message>
<xml_diff>
--- a/doc/mlw-storage_Architecture.docx
+++ b/doc/mlw-storage_Architecture.docx
@@ -2464,6 +2464,69 @@
                 <w:lang w:val="en-US" w:eastAsia="en-US" w:bidi="ar-SA"/>
               </w:rPr>
               <w:t>Return to the private users/&lt;sub&gt; directory</w:t>
+            </w:r>
+          </w:p>
+        </w:tc>
+      </w:tr>
+      <w:tr>
+        <w:trPr/>
+        <w:tc>
+          <w:tcPr>
+            <w:tcW w:w="4680" w:type="dxa"/>
+            <w:tcBorders/>
+          </w:tcPr>
+          <w:p>
+            <w:pPr>
+              <w:pStyle w:val="Normal"/>
+              <w:widowControl/>
+              <w:spacing w:lineRule="auto" w:line="240" w:before="0" w:after="40"/>
+              <w:jc w:val="left"/>
+              <w:rPr>
+                <w:rFonts w:eastAsia="ＭＳ 明朝" w:cs=""/>
+                <w:kern w:val="0"/>
+                <w:szCs w:val="22"/>
+                <w:lang w:val="en-US" w:eastAsia="en-US" w:bidi="ar-SA"/>
+              </w:rPr>
+            </w:pPr>
+            <w:r>
+              <w:rPr>
+                <w:rFonts w:eastAsia="ＭＳ 明朝" w:cs=""/>
+                <w:kern w:val="0"/>
+                <w:sz w:val="20"/>
+                <w:szCs w:val="22"/>
+                <w:lang w:val="en-US" w:eastAsia="en-US" w:bidi="ar-SA"/>
+              </w:rPr>
+              <w:t>GET /mlw/v1/storage/drives</w:t>
+            </w:r>
+          </w:p>
+        </w:tc>
+        <w:tc>
+          <w:tcPr>
+            <w:tcW w:w="4679" w:type="dxa"/>
+            <w:tcBorders/>
+          </w:tcPr>
+          <w:p>
+            <w:pPr>
+              <w:pStyle w:val="Normal"/>
+              <w:widowControl/>
+              <w:spacing w:lineRule="auto" w:line="240" w:before="0" w:after="40"/>
+              <w:jc w:val="left"/>
+              <w:rPr>
+                <w:rFonts w:eastAsia="ＭＳ 明朝" w:cs=""/>
+                <w:kern w:val="0"/>
+                <w:szCs w:val="22"/>
+                <w:lang w:val="en-US" w:eastAsia="en-US" w:bidi="ar-SA"/>
+              </w:rPr>
+            </w:pPr>
+            <w:r>
+              <w:rPr>
+                <w:rFonts w:eastAsia="ＭＳ 明朝" w:cs=""/>
+                <w:kern w:val="0"/>
+                <w:sz w:val="20"/>
+                <w:szCs w:val="22"/>
+                <w:lang w:val="en-US" w:eastAsia="en-US" w:bidi="ar-SA"/>
+              </w:rPr>
+              <w:t>List the removable drives the token's user may use now (name, /drives/&lt;name&gt; path, read-only)</w:t>
             </w:r>
           </w:p>
         </w:tc>

</xml_diff>

<commit_message>
Update Word docs for About dialog, account menu, SFTPGo sign-in and report
Architecture, User Guide, Testing (T69-T74), Removable Storage and the
v1.1.0 Release Notes now describe the About dialog, the SFTPGo and Report
account-menu items, the automatic sign-in to the SFTPGo console, the PDF
configuration report and the Add drive button position.

Co-Authored-By: Claude Sonnet 5.5 <noreply@anthropic.com>
</commit_message>
<xml_diff>
--- a/doc/mlw-storage_Architecture.docx
+++ b/doc/mlw-storage_Architecture.docx
@@ -387,7 +387,7 @@
           <w:fldChar w:fldCharType="separate"/>
         </w:r>
         <w:r>
-          <w:t xml:space="preserve">5</w:t>
+          <w:t xml:space="preserve">6</w:t>
         </w:r>
         <w:r>
           <w:fldChar w:fldCharType="end"/>
@@ -437,7 +437,7 @@
           <w:rPr>
             <w:b/>
           </w:rPr>
-          <w:t xml:space="preserve">7</w:t>
+          <w:t xml:space="preserve">8</w:t>
         </w:r>
         <w:r>
           <w:rPr>
@@ -472,7 +472,7 @@
           <w:fldChar w:fldCharType="separate"/>
         </w:r>
         <w:r>
-          <w:t xml:space="preserve">7</w:t>
+          <w:t xml:space="preserve">8</w:t>
         </w:r>
         <w:r>
           <w:fldChar w:fldCharType="end"/>
@@ -504,7 +504,7 @@
           <w:fldChar w:fldCharType="separate"/>
         </w:r>
         <w:r>
-          <w:t xml:space="preserve">7</w:t>
+          <w:t xml:space="preserve">8</w:t>
         </w:r>
         <w:r>
           <w:fldChar w:fldCharType="end"/>
@@ -536,7 +536,7 @@
           <w:fldChar w:fldCharType="separate"/>
         </w:r>
         <w:r>
-          <w:t xml:space="preserve">7</w:t>
+          <w:t xml:space="preserve">8</w:t>
         </w:r>
         <w:r>
           <w:fldChar w:fldCharType="end"/>
@@ -799,7 +799,7 @@
           <w:rPr>
             <w:b/>
           </w:rPr>
-          <w:t xml:space="preserve">11</w:t>
+          <w:t xml:space="preserve">12</w:t>
         </w:r>
         <w:r>
           <w:rPr>
@@ -834,7 +834,7 @@
           <w:fldChar w:fldCharType="separate"/>
         </w:r>
         <w:r>
-          <w:t xml:space="preserve">11</w:t>
+          <w:t xml:space="preserve">12</w:t>
         </w:r>
         <w:r>
           <w:fldChar w:fldCharType="end"/>
@@ -898,7 +898,7 @@
           <w:fldChar w:fldCharType="separate"/>
         </w:r>
         <w:r>
-          <w:t xml:space="preserve">12</w:t>
+          <w:t xml:space="preserve">13</w:t>
         </w:r>
         <w:r>
           <w:fldChar w:fldCharType="end"/>
@@ -930,7 +930,7 @@
           <w:fldChar w:fldCharType="separate"/>
         </w:r>
         <w:r>
-          <w:t xml:space="preserve">13</w:t>
+          <w:t xml:space="preserve">14</w:t>
         </w:r>
         <w:r>
           <w:fldChar w:fldCharType="end"/>
@@ -1033,7 +1033,7 @@
           <w:rPr>
             <w:b/>
           </w:rPr>
-          <w:t xml:space="preserve">14</w:t>
+          <w:t xml:space="preserve">15</w:t>
         </w:r>
         <w:r>
           <w:rPr>
@@ -1086,7 +1086,7 @@
           <w:rPr>
             <w:b/>
           </w:rPr>
-          <w:t xml:space="preserve">15</w:t>
+          <w:t xml:space="preserve">16</w:t>
         </w:r>
         <w:r>
           <w:rPr>
@@ -1496,7 +1496,7 @@
       </w:pPr>
       <w:r>
         <w:rPr/>
-        <w:t>The gateway serves a small mlw-storage web UI on the HTTP port, and requests for / are redirected to it. It has two pages. The sign-in page (/mlw/login) takes the SFTPGo administrator credentials. The Dashboard (/mlw/dashboard) is the page shown after signing in: a table of the SFTPGo users (Username, Status, Last login, Description), shown 20 users per table with left and right arrows and a range label such as 1..20 to move between tables, and a button that opens the SFTPGo administration console. An account icon at the top right shows the signed-in name and opens a menu with Logout.</w:t>
+        <w:t>The gateway serves a small mlw-storage web UI on the HTTP port, and requests for / are redirected to it. The sign-in page (/mlw/login) takes the SFTPGo administrator credentials. The Dashboard (/mlw/dashboard) is the page shown after signing in: a table of the SFTPGo users (Username, Status, Last login, Description), shown 20 users per table with left and right arrows and a range label such as 1..20 to move between tables. With the media overlay there is also a Drives page (/mlw/drives). The top bar has the Dashboard and Drives links (when drives are on) and an About button, which opens a dialog with the product name, author, version and the project license. An account icon at the top right shows the signed-in name and opens a menu with SFTPGo, Report and Logout. The Add drive button is below the list of drives, at the right.</w:t>
       </w:r>
     </w:p>
     <w:p>
@@ -1556,7 +1556,7 @@
       </w:r>
       <w:r>
         <w:rPr/>
-        <w:t xml:space="preserve"> State-changing requests (sign-in, logout) must come from the same site (Sec-Fetch-Site, or an Origin or Referer naming this host). After 10 failed sign-ins from one address within 5 minutes, further attempts are refused. Pages are sent with Cache-Control: no-store and a Content-Security-Policy that allows no scripts except the one that closes the account menu and switches between tables, matched by hash.</w:t>
+        <w:t xml:space="preserve"> State-changing requests (sign-in, logout) must come from the same site (Sec-Fetch-Site, or an Origin or Referer naming this host). After 10 failed sign-ins from one address within 5 minutes, further attempts are refused. Pages are sent with Cache-Control: no-store and a Content-Security-Policy that allows no scripts except the one that handles the account menu, the About dialog, the Drives page and the table paging, matched by hash.</w:t>
       </w:r>
     </w:p>
     <w:p>
@@ -1576,7 +1576,27 @@
       </w:r>
       <w:r>
         <w:rPr/>
-        <w:t xml:space="preserve"> The Dashboard button opens SFTPGo's own admin console at /web/admin/, which keeps its separate sign-in. So an administrator can get back, the gateway adds a "mlw-storage Dashboard" button to SFTPGo's admin HTML pages (including its sign-in page) as they pass through. Other responses are not modified.</w:t>
+        <w:t xml:space="preserve"> The SFTPGo item in the account menu opens SFTPGo's own admin console without a second sign-in. At Dashboard sign-in the gateway also signs in to SFTPGo's web admin (GET and POST /web/admin/login) with the same credentials, keeps only the resulting session cookie in the server-side session (the password is not kept), and /mlw/console hands that cookie to the browser (HttpOnly, SameSite=Strict, path /web/admin) before redirecting to /web/admin/users. The cookie lasts 20 minutes; after that, or if the extra sign-in failed, SFTPGo shows its own sign-in form. So an administrator can get back, the gateway adds a "mlw-storage Dashboard" button to SFTPGo's admin HTML pages (including its sign-in page) as they pass through. Other responses are not modified.</w:t>
+      </w:r>
+    </w:p>
+    <w:p>
+      <w:pPr>
+        <w:pStyle w:val="ListBullet"/>
+        <w:numPr>
+          <w:ilvl w:val="0"/>
+          <w:numId w:val="1"/>
+        </w:numPr>
+        <w:rPr/>
+      </w:pPr>
+      <w:r>
+        <w:rPr>
+          <w:b/>
+        </w:rPr>
+        <w:t xml:space="preserve">Configuration report.</w:t>
+      </w:r>
+      <w:r>
+        <w:rPr/>
+        <w:t xml:space="preserve"> The Report item in the account menu (GET /mlw/report) reads the configuration from SFTPGo with the administrator's API token and returns it as a PDF download (mlw-storage-report-&lt;date&gt;-&lt;time&gt;.pdf, titled "mlw-storage Configuration Report"). The sections are Users and Administrators (each with its Active or Inactive status after the name), Groups, Virtual folders, Roles, Event actions, Event rules and, when drive detection is on, Removable drives with who each one is shared with. Passwords, keys, TOTP and recovery codes, and secret payloads are left out. The PDF is written by a small built-in text-only writer, so no PDF library is needed; a section that SFTPGo cannot answer is reported as such and the rest is still produced.</w:t>
       </w:r>
     </w:p>
     <w:p>
@@ -1738,7 +1758,7 @@
       </w:r>
       <w:r>
         <w:rPr/>
-        <w:t xml:space="preserve"> For a volume that is mounted below the media directory but that detection does not report (a FUSE or exFAT-fuse mount, a network share, or a drive with no sysfs entry), the Drives page has an Add drive button that opens a dialog. Required fields are a name and the mount point (an absolute host path below the media directory). Device and file system are optional and default to what the kernel reports in mountinfo; a checkbox decides whether the drive is enabled at once. The gateway checks that the path is a directory that exists, that it does not resolve through a symlink to somewhere outside the media directory, that something is mounted exactly there, and that the drive was not already detected or added. The entry is stored in media.json under the key mp:&lt;mount point&gt; with a manual flag, and the mount table is re-read at once so that the page shows the drive without waiting for a mount event.</w:t>
+        <w:t xml:space="preserve"> For a volume that is mounted below the media directory but that detection does not report (a FUSE or exFAT-fuse mount, a network share, or a drive with no sysfs entry), the Drives page has an Add drive button (below the list, at the right) that opens a dialog. Required fields are a name and the mount point (an absolute host path below the media directory). Device and file system are optional and default to what the kernel reports in mountinfo; a checkbox decides whether the drive is enabled at once. The gateway checks that the path is a directory that exists, that it does not resolve through a symlink to somewhere outside the media directory, that something is mounted exactly there, and that the drive was not already detected or added. The entry is stored in media.json under the key mp:&lt;mount point&gt; with a manual flag, and the mount table is re-read at once so that the page shows the drive without waiting for a mount event.</w:t>
       </w:r>
     </w:p>
     <w:p>
@@ -7799,7 +7819,7 @@
       </w:pPr>
       <w:r>
         <w:rPr/>
-        <w:t xml:space="preserve">Web UI: http://localhost:8380 shows the mlw-storage sign-in page; sign in with the SFTPGo admin account. The Dashboard lists the users, and its SFTPGo administration button (or http://localhost:8380/web/admin/) opens the SFTPGo console. Create SFTP users there, then connect remote servers with an SFTP client on port 2222.</w:t>
+        <w:t>Web UI: http://localhost:8380 shows the mlw-storage sign-in page; sign in with the SFTPGo admin account. The Dashboard lists the users, and the SFTPGo item in the account menu (or http://localhost:8380/web/admin/) opens the SFTPGo console. The Report item downloads a PDF of the SFTPGo configuration. Create SFTP users in the console, then connect remote servers with an SFTP client on port 2222.</w:t>
       </w:r>
     </w:p>
     <w:p>
@@ -7927,7 +7947,7 @@
       </w:pPr>
       <w:r>
         <w:rPr/>
-        <w:t xml:space="preserve">Web UI: sessions are in memory and end at gateway restart. Any SFTPGo administrator who can list users sees the whole Dashboard; there are no per-admin roles. Administrators with two-factor authentication enabled cannot sign in to the mlw-storage UI. Signing in does not sign in to the SFTPGo console, which keeps its own login.</w:t>
+        <w:t>Web UI: sessions are in memory and end at gateway restart. Any SFTPGo administrator who can list users sees the whole Dashboard; there are no per-admin roles. Administrators with two-factor authentication enabled cannot sign in to the mlw-storage UI (and so also cannot use the automatic sign-in to the SFTPGo console). The automatic console sign-in expires after 20 minutes; the console then asks for its own sign-in.</w:t>
       </w:r>
     </w:p>
     <w:p>

</xml_diff>